<commit_message>
Add AI-assisted template generation
</commit_message>
<xml_diff>
--- a/docs/Informe VALCV.docx
+++ b/docs/Informe VALCV.docx
@@ -3358,78 +3358,9 @@
       <w:r>
         <w:rPr>
           <w:rFonts w:ascii="Aptos" w:hAnsi="Aptos"/>
-        </w:rPr>
-        <w:t xml:space="preserve">La propuesta consiste en una aplicación web contenida en Docker, desarrollada con </w:t>
-      </w:r>
-      <w:proofErr w:type="spellStart"/>
-      <w:r>
-        <w:rPr>
-          <w:rFonts w:ascii="Aptos" w:hAnsi="Aptos"/>
-        </w:rPr>
-        <w:t>FastAPI</w:t>
-      </w:r>
-      <w:proofErr w:type="spellEnd"/>
-      <w:r>
-        <w:rPr>
-          <w:rFonts w:ascii="Aptos" w:hAnsi="Aptos"/>
-        </w:rPr>
-        <w:t xml:space="preserve"> para el </w:t>
-      </w:r>
-      <w:proofErr w:type="spellStart"/>
-      <w:r>
-        <w:rPr>
-          <w:rFonts w:ascii="Aptos" w:hAnsi="Aptos"/>
-        </w:rPr>
-        <w:t>backend</w:t>
-      </w:r>
-      <w:proofErr w:type="spellEnd"/>
-      <w:r>
-        <w:rPr>
-          <w:rFonts w:ascii="Aptos" w:hAnsi="Aptos"/>
-        </w:rPr>
-        <w:t xml:space="preserve">, React con Bun y Vite para el </w:t>
-      </w:r>
-      <w:proofErr w:type="spellStart"/>
-      <w:r>
-        <w:rPr>
-          <w:rFonts w:ascii="Aptos" w:hAnsi="Aptos"/>
-        </w:rPr>
-        <w:t>frontend</w:t>
-      </w:r>
-      <w:proofErr w:type="spellEnd"/>
-      <w:r>
-        <w:rPr>
-          <w:rFonts w:ascii="Aptos" w:hAnsi="Aptos"/>
-        </w:rPr>
-        <w:t xml:space="preserve">, PostgreSQL como base de datos y un módulo de integración con Gemini para la evaluación asistida por IA. Los servicios se publican en puertos no comunes para reducir conflictos con otros servicios existentes, y el </w:t>
-      </w:r>
-      <w:proofErr w:type="spellStart"/>
-      <w:r>
-        <w:rPr>
-          <w:rFonts w:ascii="Aptos" w:hAnsi="Aptos"/>
-        </w:rPr>
-        <w:t>frontend</w:t>
-      </w:r>
-      <w:proofErr w:type="spellEnd"/>
-      <w:r>
-        <w:rPr>
-          <w:rFonts w:ascii="Aptos" w:hAnsi="Aptos"/>
-        </w:rPr>
-        <w:t xml:space="preserve"> consume la API mediante una ruta relativa que facilita su uso detrás de </w:t>
-      </w:r>
-      <w:proofErr w:type="spellStart"/>
-      <w:r>
-        <w:rPr>
-          <w:rFonts w:ascii="Aptos" w:hAnsi="Aptos"/>
-        </w:rPr>
-        <w:t>Nginx</w:t>
-      </w:r>
-      <w:proofErr w:type="spellEnd"/>
-      <w:r>
-        <w:rPr>
-          <w:rFonts w:ascii="Aptos" w:hAnsi="Aptos"/>
-        </w:rPr>
-        <w:t xml:space="preserve"> Proxy Manager.</w:t>
+          <w:sz w:val="21"/>
+        </w:rPr>
+        <w:t>La propuesta consiste en una aplicación web contenida en Docker, desarrollada con FastAPI para el backend, React con Bun y Vite para el frontend, PostgreSQL como base de datos y un módulo de integración con Gemini para la evaluación asistida por IA. Los servicios se publican en puertos no comunes para reducir conflictos con otros servicios existentes, y el frontend consume la API mediante una ruta relativa que facilita su uso detrás de Nginx Proxy Manager, incluyendo generación asistida de plantillas mediante IA desde requisitos en texto o PDF.</w:t>
       </w:r>
     </w:p>
     <w:p>
@@ -3629,6 +3560,47 @@
       <w:tr>
         <w:tc>
           <w:tcPr>
+            <w:tcW w:type="dxa" w:w="4392"/>
+            <w:shd w:fill="F4E8DE"/>
+          </w:tcPr>
+          <w:p>
+            <w:pPr>
+              <w:spacing w:after="0"/>
+            </w:pPr>
+            <w:r/>
+            <w:r>
+              <w:rPr>
+                <w:rFonts w:ascii="Aptos" w:hAnsi="Aptos"/>
+                <w:b/>
+                <w:sz w:val="19"/>
+              </w:rPr>
+              <w:t>Generación asistida de plantillas</w:t>
+            </w:r>
+          </w:p>
+        </w:tc>
+        <w:tc>
+          <w:tcPr>
+            <w:tcW w:type="dxa" w:w="4436"/>
+          </w:tcPr>
+          <w:p>
+            <w:pPr>
+              <w:spacing w:after="0"/>
+            </w:pPr>
+            <w:r/>
+            <w:r>
+              <w:rPr>
+                <w:rFonts w:ascii="Aptos" w:hAnsi="Aptos"/>
+                <w:b w:val="0"/>
+                <w:sz w:val="19"/>
+              </w:rPr>
+              <w:t>Al crear una nueva plantilla, el usuario puede iniciar desde cero o generar un borrador con IA a partir de requisitos cargados en PDF o escritos en un cuadro de texto. El resultado no se guarda automáticamente: se abre en el editor para revisión humana, ajuste de categorías, ponderaciones, criterios críticos y modo de evaluación antes de guardarse.</w:t>
+            </w:r>
+          </w:p>
+        </w:tc>
+      </w:tr>
+      <w:tr>
+        <w:tc>
+          <w:tcPr>
             <w:tcW w:w="4929" w:type="dxa"/>
             <w:vAlign w:val="center"/>
           </w:tcPr>
@@ -4299,6 +4271,18 @@
           <w:sz w:val="21"/>
         </w:rPr>
         <w:t>Los criterios evaluados con IA incorporan una nota complementaria editable por el evaluador, destinada a completar o matizar el juicio automático sin alterar la evidencia original generada por el modelo.</w:t>
+      </w:r>
+    </w:p>
+    <w:p>
+      <w:pPr>
+        <w:pStyle w:val="Listaconvietas"/>
+      </w:pPr>
+      <w:r>
+        <w:rPr>
+          <w:rFonts w:ascii="Aptos" w:hAnsi="Aptos"/>
+          <w:sz w:val="21"/>
+        </w:rPr>
+        <w:t>La generación de plantillas con IA se maneja como borrador revisable: el modelo propone estructura, pesos y criterios, pero el evaluador o administrador debe validar el contenido antes de guardarlo y aplicarlo a candidatos.</w:t>
       </w:r>
     </w:p>
     <w:p>
@@ -4870,7 +4854,7 @@
           <w:rFonts w:ascii="Aptos" w:hAnsi="Aptos"/>
           <w:sz w:val="21"/>
         </w:rPr>
-        <w:t>La plataforma cuenta con una versión funcional desplegada en contenedores Docker. Incluye autenticación, gestión de usuarios, edición avanzada de plantillas, carga y consulta de documentos, evaluación manual y automática, criterios críticos, autosave, visualización comparativa, configuración del modelo Gemini y respaldo de base de datos. La primera plantilla corresponde a la evaluación de aspirantes a Gerente de Normas Eléctricas, y nota complementaria del evaluador para criterios evaluados con IA.</w:t>
+        <w:t>La plataforma cuenta con una versión funcional desplegada en contenedores Docker. Incluye autenticación, gestión de usuarios, edición avanzada de plantillas, carga y consulta de documentos, evaluación manual y automática, criterios críticos, autosave, visualización comparativa, configuración del modelo Gemini y respaldo de base de datos. La primera plantilla corresponde a la evaluación de aspirantes a Gerente de Normas Eléctricas, y nota complementaria del evaluador para criterios evaluados con IA, generación asistida de plantillas desde requisitos en PDF o texto.</w:t>
       </w:r>
     </w:p>
     <w:p>

</xml_diff>

<commit_message>
Refresh report functionality section
</commit_message>
<xml_diff>
--- a/docs/Informe VALCV.docx
+++ b/docs/Informe VALCV.docx
@@ -3459,52 +3459,21 @@
         <w:tc>
           <w:tcPr>
             <w:tcW w:w="4929" w:type="dxa"/>
-            <w:shd w:val="clear" w:color="auto" w:fill="DCECEA"/>
             <w:vAlign w:val="center"/>
+            <w:shd w:fill="DCECEA"/>
           </w:tcPr>
           <w:p>
+            <w:pPr>
+              <w:spacing w:after="0"/>
+            </w:pPr>
+            <w:r/>
             <w:r>
               <w:rPr>
                 <w:rFonts w:ascii="Aptos" w:hAnsi="Aptos"/>
                 <w:b/>
                 <w:sz w:val="19"/>
               </w:rPr>
-              <w:t>Componente</w:t>
-            </w:r>
-          </w:p>
-        </w:tc>
-        <w:tc>
-          <w:tcPr>
-            <w:tcW w:w="4929" w:type="dxa"/>
-            <w:shd w:val="clear" w:color="auto" w:fill="DCECEA"/>
-            <w:vAlign w:val="center"/>
-          </w:tcPr>
-          <w:p>
-            <w:r>
-              <w:rPr>
-                <w:rFonts w:ascii="Aptos" w:hAnsi="Aptos"/>
-                <w:b/>
-                <w:sz w:val="19"/>
-              </w:rPr>
-              <w:t>Descripción</w:t>
-            </w:r>
-          </w:p>
-        </w:tc>
-      </w:tr>
-      <w:tr>
-        <w:tc>
-          <w:tcPr>
-            <w:tcW w:w="4929" w:type="dxa"/>
-            <w:vAlign w:val="center"/>
-          </w:tcPr>
-          <w:p>
-            <w:r>
-              <w:rPr>
-                <w:rFonts w:ascii="Aptos" w:hAnsi="Aptos"/>
-                <w:b/>
-                <w:sz w:val="19"/>
-              </w:rPr>
-              <w:t>Control de acceso</w:t>
+              <w:t>Funcionalidad</w:t>
             </w:r>
           </w:p>
         </w:tc>
@@ -3512,47 +3481,20 @@
           <w:tcPr>
             <w:tcW w:w="4929" w:type="dxa"/>
             <w:vAlign w:val="center"/>
+            <w:shd w:fill="DCECEA"/>
           </w:tcPr>
           <w:p>
-            <w:r>
-              <w:rPr>
-                <w:rFonts w:ascii="Aptos" w:hAnsi="Aptos"/>
-                <w:sz w:val="19"/>
-              </w:rPr>
-              <w:t>Acceso protegido por usuario y contraseña, con usuario administrador inicial y capacidad de crear usuarios autorizados para consultar resultados.</w:t>
-            </w:r>
-          </w:p>
-        </w:tc>
-      </w:tr>
-      <w:tr>
-        <w:tc>
-          <w:tcPr>
-            <w:tcW w:w="4929" w:type="dxa"/>
-            <w:vAlign w:val="center"/>
-          </w:tcPr>
-          <w:p>
+            <w:pPr>
+              <w:spacing w:after="0"/>
+            </w:pPr>
+            <w:r/>
             <w:r>
               <w:rPr>
                 <w:rFonts w:ascii="Aptos" w:hAnsi="Aptos"/>
                 <w:b/>
                 <w:sz w:val="19"/>
               </w:rPr>
-              <w:t>Plantillas de evaluación</w:t>
-            </w:r>
-          </w:p>
-        </w:tc>
-        <w:tc>
-          <w:tcPr>
-            <w:tcW w:w="4929" w:type="dxa"/>
-            <w:vAlign w:val="center"/>
-          </w:tcPr>
-          <w:p>
-            <w:r>
-              <w:rPr>
-                <w:rFonts w:ascii="Aptos" w:hAnsi="Aptos"/>
-                <w:sz w:val="19"/>
-              </w:rPr>
-              <w:t>Creación y edición de plantillas con categorías, ponderaciones en porcentaje, criterios hijos de cada categoría y reglas para completar o redistribuir pesos hasta 100%.</w:t>
+              <w:t>Cómo apoya el proceso</w:t>
             </w:r>
           </w:p>
         </w:tc>
@@ -3574,7 +3516,7 @@
                 <w:b/>
                 <w:sz w:val="19"/>
               </w:rPr>
-              <w:t>Generación asistida de plantillas</w:t>
+              <w:t>Acceso por usuarios y roles</w:t>
             </w:r>
           </w:p>
         </w:tc>
@@ -3593,204 +3535,7 @@
                 <w:b w:val="0"/>
                 <w:sz w:val="19"/>
               </w:rPr>
-              <w:t>Al crear una nueva plantilla, el usuario puede iniciar desde cero o generar un borrador con IA a partir de requisitos cargados en PDF o escritos en un cuadro de texto. El resultado no se guarda automáticamente: se abre en el editor para revisión humana, ajuste de categorías, ponderaciones, criterios críticos y modo de evaluación antes de guardarse.</w:t>
-            </w:r>
-          </w:p>
-        </w:tc>
-      </w:tr>
-      <w:tr>
-        <w:tc>
-          <w:tcPr>
-            <w:tcW w:w="4929" w:type="dxa"/>
-            <w:vAlign w:val="center"/>
-          </w:tcPr>
-          <w:p>
-            <w:r>
-              <w:rPr>
-                <w:rFonts w:ascii="Aptos" w:hAnsi="Aptos"/>
-                <w:b/>
-                <w:sz w:val="19"/>
-              </w:rPr>
-              <w:t>Criterios manuales o asistidos por IA</w:t>
-            </w:r>
-          </w:p>
-        </w:tc>
-        <w:tc>
-          <w:tcPr>
-            <w:tcW w:w="4929" w:type="dxa"/>
-            <w:vAlign w:val="center"/>
-          </w:tcPr>
-          <w:p>
-            <w:r>
-              <w:rPr>
-                <w:rFonts w:ascii="Aptos" w:hAnsi="Aptos"/>
-                <w:sz w:val="19"/>
-              </w:rPr>
-              <w:t>Cada criterio se define desde la plantilla como manual o IA. En el expediente solo se muestra una etiqueta discreta para criterios IA.</w:t>
-            </w:r>
-          </w:p>
-        </w:tc>
-      </w:tr>
-      <w:tr>
-        <w:tc>
-          <w:tcPr>
-            <w:tcW w:w="4929" w:type="dxa"/>
-            <w:vAlign w:val="center"/>
-          </w:tcPr>
-          <w:p>
-            <w:r>
-              <w:rPr>
-                <w:rFonts w:ascii="Aptos" w:hAnsi="Aptos"/>
-                <w:b/>
-                <w:sz w:val="19"/>
-              </w:rPr>
-              <w:t>Criterios críticos</w:t>
-            </w:r>
-          </w:p>
-        </w:tc>
-        <w:tc>
-          <w:tcPr>
-            <w:tcW w:w="4929" w:type="dxa"/>
-            <w:vAlign w:val="center"/>
-          </w:tcPr>
-          <w:p>
-            <w:r>
-              <w:rPr>
-                <w:rFonts w:ascii="Aptos" w:hAnsi="Aptos"/>
-                <w:sz w:val="19"/>
-              </w:rPr>
-              <w:t>Permite marcar criterios de cumple/no cumple que no tienen ponderación. Si un criterio crítico no se cumple, el score general del candidato cae a cero.</w:t>
-            </w:r>
-          </w:p>
-        </w:tc>
-      </w:tr>
-      <w:tr>
-        <w:tc>
-          <w:tcPr>
-            <w:tcW w:w="4929" w:type="dxa"/>
-            <w:vAlign w:val="center"/>
-          </w:tcPr>
-          <w:p>
-            <w:r>
-              <w:rPr>
-                <w:rFonts w:ascii="Aptos" w:hAnsi="Aptos"/>
-                <w:b/>
-                <w:sz w:val="19"/>
-              </w:rPr>
-              <w:t>Expediente documental</w:t>
-            </w:r>
-          </w:p>
-        </w:tc>
-        <w:tc>
-          <w:tcPr>
-            <w:tcW w:w="4929" w:type="dxa"/>
-            <w:vAlign w:val="center"/>
-          </w:tcPr>
-          <w:p>
-            <w:r>
-              <w:rPr>
-                <w:rFonts w:ascii="Aptos" w:hAnsi="Aptos"/>
-                <w:sz w:val="19"/>
-              </w:rPr>
-              <w:t>Carga, eliminación y visualización de documentos PDF e imágenes asociados a cada candidato.</w:t>
-            </w:r>
-          </w:p>
-        </w:tc>
-      </w:tr>
-      <w:tr>
-        <w:tc>
-          <w:tcPr>
-            <w:tcW w:w="4929" w:type="dxa"/>
-            <w:vAlign w:val="center"/>
-          </w:tcPr>
-          <w:p>
-            <w:r>
-              <w:rPr>
-                <w:rFonts w:ascii="Aptos" w:hAnsi="Aptos"/>
-                <w:b/>
-                <w:sz w:val="19"/>
-              </w:rPr>
-              <w:t>Referencia documental por criterio</w:t>
-            </w:r>
-          </w:p>
-        </w:tc>
-        <w:tc>
-          <w:tcPr>
-            <w:tcW w:w="4929" w:type="dxa"/>
-            <w:vAlign w:val="center"/>
-          </w:tcPr>
-          <w:p>
-            <w:r>
-              <w:rPr>
-                <w:rFonts w:ascii="Aptos" w:hAnsi="Aptos"/>
-                <w:sz w:val="19"/>
-              </w:rPr>
-              <w:t>Cada criterio puede vincularse a uno o varios documentos del expediente; la IA también devuelve los documentos que utilizó como soporte para su evaluación.</w:t>
-            </w:r>
-          </w:p>
-        </w:tc>
-      </w:tr>
-      <w:tr>
-        <w:tc>
-          <w:tcPr>
-            <w:tcW w:w="4929" w:type="dxa"/>
-            <w:vAlign w:val="center"/>
-          </w:tcPr>
-          <w:p>
-            <w:r>
-              <w:rPr>
-                <w:rFonts w:ascii="Aptos" w:hAnsi="Aptos"/>
-                <w:b/>
-                <w:sz w:val="19"/>
-              </w:rPr>
-              <w:t>Evaluación automática con Gemini</w:t>
-            </w:r>
-          </w:p>
-        </w:tc>
-        <w:tc>
-          <w:tcPr>
-            <w:tcW w:w="4929" w:type="dxa"/>
-            <w:vAlign w:val="center"/>
-          </w:tcPr>
-          <w:p>
-            <w:r>
-              <w:rPr>
-                <w:rFonts w:ascii="Aptos" w:hAnsi="Aptos"/>
-                <w:sz w:val="19"/>
-              </w:rPr>
-              <w:t xml:space="preserve">Integración configurable con API </w:t>
-            </w:r>
-            <w:proofErr w:type="spellStart"/>
-            <w:r>
-              <w:rPr>
-                <w:rFonts w:ascii="Aptos" w:hAnsi="Aptos"/>
-                <w:sz w:val="19"/>
-              </w:rPr>
-              <w:t>key</w:t>
-            </w:r>
-            <w:proofErr w:type="spellEnd"/>
-            <w:r>
-              <w:rPr>
-                <w:rFonts w:ascii="Aptos" w:hAnsi="Aptos"/>
-                <w:sz w:val="19"/>
-              </w:rPr>
-              <w:t xml:space="preserve"> y modelo de Gemini. Las notas de la plantilla se envían al </w:t>
-            </w:r>
-            <w:proofErr w:type="spellStart"/>
-            <w:r>
-              <w:rPr>
-                <w:rFonts w:ascii="Aptos" w:hAnsi="Aptos"/>
-                <w:sz w:val="19"/>
-              </w:rPr>
-              <w:t>prompt</w:t>
-            </w:r>
-            <w:proofErr w:type="spellEnd"/>
-            <w:r>
-              <w:rPr>
-                <w:rFonts w:ascii="Aptos" w:hAnsi="Aptos"/>
-                <w:sz w:val="19"/>
-              </w:rPr>
-              <w:t xml:space="preserve"> como instrucciones específicas de evaluación.</w:t>
+              <w:t>La plataforma permite crear usuarios con nombre, apellido, cargo, área, código de empleado y rol. Cada rol habilita únicamente las acciones que le corresponden, por ejemplo administrar usuarios, crear plantillas, evaluar candidatos o solo consultar resultados.</w:t>
             </w:r>
           </w:p>
         </w:tc>
@@ -3812,7 +3557,7 @@
                 <w:b/>
                 <w:sz w:val="19"/>
               </w:rPr>
-              <w:t>Nota complementaria del evaluador en criterios IA</w:t>
+              <w:t>Roles pensados para el proceso de selección</w:t>
             </w:r>
           </w:p>
         </w:tc>
@@ -3831,7 +3576,7 @@
                 <w:b w:val="0"/>
                 <w:sz w:val="19"/>
               </w:rPr>
-              <w:t>En los criterios evaluados con IA se habilita un campo independiente para que el evaluador humano complemente la explicación cuando el juicio automático resulte incompleto, requiera contexto institucional adicional o necesite una precisión técnica. Esta nota no sustituye ni sobrescribe la evidencia generada por la IA; funciona como trazabilidad del criterio experto humano.</w:t>
+              <w:t>Se contemplan perfiles como Administrador, Gestor de plantillas, Evaluador, Recursos Humanos y Consulta. Esto ayuda a que cada participante intervenga en la parte del proceso que le corresponde, sin exponer funciones innecesarias.</w:t>
             </w:r>
           </w:p>
         </w:tc>
@@ -3839,33 +3584,40 @@
       <w:tr>
         <w:tc>
           <w:tcPr>
-            <w:tcW w:w="4929" w:type="dxa"/>
-            <w:vAlign w:val="center"/>
+            <w:tcW w:type="dxa" w:w="4392"/>
+            <w:shd w:fill="F4E8DE"/>
           </w:tcPr>
           <w:p>
+            <w:pPr>
+              <w:spacing w:after="0"/>
+            </w:pPr>
+            <w:r/>
             <w:r>
               <w:rPr>
                 <w:rFonts w:ascii="Aptos" w:hAnsi="Aptos"/>
                 <w:b/>
                 <w:sz w:val="19"/>
               </w:rPr>
-              <w:lastRenderedPageBreak/>
-              <w:t>Reevaluación puntual</w:t>
+              <w:t>Registro de candidatos ligado al evaluador</w:t>
             </w:r>
           </w:p>
         </w:tc>
         <w:tc>
           <w:tcPr>
-            <w:tcW w:w="4929" w:type="dxa"/>
-            <w:vAlign w:val="center"/>
+            <w:tcW w:type="dxa" w:w="4436"/>
           </w:tcPr>
           <w:p>
+            <w:pPr>
+              <w:spacing w:after="0"/>
+            </w:pPr>
+            <w:r/>
             <w:r>
               <w:rPr>
                 <w:rFonts w:ascii="Aptos" w:hAnsi="Aptos"/>
+                <w:b w:val="0"/>
                 <w:sz w:val="19"/>
               </w:rPr>
-              <w:t>En criterios IA se puede reevaluar únicamente el criterio seleccionado, sin repetir toda la evaluación del candidato.</w:t>
+              <w:t>Al crear un candidato ya no se escribe manualmente el nombre del evaluador. El sistema registra automáticamente la cuenta que inició sesión, fortaleciendo la trazabilidad de quién trabajó cada expediente.</w:t>
             </w:r>
           </w:p>
         </w:tc>
@@ -3873,42 +3625,40 @@
       <w:tr>
         <w:tc>
           <w:tcPr>
-            <w:tcW w:w="4929" w:type="dxa"/>
-            <w:vAlign w:val="center"/>
+            <w:tcW w:type="dxa" w:w="4392"/>
+            <w:shd w:fill="F4E8DE"/>
           </w:tcPr>
           <w:p>
-            <w:proofErr w:type="spellStart"/>
+            <w:pPr>
+              <w:spacing w:after="0"/>
+            </w:pPr>
+            <w:r/>
             <w:r>
               <w:rPr>
                 <w:rFonts w:ascii="Aptos" w:hAnsi="Aptos"/>
                 <w:b/>
                 <w:sz w:val="19"/>
               </w:rPr>
-              <w:t>Autosave</w:t>
-            </w:r>
-            <w:proofErr w:type="spellEnd"/>
-            <w:r>
-              <w:rPr>
-                <w:rFonts w:ascii="Aptos" w:hAnsi="Aptos"/>
-                <w:b/>
-                <w:sz w:val="19"/>
-              </w:rPr>
-              <w:t xml:space="preserve"> de evaluación</w:t>
+              <w:t>Plantillas de evaluación reutilizables</w:t>
             </w:r>
           </w:p>
         </w:tc>
         <w:tc>
           <w:tcPr>
-            <w:tcW w:w="4929" w:type="dxa"/>
-            <w:vAlign w:val="center"/>
+            <w:tcW w:type="dxa" w:w="4436"/>
           </w:tcPr>
           <w:p>
+            <w:pPr>
+              <w:spacing w:after="0"/>
+            </w:pPr>
+            <w:r/>
             <w:r>
               <w:rPr>
                 <w:rFonts w:ascii="Aptos" w:hAnsi="Aptos"/>
+                <w:b w:val="0"/>
                 <w:sz w:val="19"/>
               </w:rPr>
-              <w:t>Los cambios de puntuación, evidencia y referencias se guardan automáticamente para evitar pérdida de información.</w:t>
+              <w:t>Las vacantes pueden evaluarse con plantillas que organizan las competencias en categorías, pesos y criterios. Esto evita depender de hojas sueltas y ayuda a que todos los candidatos sean revisados con la misma estructura.</w:t>
             </w:r>
           </w:p>
         </w:tc>
@@ -3916,32 +3666,40 @@
       <w:tr>
         <w:tc>
           <w:tcPr>
-            <w:tcW w:w="4929" w:type="dxa"/>
-            <w:vAlign w:val="center"/>
+            <w:tcW w:type="dxa" w:w="4392"/>
+            <w:shd w:fill="F4E8DE"/>
           </w:tcPr>
           <w:p>
+            <w:pPr>
+              <w:spacing w:after="0"/>
+            </w:pPr>
+            <w:r/>
             <w:r>
               <w:rPr>
                 <w:rFonts w:ascii="Aptos" w:hAnsi="Aptos"/>
                 <w:b/>
                 <w:sz w:val="19"/>
               </w:rPr>
-              <w:t>Protección de evaluaciones existentes</w:t>
+              <w:t>Creación de plantillas desde cero o con apoyo de IA</w:t>
             </w:r>
           </w:p>
         </w:tc>
         <w:tc>
           <w:tcPr>
-            <w:tcW w:w="4929" w:type="dxa"/>
-            <w:vAlign w:val="center"/>
+            <w:tcW w:type="dxa" w:w="4436"/>
           </w:tcPr>
           <w:p>
+            <w:pPr>
+              <w:spacing w:after="0"/>
+            </w:pPr>
+            <w:r/>
             <w:r>
               <w:rPr>
                 <w:rFonts w:ascii="Aptos" w:hAnsi="Aptos"/>
+                <w:b w:val="0"/>
                 <w:sz w:val="19"/>
               </w:rPr>
-              <w:t>Al modificar una plantilla, no se eliminan todas las evaluaciones. Solo se invalida la evaluación asociada al criterio IA cuyo contenido cambió.</w:t>
+              <w:t>Al crear una plantilla se puede comenzar manualmente o pedir a la IA que genere un borrador a partir de un PDF o de requisitos escritos. Ese borrador siempre debe revisarse antes de guardarse y aplicarse a candidatos.</w:t>
             </w:r>
           </w:p>
         </w:tc>
@@ -3949,32 +3707,40 @@
       <w:tr>
         <w:tc>
           <w:tcPr>
-            <w:tcW w:w="4929" w:type="dxa"/>
-            <w:vAlign w:val="center"/>
+            <w:tcW w:type="dxa" w:w="4392"/>
+            <w:shd w:fill="F4E8DE"/>
           </w:tcPr>
           <w:p>
+            <w:pPr>
+              <w:spacing w:after="0"/>
+            </w:pPr>
+            <w:r/>
             <w:r>
               <w:rPr>
                 <w:rFonts w:ascii="Aptos" w:hAnsi="Aptos"/>
                 <w:b/>
                 <w:sz w:val="19"/>
               </w:rPr>
-              <w:t>Visualización comparativa</w:t>
+              <w:t>Criterios manuales y criterios asistidos por IA</w:t>
             </w:r>
           </w:p>
         </w:tc>
         <w:tc>
           <w:tcPr>
-            <w:tcW w:w="4929" w:type="dxa"/>
-            <w:vAlign w:val="center"/>
+            <w:tcW w:type="dxa" w:w="4436"/>
           </w:tcPr>
           <w:p>
+            <w:pPr>
+              <w:spacing w:after="0"/>
+            </w:pPr>
+            <w:r/>
             <w:r>
               <w:rPr>
                 <w:rFonts w:ascii="Aptos" w:hAnsi="Aptos"/>
+                <w:b w:val="0"/>
                 <w:sz w:val="19"/>
               </w:rPr>
-              <w:t>Incluye gráficas de anillo, ranking global y comparación compacta ordenada de mayor a menor para facilitar análisis.</w:t>
+              <w:t>Cada criterio puede configurarse para revisión manual o para apoyo de IA. Los criterios manuales quedan para entrevista, examen temático o juicio experto; los criterios asistidos por IA se basan en la evidencia documental cargada.</w:t>
             </w:r>
           </w:p>
         </w:tc>
@@ -3982,48 +3748,450 @@
       <w:tr>
         <w:tc>
           <w:tcPr>
-            <w:tcW w:w="4929" w:type="dxa"/>
-            <w:vAlign w:val="center"/>
+            <w:tcW w:type="dxa" w:w="4392"/>
+            <w:shd w:fill="F4E8DE"/>
           </w:tcPr>
           <w:p>
+            <w:pPr>
+              <w:spacing w:after="0"/>
+            </w:pPr>
+            <w:r/>
             <w:r>
               <w:rPr>
                 <w:rFonts w:ascii="Aptos" w:hAnsi="Aptos"/>
                 <w:b/>
                 <w:sz w:val="19"/>
               </w:rPr>
-              <w:t>Respaldo operativo</w:t>
+              <w:t>Criterios críticos de cumplimiento obligatorio</w:t>
             </w:r>
           </w:p>
         </w:tc>
         <w:tc>
           <w:tcPr>
-            <w:tcW w:w="4929" w:type="dxa"/>
-            <w:vAlign w:val="center"/>
+            <w:tcW w:type="dxa" w:w="4436"/>
           </w:tcPr>
           <w:p>
+            <w:pPr>
+              <w:spacing w:after="0"/>
+            </w:pPr>
+            <w:r/>
             <w:r>
               <w:rPr>
                 <w:rFonts w:ascii="Aptos" w:hAnsi="Aptos"/>
+                <w:b w:val="0"/>
                 <w:sz w:val="19"/>
               </w:rPr>
-              <w:t xml:space="preserve">La base de datos puede respaldarse con </w:t>
-            </w:r>
-            <w:proofErr w:type="spellStart"/>
+              <w:t>Algunos requisitos pueden marcarse como críticos, por ejemplo una formación profesional indispensable. Si el candidato no cumple ese requisito, el resultado general queda en cero, aun cuando tenga buenos puntajes en otros aspectos.</w:t>
+            </w:r>
+          </w:p>
+        </w:tc>
+      </w:tr>
+      <w:tr>
+        <w:tc>
+          <w:tcPr>
+            <w:tcW w:type="dxa" w:w="4392"/>
+            <w:shd w:fill="F4E8DE"/>
+          </w:tcPr>
+          <w:p>
+            <w:pPr>
+              <w:spacing w:after="0"/>
+            </w:pPr>
+            <w:r/>
             <w:r>
               <w:rPr>
                 <w:rFonts w:ascii="Aptos" w:hAnsi="Aptos"/>
+                <w:b/>
                 <w:sz w:val="19"/>
               </w:rPr>
-              <w:t>pg_dump</w:t>
-            </w:r>
-            <w:proofErr w:type="spellEnd"/>
+              <w:t>Expediente digital por candidato</w:t>
+            </w:r>
+          </w:p>
+        </w:tc>
+        <w:tc>
+          <w:tcPr>
+            <w:tcW w:type="dxa" w:w="4436"/>
+          </w:tcPr>
+          <w:p>
+            <w:pPr>
+              <w:spacing w:after="0"/>
+            </w:pPr>
+            <w:r/>
             <w:r>
               <w:rPr>
                 <w:rFonts w:ascii="Aptos" w:hAnsi="Aptos"/>
+                <w:b w:val="0"/>
                 <w:sz w:val="19"/>
               </w:rPr>
-              <w:t xml:space="preserve"> en formato restaurable, preservando candidatos, plantillas y evaluaciones.</w:t>
+              <w:t>Cada candidato puede tener sus documentos en PDF o imagen dentro de la plataforma. Los documentos pueden abrirse para consulta, eliminarse si fueron cargados por error y asociarse a los criterios que sustentan la evaluación.</w:t>
+            </w:r>
+          </w:p>
+        </w:tc>
+      </w:tr>
+      <w:tr>
+        <w:tc>
+          <w:tcPr>
+            <w:tcW w:type="dxa" w:w="4392"/>
+            <w:shd w:fill="F4E8DE"/>
+          </w:tcPr>
+          <w:p>
+            <w:pPr>
+              <w:spacing w:after="0"/>
+            </w:pPr>
+            <w:r/>
+            <w:r>
+              <w:rPr>
+                <w:rFonts w:ascii="Aptos" w:hAnsi="Aptos"/>
+                <w:b/>
+                <w:sz w:val="19"/>
+              </w:rPr>
+              <w:t>Evidencia vinculada a cada criterio</w:t>
+            </w:r>
+          </w:p>
+        </w:tc>
+        <w:tc>
+          <w:tcPr>
+            <w:tcW w:type="dxa" w:w="4436"/>
+          </w:tcPr>
+          <w:p>
+            <w:pPr>
+              <w:spacing w:after="0"/>
+            </w:pPr>
+            <w:r/>
+            <w:r>
+              <w:rPr>
+                <w:rFonts w:ascii="Aptos" w:hAnsi="Aptos"/>
+                <w:b w:val="0"/>
+                <w:sz w:val="19"/>
+              </w:rPr>
+              <w:t>La evaluación permite indicar qué documentos respaldan cada puntuación. Cuando interviene la IA, también se guarda cuáles documentos utilizó como referencia, facilitando la revisión posterior.</w:t>
+            </w:r>
+          </w:p>
+        </w:tc>
+      </w:tr>
+      <w:tr>
+        <w:tc>
+          <w:tcPr>
+            <w:tcW w:type="dxa" w:w="4392"/>
+            <w:shd w:fill="F4E8DE"/>
+          </w:tcPr>
+          <w:p>
+            <w:pPr>
+              <w:spacing w:after="0"/>
+            </w:pPr>
+            <w:r/>
+            <w:r>
+              <w:rPr>
+                <w:rFonts w:ascii="Aptos" w:hAnsi="Aptos"/>
+                <w:b/>
+                <w:sz w:val="19"/>
+              </w:rPr>
+              <w:t>Evaluación automática como apoyo, no como decisión final</w:t>
+            </w:r>
+          </w:p>
+        </w:tc>
+        <w:tc>
+          <w:tcPr>
+            <w:tcW w:type="dxa" w:w="4436"/>
+          </w:tcPr>
+          <w:p>
+            <w:pPr>
+              <w:spacing w:after="0"/>
+            </w:pPr>
+            <w:r/>
+            <w:r>
+              <w:rPr>
+                <w:rFonts w:ascii="Aptos" w:hAnsi="Aptos"/>
+                <w:b w:val="0"/>
+                <w:sz w:val="19"/>
+              </w:rPr>
+              <w:t>La integración con Gemini permite sugerir puntuaciones y comentarios a partir del expediente. La herramienta agiliza la lectura documental, pero la decisión y validación final permanecen en manos del equipo humano responsable.</w:t>
+            </w:r>
+          </w:p>
+        </w:tc>
+      </w:tr>
+      <w:tr>
+        <w:tc>
+          <w:tcPr>
+            <w:tcW w:type="dxa" w:w="4392"/>
+            <w:shd w:fill="F4E8DE"/>
+          </w:tcPr>
+          <w:p>
+            <w:pPr>
+              <w:spacing w:after="0"/>
+            </w:pPr>
+            <w:r/>
+            <w:r>
+              <w:rPr>
+                <w:rFonts w:ascii="Aptos" w:hAnsi="Aptos"/>
+                <w:b/>
+                <w:sz w:val="19"/>
+              </w:rPr>
+              <w:t>Nota complementaria del evaluador</w:t>
+            </w:r>
+          </w:p>
+        </w:tc>
+        <w:tc>
+          <w:tcPr>
+            <w:tcW w:type="dxa" w:w="4436"/>
+          </w:tcPr>
+          <w:p>
+            <w:pPr>
+              <w:spacing w:after="0"/>
+            </w:pPr>
+            <w:r/>
+            <w:r>
+              <w:rPr>
+                <w:rFonts w:ascii="Aptos" w:hAnsi="Aptos"/>
+                <w:b w:val="0"/>
+                <w:sz w:val="19"/>
+              </w:rPr>
+              <w:t>En los criterios asistidos por IA existe un espacio para que el evaluador humano complete o precise la explicación cuando el comentario automático resulte incompleto o requiera contexto institucional adicional.</w:t>
+            </w:r>
+          </w:p>
+        </w:tc>
+      </w:tr>
+      <w:tr>
+        <w:tc>
+          <w:tcPr>
+            <w:tcW w:type="dxa" w:w="4392"/>
+            <w:shd w:fill="F4E8DE"/>
+          </w:tcPr>
+          <w:p>
+            <w:pPr>
+              <w:spacing w:after="0"/>
+            </w:pPr>
+            <w:r/>
+            <w:r>
+              <w:rPr>
+                <w:rFonts w:ascii="Aptos" w:hAnsi="Aptos"/>
+                <w:b/>
+                <w:sz w:val="19"/>
+              </w:rPr>
+              <w:t>Reevaluación puntual de criterios</w:t>
+            </w:r>
+          </w:p>
+        </w:tc>
+        <w:tc>
+          <w:tcPr>
+            <w:tcW w:type="dxa" w:w="4436"/>
+          </w:tcPr>
+          <w:p>
+            <w:pPr>
+              <w:spacing w:after="0"/>
+            </w:pPr>
+            <w:r/>
+            <w:r>
+              <w:rPr>
+                <w:rFonts w:ascii="Aptos" w:hAnsi="Aptos"/>
+                <w:b w:val="0"/>
+                <w:sz w:val="19"/>
+              </w:rPr>
+              <w:t>Si se ajusta un criterio asistido por IA o se necesita revisar un punto específico, puede reevaluarse solo ese criterio sin repetir toda la evaluación del candidato.</w:t>
+            </w:r>
+          </w:p>
+        </w:tc>
+      </w:tr>
+      <w:tr>
+        <w:tc>
+          <w:tcPr>
+            <w:tcW w:type="dxa" w:w="4392"/>
+            <w:shd w:fill="F4E8DE"/>
+          </w:tcPr>
+          <w:p>
+            <w:pPr>
+              <w:spacing w:after="0"/>
+            </w:pPr>
+            <w:r/>
+            <w:r>
+              <w:rPr>
+                <w:rFonts w:ascii="Aptos" w:hAnsi="Aptos"/>
+                <w:b/>
+                <w:sz w:val="19"/>
+              </w:rPr>
+              <w:t>Guardado automático de la evaluación</w:t>
+            </w:r>
+          </w:p>
+        </w:tc>
+        <w:tc>
+          <w:tcPr>
+            <w:tcW w:type="dxa" w:w="4436"/>
+          </w:tcPr>
+          <w:p>
+            <w:pPr>
+              <w:spacing w:after="0"/>
+            </w:pPr>
+            <w:r/>
+            <w:r>
+              <w:rPr>
+                <w:rFonts w:ascii="Aptos" w:hAnsi="Aptos"/>
+                <w:b w:val="0"/>
+                <w:sz w:val="19"/>
+              </w:rPr>
+              <w:t>Las puntuaciones, comentarios, notas complementarias y referencias documentales se guardan automáticamente, reduciendo el riesgo de pérdida de información durante el trabajo.</w:t>
+            </w:r>
+          </w:p>
+        </w:tc>
+      </w:tr>
+      <w:tr>
+        <w:tc>
+          <w:tcPr>
+            <w:tcW w:type="dxa" w:w="4392"/>
+            <w:shd w:fill="F4E8DE"/>
+          </w:tcPr>
+          <w:p>
+            <w:pPr>
+              <w:spacing w:after="0"/>
+            </w:pPr>
+            <w:r/>
+            <w:r>
+              <w:rPr>
+                <w:rFonts w:ascii="Aptos" w:hAnsi="Aptos"/>
+                <w:b/>
+                <w:sz w:val="19"/>
+              </w:rPr>
+              <w:t>Protección de evaluaciones ya realizadas</w:t>
+            </w:r>
+          </w:p>
+        </w:tc>
+        <w:tc>
+          <w:tcPr>
+            <w:tcW w:type="dxa" w:w="4436"/>
+          </w:tcPr>
+          <w:p>
+            <w:pPr>
+              <w:spacing w:after="0"/>
+            </w:pPr>
+            <w:r/>
+            <w:r>
+              <w:rPr>
+                <w:rFonts w:ascii="Aptos" w:hAnsi="Aptos"/>
+                <w:b w:val="0"/>
+                <w:sz w:val="19"/>
+              </w:rPr>
+              <w:t>Si se modifica una plantilla, el sistema evita borrar todo el trabajo previo. Solo se invalida la evaluación vinculada al criterio que cambió, cuando corresponde.</w:t>
+            </w:r>
+          </w:p>
+        </w:tc>
+      </w:tr>
+      <w:tr>
+        <w:tc>
+          <w:tcPr>
+            <w:tcW w:type="dxa" w:w="4392"/>
+            <w:shd w:fill="F4E8DE"/>
+          </w:tcPr>
+          <w:p>
+            <w:pPr>
+              <w:spacing w:after="0"/>
+            </w:pPr>
+            <w:r/>
+            <w:r>
+              <w:rPr>
+                <w:rFonts w:ascii="Aptos" w:hAnsi="Aptos"/>
+                <w:b/>
+                <w:sz w:val="19"/>
+              </w:rPr>
+              <w:t>Resultados comparativos por plantilla</w:t>
+            </w:r>
+          </w:p>
+        </w:tc>
+        <w:tc>
+          <w:tcPr>
+            <w:tcW w:type="dxa" w:w="4436"/>
+          </w:tcPr>
+          <w:p>
+            <w:pPr>
+              <w:spacing w:after="0"/>
+            </w:pPr>
+            <w:r/>
+            <w:r>
+              <w:rPr>
+                <w:rFonts w:ascii="Aptos" w:hAnsi="Aptos"/>
+                <w:b w:val="0"/>
+                <w:sz w:val="19"/>
+              </w:rPr>
+              <w:t>Las gráficas y rankings se muestran de acuerdo con la plantilla seleccionada. Esto permite comparar candidatos de una misma vacante sin mezclar resultados de procesos distintos.</w:t>
+            </w:r>
+          </w:p>
+        </w:tc>
+      </w:tr>
+      <w:tr>
+        <w:tc>
+          <w:tcPr>
+            <w:tcW w:type="dxa" w:w="4392"/>
+            <w:shd w:fill="F4E8DE"/>
+          </w:tcPr>
+          <w:p>
+            <w:pPr>
+              <w:spacing w:after="0"/>
+            </w:pPr>
+            <w:r/>
+            <w:r>
+              <w:rPr>
+                <w:rFonts w:ascii="Aptos" w:hAnsi="Aptos"/>
+                <w:b/>
+                <w:sz w:val="19"/>
+              </w:rPr>
+              <w:t>Visualizaciones para apoyar la decisión</w:t>
+            </w:r>
+          </w:p>
+        </w:tc>
+        <w:tc>
+          <w:tcPr>
+            <w:tcW w:type="dxa" w:w="4436"/>
+          </w:tcPr>
+          <w:p>
+            <w:pPr>
+              <w:spacing w:after="0"/>
+            </w:pPr>
+            <w:r/>
+            <w:r>
+              <w:rPr>
+                <w:rFonts w:ascii="Aptos" w:hAnsi="Aptos"/>
+                <w:b w:val="0"/>
+                <w:sz w:val="19"/>
+              </w:rPr>
+              <w:t>La plataforma presenta ranking global, comparación compacta y gráficos por categoría. Estas vistas ayudan a Recursos Humanos y al área técnica a identificar fortalezas, brechas y diferencias entre aspirantes.</w:t>
+            </w:r>
+          </w:p>
+        </w:tc>
+      </w:tr>
+      <w:tr>
+        <w:tc>
+          <w:tcPr>
+            <w:tcW w:type="dxa" w:w="4392"/>
+            <w:shd w:fill="F4E8DE"/>
+          </w:tcPr>
+          <w:p>
+            <w:pPr>
+              <w:spacing w:after="0"/>
+            </w:pPr>
+            <w:r/>
+            <w:r>
+              <w:rPr>
+                <w:rFonts w:ascii="Aptos" w:hAnsi="Aptos"/>
+                <w:b/>
+                <w:sz w:val="19"/>
+              </w:rPr>
+              <w:t>Respaldo de la información</w:t>
+            </w:r>
+          </w:p>
+        </w:tc>
+        <w:tc>
+          <w:tcPr>
+            <w:tcW w:type="dxa" w:w="4436"/>
+          </w:tcPr>
+          <w:p>
+            <w:pPr>
+              <w:spacing w:after="0"/>
+            </w:pPr>
+            <w:r/>
+            <w:r>
+              <w:rPr>
+                <w:rFonts w:ascii="Aptos" w:hAnsi="Aptos"/>
+                <w:b w:val="0"/>
+                <w:sz w:val="19"/>
+              </w:rPr>
+              <w:t>La base de datos puede respaldarse para conservar plantillas, usuarios, candidatos, expedientes y evaluaciones ante cambios importantes o necesidad de recuperación.</w:t>
             </w:r>
           </w:p>
         </w:tc>
@@ -4854,7 +5022,7 @@
           <w:rFonts w:ascii="Aptos" w:hAnsi="Aptos"/>
           <w:sz w:val="21"/>
         </w:rPr>
-        <w:t>La plataforma cuenta con una versión funcional desplegada en contenedores Docker. Incluye autenticación, gestión de usuarios, edición avanzada de plantillas, carga y consulta de documentos, evaluación manual y automática, criterios críticos, autosave, visualización comparativa, configuración del modelo Gemini y respaldo de base de datos. La primera plantilla corresponde a la evaluación de aspirantes a Gerente de Normas Eléctricas, y nota complementaria del evaluador para criterios evaluados con IA, generación asistida de plantillas desde requisitos en PDF o texto.</w:t>
+        <w:t>La plataforma cuenta con una versión funcional desplegada en contenedores Docker. Incluye acceso por roles, gestión de usuarios institucionales, edición avanzada de plantillas, generación asistida de plantillas con IA, carga y consulta de documentos, evaluación manual y asistida por IA, criterios críticos, nota complementaria del evaluador, guardado automático, visualización comparativa por plantilla, configuración del modelo Gemini y respaldo de base de datos. La primera plantilla corresponde a la evaluación de aspirantes a Gerente de Normas Eléctricas.</w:t>
       </w:r>
     </w:p>
     <w:p>

</xml_diff>

<commit_message>
Update platform functionality section
</commit_message>
<xml_diff>
--- a/docs/Informe VALCV.docx
+++ b/docs/Informe VALCV.docx
@@ -373,6 +373,7 @@
                                     <w:dataBinding w:prefixMappings="xmlns:ns0='http://purl.org/dc/elements/1.1/' xmlns:ns1='http://schemas.openxmlformats.org/package/2006/metadata/core-properties' " w:xpath="/ns1:coreProperties[1]/ns0:title[1]" w:storeItemID="{6C3C8BC8-F283-45AE-878A-BAB7291924A1}"/>
                                     <w:text w:multiLine="1"/>
                                   </w:sdtPr>
+                                  <w:sdtEndPr/>
                                   <w:sdtContent>
                                     <w:r>
                                       <w:rPr>
@@ -405,29 +406,7 @@
                                         <w:sz w:val="28"/>
                                         <w:szCs w:val="28"/>
                                       </w:rPr>
-                                      <w:t>PROPUESTA</w:t>
-                                    </w:r>
-                                    <w:r>
-                                      <w:rPr>
-                                        <w:b/>
-                                        <w:bCs/>
-                                        <w:caps/>
-                                        <w:color w:val="156082" w:themeColor="accent1"/>
-                                        <w:sz w:val="28"/>
-                                        <w:szCs w:val="28"/>
-                                      </w:rPr>
-                                      <w:t xml:space="preserve"> plataforma de evaluación de curriculum vitae</w:t>
-                                    </w:r>
-                                    <w:r>
-                                      <w:rPr>
-                                        <w:b/>
-                                        <w:bCs/>
-                                        <w:caps/>
-                                        <w:color w:val="156082" w:themeColor="accent1"/>
-                                        <w:sz w:val="28"/>
-                                        <w:szCs w:val="28"/>
-                                      </w:rPr>
-                                      <w:t xml:space="preserve"> ASISTIDA POR INTELIGENCIA ARTIFICIAL (IA)</w:t>
+                                      <w:t>PROPUESTA plataforma de evaluación de curriculum vitae ASISTIDA POR INTELIGENCIA ARTIFICIAL (IA)</w:t>
                                     </w:r>
                                   </w:sdtContent>
                                 </w:sdt>
@@ -971,7 +950,7 @@
                             <w:txbxContent>
                               <w:p>
                                 <w:pPr>
-                                  <w:pStyle w:val="Sinespaciado"/>
+                                  <w:pStyle w:val="NoSpacing"/>
                                   <w:jc w:val="right"/>
                                   <w:rPr>
                                     <w:color w:val="747474" w:themeColor="background2" w:themeShade="80"/>
@@ -991,7 +970,7 @@
                               </w:p>
                               <w:p>
                                 <w:pPr>
-                                  <w:pStyle w:val="Sinespaciado"/>
+                                  <w:pStyle w:val="NoSpacing"/>
                                   <w:jc w:val="right"/>
                                   <w:rPr>
                                     <w:color w:val="595959" w:themeColor="text1" w:themeTint="A6"/>
@@ -1072,7 +1051,7 @@
     </w:sdt>
     <w:p>
       <w:pPr>
-        <w:pStyle w:val="TtuloTDC"/>
+        <w:pStyle w:val="TOCHeading"/>
         <w:numPr>
           <w:ilvl w:val="0"/>
           <w:numId w:val="0"/>
@@ -1115,7 +1094,7 @@
       <w:sdtContent>
         <w:p>
           <w:pPr>
-            <w:pStyle w:val="TtuloTDC"/>
+            <w:pStyle w:val="TOCHeading"/>
             <w:numPr>
               <w:ilvl w:val="0"/>
               <w:numId w:val="0"/>
@@ -1127,7 +1106,7 @@
         </w:p>
         <w:p>
           <w:pPr>
-            <w:pStyle w:val="TDC1"/>
+            <w:pStyle w:val="TOC1"/>
             <w:tabs>
               <w:tab w:val="left" w:pos="440"/>
               <w:tab w:val="right" w:leader="dot" w:pos="8828"/>
@@ -1152,7 +1131,7 @@
           <w:hyperlink w:anchor="_Toc230878434" w:history="1">
             <w:r>
               <w:rPr>
-                <w:rStyle w:val="Hipervnculo"/>
+                <w:rStyle w:val="Hyperlink"/>
                 <w:noProof/>
               </w:rPr>
               <w:t>1</w:t>
@@ -1169,7 +1148,7 @@
             </w:r>
             <w:r>
               <w:rPr>
-                <w:rStyle w:val="Hipervnculo"/>
+                <w:rStyle w:val="Hyperlink"/>
                 <w:rFonts w:ascii="Aptos Display" w:hAnsi="Aptos Display"/>
                 <w:noProof/>
               </w:rPr>
@@ -1227,7 +1206,7 @@
         </w:p>
         <w:p>
           <w:pPr>
-            <w:pStyle w:val="TDC1"/>
+            <w:pStyle w:val="TOC1"/>
             <w:tabs>
               <w:tab w:val="left" w:pos="440"/>
               <w:tab w:val="right" w:leader="dot" w:pos="8828"/>
@@ -1243,7 +1222,7 @@
           <w:hyperlink w:anchor="_Toc230878435" w:history="1">
             <w:r>
               <w:rPr>
-                <w:rStyle w:val="Hipervnculo"/>
+                <w:rStyle w:val="Hyperlink"/>
                 <w:noProof/>
               </w:rPr>
               <w:t>2</w:t>
@@ -1260,7 +1239,7 @@
             </w:r>
             <w:r>
               <w:rPr>
-                <w:rStyle w:val="Hipervnculo"/>
+                <w:rStyle w:val="Hyperlink"/>
                 <w:noProof/>
               </w:rPr>
               <w:t>Objetivo</w:t>
@@ -1317,7 +1296,7 @@
         </w:p>
         <w:p>
           <w:pPr>
-            <w:pStyle w:val="TDC1"/>
+            <w:pStyle w:val="TOC1"/>
             <w:tabs>
               <w:tab w:val="left" w:pos="440"/>
               <w:tab w:val="right" w:leader="dot" w:pos="8828"/>
@@ -1333,7 +1312,7 @@
           <w:hyperlink w:anchor="_Toc230878436" w:history="1">
             <w:r>
               <w:rPr>
-                <w:rStyle w:val="Hipervnculo"/>
+                <w:rStyle w:val="Hyperlink"/>
                 <w:noProof/>
               </w:rPr>
               <w:t>3</w:t>
@@ -1350,7 +1329,7 @@
             </w:r>
             <w:r>
               <w:rPr>
-                <w:rStyle w:val="Hipervnculo"/>
+                <w:rStyle w:val="Hyperlink"/>
                 <w:noProof/>
               </w:rPr>
               <w:t>Antecedentes</w:t>
@@ -1407,7 +1386,7 @@
         </w:p>
         <w:p>
           <w:pPr>
-            <w:pStyle w:val="TDC1"/>
+            <w:pStyle w:val="TOC1"/>
             <w:tabs>
               <w:tab w:val="left" w:pos="440"/>
               <w:tab w:val="right" w:leader="dot" w:pos="8828"/>
@@ -1423,7 +1402,7 @@
           <w:hyperlink w:anchor="_Toc230878437" w:history="1">
             <w:r>
               <w:rPr>
-                <w:rStyle w:val="Hipervnculo"/>
+                <w:rStyle w:val="Hyperlink"/>
                 <w:noProof/>
               </w:rPr>
               <w:t>4</w:t>
@@ -1440,7 +1419,7 @@
             </w:r>
             <w:r>
               <w:rPr>
-                <w:rStyle w:val="Hipervnculo"/>
+                <w:rStyle w:val="Hyperlink"/>
                 <w:noProof/>
               </w:rPr>
               <w:t>Marco Institucional</w:t>
@@ -1497,7 +1476,7 @@
         </w:p>
         <w:p>
           <w:pPr>
-            <w:pStyle w:val="TDC1"/>
+            <w:pStyle w:val="TOC1"/>
             <w:tabs>
               <w:tab w:val="left" w:pos="440"/>
               <w:tab w:val="right" w:leader="dot" w:pos="8828"/>
@@ -1513,7 +1492,7 @@
           <w:hyperlink w:anchor="_Toc230878438" w:history="1">
             <w:r>
               <w:rPr>
-                <w:rStyle w:val="Hipervnculo"/>
+                <w:rStyle w:val="Hyperlink"/>
                 <w:noProof/>
               </w:rPr>
               <w:t>5</w:t>
@@ -1530,7 +1509,7 @@
             </w:r>
             <w:r>
               <w:rPr>
-                <w:rStyle w:val="Hipervnculo"/>
+                <w:rStyle w:val="Hyperlink"/>
                 <w:noProof/>
               </w:rPr>
               <w:t>Marco Normativo</w:t>
@@ -1587,7 +1566,7 @@
         </w:p>
         <w:p>
           <w:pPr>
-            <w:pStyle w:val="TDC1"/>
+            <w:pStyle w:val="TOC1"/>
             <w:tabs>
               <w:tab w:val="left" w:pos="440"/>
               <w:tab w:val="right" w:leader="dot" w:pos="8828"/>
@@ -1603,7 +1582,7 @@
           <w:hyperlink w:anchor="_Toc230878439" w:history="1">
             <w:r>
               <w:rPr>
-                <w:rStyle w:val="Hipervnculo"/>
+                <w:rStyle w:val="Hyperlink"/>
                 <w:noProof/>
               </w:rPr>
               <w:t>6</w:t>
@@ -1620,7 +1599,7 @@
             </w:r>
             <w:r>
               <w:rPr>
-                <w:rStyle w:val="Hipervnculo"/>
+                <w:rStyle w:val="Hyperlink"/>
                 <w:noProof/>
               </w:rPr>
               <w:t>Desarrollo</w:t>
@@ -1677,7 +1656,7 @@
         </w:p>
         <w:p>
           <w:pPr>
-            <w:pStyle w:val="TDC2"/>
+            <w:pStyle w:val="TOC2"/>
             <w:tabs>
               <w:tab w:val="left" w:pos="960"/>
               <w:tab w:val="right" w:leader="dot" w:pos="8828"/>
@@ -1693,7 +1672,7 @@
           <w:hyperlink w:anchor="_Toc230878440" w:history="1">
             <w:r>
               <w:rPr>
-                <w:rStyle w:val="Hipervnculo"/>
+                <w:rStyle w:val="Hyperlink"/>
                 <w:noProof/>
               </w:rPr>
               <w:t>6.1</w:t>
@@ -1710,7 +1689,7 @@
             </w:r>
             <w:r>
               <w:rPr>
-                <w:rStyle w:val="Hipervnculo"/>
+                <w:rStyle w:val="Hyperlink"/>
                 <w:noProof/>
               </w:rPr>
               <w:t>Funcionalidades</w:t>
@@ -1767,7 +1746,7 @@
         </w:p>
         <w:p>
           <w:pPr>
-            <w:pStyle w:val="TDC2"/>
+            <w:pStyle w:val="TOC2"/>
             <w:tabs>
               <w:tab w:val="left" w:pos="960"/>
               <w:tab w:val="right" w:leader="dot" w:pos="8828"/>
@@ -1783,7 +1762,7 @@
           <w:hyperlink w:anchor="_Toc230878441" w:history="1">
             <w:r>
               <w:rPr>
-                <w:rStyle w:val="Hipervnculo"/>
+                <w:rStyle w:val="Hyperlink"/>
                 <w:noProof/>
               </w:rPr>
               <w:t>6.2</w:t>
@@ -1800,7 +1779,7 @@
             </w:r>
             <w:r>
               <w:rPr>
-                <w:rStyle w:val="Hipervnculo"/>
+                <w:rStyle w:val="Hyperlink"/>
                 <w:noProof/>
               </w:rPr>
               <w:t>Flujo propuesto de uso</w:t>
@@ -1857,7 +1836,7 @@
         </w:p>
         <w:p>
           <w:pPr>
-            <w:pStyle w:val="TDC1"/>
+            <w:pStyle w:val="TOC1"/>
             <w:tabs>
               <w:tab w:val="left" w:pos="440"/>
               <w:tab w:val="right" w:leader="dot" w:pos="8828"/>
@@ -1873,7 +1852,7 @@
           <w:hyperlink w:anchor="_Toc230878442" w:history="1">
             <w:r>
               <w:rPr>
-                <w:rStyle w:val="Hipervnculo"/>
+                <w:rStyle w:val="Hyperlink"/>
                 <w:noProof/>
               </w:rPr>
               <w:t>7</w:t>
@@ -1890,7 +1869,7 @@
             </w:r>
             <w:r>
               <w:rPr>
-                <w:rStyle w:val="Hipervnculo"/>
+                <w:rStyle w:val="Hyperlink"/>
                 <w:rFonts w:ascii="Aptos Display" w:hAnsi="Aptos Display"/>
                 <w:noProof/>
               </w:rPr>
@@ -1948,7 +1927,7 @@
         </w:p>
         <w:p>
           <w:pPr>
-            <w:pStyle w:val="TDC1"/>
+            <w:pStyle w:val="TOC1"/>
             <w:tabs>
               <w:tab w:val="left" w:pos="440"/>
               <w:tab w:val="right" w:leader="dot" w:pos="8828"/>
@@ -1964,7 +1943,7 @@
           <w:hyperlink w:anchor="_Toc230878443" w:history="1">
             <w:r>
               <w:rPr>
-                <w:rStyle w:val="Hipervnculo"/>
+                <w:rStyle w:val="Hyperlink"/>
                 <w:noProof/>
               </w:rPr>
               <w:t>8</w:t>
@@ -1981,7 +1960,7 @@
             </w:r>
             <w:r>
               <w:rPr>
-                <w:rStyle w:val="Hipervnculo"/>
+                <w:rStyle w:val="Hyperlink"/>
                 <w:rFonts w:ascii="Aptos Display" w:hAnsi="Aptos Display"/>
                 <w:noProof/>
               </w:rPr>
@@ -2039,7 +2018,7 @@
         </w:p>
         <w:p>
           <w:pPr>
-            <w:pStyle w:val="TDC1"/>
+            <w:pStyle w:val="TOC1"/>
             <w:tabs>
               <w:tab w:val="left" w:pos="440"/>
               <w:tab w:val="right" w:leader="dot" w:pos="8828"/>
@@ -2055,7 +2034,7 @@
           <w:hyperlink w:anchor="_Toc230878444" w:history="1">
             <w:r>
               <w:rPr>
-                <w:rStyle w:val="Hipervnculo"/>
+                <w:rStyle w:val="Hyperlink"/>
                 <w:noProof/>
               </w:rPr>
               <w:t>9</w:t>
@@ -2072,7 +2051,7 @@
             </w:r>
             <w:r>
               <w:rPr>
-                <w:rStyle w:val="Hipervnculo"/>
+                <w:rStyle w:val="Hyperlink"/>
                 <w:rFonts w:ascii="Aptos Display" w:hAnsi="Aptos Display"/>
                 <w:noProof/>
               </w:rPr>
@@ -2130,7 +2109,7 @@
         </w:p>
         <w:p>
           <w:pPr>
-            <w:pStyle w:val="TDC1"/>
+            <w:pStyle w:val="TOC1"/>
             <w:tabs>
               <w:tab w:val="left" w:pos="720"/>
               <w:tab w:val="right" w:leader="dot" w:pos="8828"/>
@@ -2146,7 +2125,7 @@
           <w:hyperlink w:anchor="_Toc230878445" w:history="1">
             <w:r>
               <w:rPr>
-                <w:rStyle w:val="Hipervnculo"/>
+                <w:rStyle w:val="Hyperlink"/>
                 <w:noProof/>
               </w:rPr>
               <w:t>10</w:t>
@@ -2163,7 +2142,7 @@
             </w:r>
             <w:r>
               <w:rPr>
-                <w:rStyle w:val="Hipervnculo"/>
+                <w:rStyle w:val="Hyperlink"/>
                 <w:rFonts w:ascii="Aptos Display" w:hAnsi="Aptos Display"/>
                 <w:noProof/>
               </w:rPr>
@@ -2221,7 +2200,7 @@
         </w:p>
         <w:p>
           <w:pPr>
-            <w:pStyle w:val="TDC1"/>
+            <w:pStyle w:val="TOC1"/>
             <w:tabs>
               <w:tab w:val="left" w:pos="720"/>
               <w:tab w:val="right" w:leader="dot" w:pos="8828"/>
@@ -2237,7 +2216,7 @@
           <w:hyperlink w:anchor="_Toc230878446" w:history="1">
             <w:r>
               <w:rPr>
-                <w:rStyle w:val="Hipervnculo"/>
+                <w:rStyle w:val="Hyperlink"/>
                 <w:noProof/>
               </w:rPr>
               <w:t>11</w:t>
@@ -2254,7 +2233,7 @@
             </w:r>
             <w:r>
               <w:rPr>
-                <w:rStyle w:val="Hipervnculo"/>
+                <w:rStyle w:val="Hyperlink"/>
                 <w:rFonts w:ascii="Aptos Display" w:hAnsi="Aptos Display"/>
                 <w:noProof/>
               </w:rPr>
@@ -2312,7 +2291,7 @@
         </w:p>
         <w:p>
           <w:pPr>
-            <w:pStyle w:val="TDC1"/>
+            <w:pStyle w:val="TOC1"/>
             <w:tabs>
               <w:tab w:val="left" w:pos="720"/>
               <w:tab w:val="right" w:leader="dot" w:pos="8828"/>
@@ -2328,7 +2307,7 @@
           <w:hyperlink w:anchor="_Toc230878447" w:history="1">
             <w:r>
               <w:rPr>
-                <w:rStyle w:val="Hipervnculo"/>
+                <w:rStyle w:val="Hyperlink"/>
                 <w:noProof/>
               </w:rPr>
               <w:t>12</w:t>
@@ -2345,7 +2324,7 @@
             </w:r>
             <w:r>
               <w:rPr>
-                <w:rStyle w:val="Hipervnculo"/>
+                <w:rStyle w:val="Hyperlink"/>
                 <w:rFonts w:ascii="Aptos Display" w:hAnsi="Aptos Display"/>
                 <w:noProof/>
               </w:rPr>
@@ -2429,7 +2408,7 @@
     </w:p>
     <w:p>
       <w:pPr>
-        <w:pStyle w:val="Ttulo"/>
+        <w:pStyle w:val="Title"/>
         <w:rPr>
           <w:sz w:val="40"/>
           <w:szCs w:val="40"/>
@@ -2449,7 +2428,7 @@
     <w:p/>
     <w:p>
       <w:pPr>
-        <w:pStyle w:val="Ttulo1"/>
+        <w:pStyle w:val="Heading1"/>
       </w:pPr>
       <w:bookmarkStart w:id="2" w:name="_Toc230878434"/>
       <w:r>
@@ -2527,12 +2506,84 @@
         <w:rPr>
           <w:rFonts w:ascii="Aptos" w:hAnsi="Aptos"/>
         </w:rPr>
-        <w:t xml:space="preserve">La plataforma surge como respuesta a una necesidad institucional concreta: reducir la carga operativa de la evaluación técnica, mejorar la trazabilidad de las evidencias analizadas y facilitar que </w:t>
+        <w:t>La plataforma surge como respuesta a una</w:t>
       </w:r>
       <w:r>
         <w:rPr>
           <w:rFonts w:ascii="Aptos" w:hAnsi="Aptos"/>
         </w:rPr>
+        <w:t xml:space="preserve"> pregunta que </w:t>
+      </w:r>
+      <w:r>
+        <w:rPr>
+          <w:rFonts w:ascii="Aptos" w:hAnsi="Aptos"/>
+          <w:highlight w:val="yellow"/>
+        </w:rPr>
+        <w:t>identificamos en la DFMEMI al analizar el proceso de evaluación de candidatos</w:t>
+      </w:r>
+      <w:r>
+        <w:rPr>
+          <w:rFonts w:ascii="Aptos" w:hAnsi="Aptos"/>
+        </w:rPr>
+        <w:t>:</w:t>
+      </w:r>
+      <w:r>
+        <w:rPr>
+          <w:rFonts w:ascii="Aptos" w:hAnsi="Aptos"/>
+        </w:rPr>
+        <w:t xml:space="preserve"> </w:t>
+      </w:r>
+      <w:r>
+        <w:rPr>
+          <w:rFonts w:ascii="Aptos" w:hAnsi="Aptos"/>
+          <w:highlight w:val="yellow"/>
+        </w:rPr>
+        <w:t>¿</w:t>
+      </w:r>
+      <w:r>
+        <w:rPr>
+          <w:rFonts w:ascii="Aptos" w:hAnsi="Aptos"/>
+          <w:highlight w:val="yellow"/>
+        </w:rPr>
+        <w:t>c</w:t>
+      </w:r>
+      <w:r>
+        <w:rPr>
+          <w:rFonts w:ascii="Aptos" w:hAnsi="Aptos"/>
+          <w:highlight w:val="yellow"/>
+        </w:rPr>
+        <w:t>ómo</w:t>
+      </w:r>
+      <w:r>
+        <w:rPr>
+          <w:rFonts w:ascii="Aptos" w:hAnsi="Aptos"/>
+          <w:highlight w:val="yellow"/>
+        </w:rPr>
+        <w:t xml:space="preserve"> eficientizar el proceso de selección entre numerosos candidatos de altas competencias, </w:t>
+      </w:r>
+      <w:r>
+        <w:rPr>
+          <w:rFonts w:ascii="Aptos" w:hAnsi="Aptos"/>
+        </w:rPr>
+        <w:t xml:space="preserve">reducir la carga operativa de la evaluación </w:t>
+      </w:r>
+      <w:r>
+        <w:rPr>
+          <w:rFonts w:ascii="Aptos" w:hAnsi="Aptos"/>
+          <w:highlight w:val="yellow"/>
+        </w:rPr>
+        <w:t>curricular</w:t>
+      </w:r>
+      <w:r>
+        <w:rPr>
+          <w:rFonts w:ascii="Aptos" w:hAnsi="Aptos"/>
+        </w:rPr>
+        <w:t xml:space="preserve">, mejorar la trazabilidad de las evidencias analizadas y facilitar que </w:t>
+      </w:r>
+      <w:r>
+        <w:rPr>
+          <w:rFonts w:ascii="Aptos" w:hAnsi="Aptos"/>
+        </w:rPr>
         <w:t xml:space="preserve">las áreas especializadas </w:t>
       </w:r>
       <w:r>
@@ -2551,103 +2602,27 @@
         <w:rPr>
           <w:rFonts w:ascii="Aptos" w:hAnsi="Aptos"/>
         </w:rPr>
-        <w:t xml:space="preserve"> su criterio experto en la validación final. El desarrollo fue realizado </w:t>
+        <w:t xml:space="preserve"> su criterio experto en la validación </w:t>
       </w:r>
       <w:r>
         <w:rPr>
           <w:rFonts w:ascii="Aptos" w:hAnsi="Aptos"/>
-        </w:rPr>
-        <w:t>por iniciativa</w:t>
+          <w:highlight w:val="yellow"/>
+        </w:rPr>
+        <w:t>táctica-estratégica, que no debería delegarse a una herramienta de IA</w:t>
       </w:r>
       <w:r>
         <w:rPr>
           <w:rFonts w:ascii="Aptos" w:hAnsi="Aptos"/>
-        </w:rPr>
-        <w:t xml:space="preserve"> y conceptualización</w:t>
+          <w:highlight w:val="yellow"/>
+        </w:rPr>
+        <w:t>?</w:t>
       </w:r>
       <w:r>
         <w:rPr>
           <w:rFonts w:ascii="Aptos" w:hAnsi="Aptos"/>
         </w:rPr>
-        <w:t xml:space="preserve"> del señor Yovanny Rodríguez, </w:t>
-      </w:r>
-      <w:r>
-        <w:rPr>
-          <w:rFonts w:ascii="Aptos" w:hAnsi="Aptos"/>
-        </w:rPr>
-        <w:t>director</w:t>
-      </w:r>
-      <w:r>
-        <w:rPr>
-          <w:rFonts w:ascii="Aptos" w:hAnsi="Aptos"/>
-        </w:rPr>
-        <w:t xml:space="preserve"> de Mercado Eléctrico Minorista (DFMEMI</w:t>
-      </w:r>
-      <w:r>
-        <w:rPr>
-          <w:rFonts w:ascii="Aptos" w:hAnsi="Aptos"/>
-        </w:rPr>
-        <w:t>)</w:t>
-      </w:r>
-      <w:r>
-        <w:rPr>
-          <w:rFonts w:ascii="Aptos" w:hAnsi="Aptos"/>
-        </w:rPr>
-        <w:t>, e implementado</w:t>
-      </w:r>
-      <w:r>
-        <w:rPr>
-          <w:rFonts w:ascii="Aptos" w:hAnsi="Aptos"/>
-        </w:rPr>
         <w:t xml:space="preserve"> </w:t>
-      </w:r>
-      <w:r>
-        <w:rPr>
-          <w:rFonts w:ascii="Aptos" w:hAnsi="Aptos"/>
-        </w:rPr>
-        <w:t xml:space="preserve">por </w:t>
-      </w:r>
-      <w:r>
-        <w:rPr>
-          <w:rFonts w:ascii="Aptos" w:hAnsi="Aptos"/>
-        </w:rPr>
-        <w:t>Delio Siret, Encargado de Fiscalización de Sistemas de Medición Comercial</w:t>
-      </w:r>
-      <w:r>
-        <w:rPr>
-          <w:rFonts w:ascii="Aptos" w:hAnsi="Aptos"/>
-        </w:rPr>
-        <w:t xml:space="preserve"> de la DFMEMI,</w:t>
-      </w:r>
-      <w:r>
-        <w:rPr>
-          <w:rFonts w:ascii="Aptos" w:hAnsi="Aptos"/>
-        </w:rPr>
-        <w:t xml:space="preserve"> y </w:t>
-      </w:r>
-      <w:r>
-        <w:rPr>
-          <w:rFonts w:ascii="Aptos" w:hAnsi="Aptos"/>
-        </w:rPr>
-        <w:t xml:space="preserve">valiéndose de </w:t>
-      </w:r>
-      <w:r>
-        <w:rPr>
-          <w:rFonts w:ascii="Aptos" w:hAnsi="Aptos"/>
-        </w:rPr>
-        <w:t>criterios establecidos por la</w:t>
-      </w:r>
-      <w:r>
-        <w:rPr>
-          <w:rFonts w:ascii="Aptos" w:hAnsi="Aptos"/>
-        </w:rPr>
-        <w:t xml:space="preserve"> Dirección de Recursos Humanos, dirigida por Annery Galván, y la Dirección de Regulación, dirigida por César Olivero</w:t>
-      </w:r>
-      <w:r>
-        <w:rPr>
-          <w:rFonts w:ascii="Aptos" w:hAnsi="Aptos"/>
-        </w:rPr>
-        <w:t xml:space="preserve"> para la vacante.</w:t>
       </w:r>
     </w:p>
     <w:p>
@@ -2660,12 +2635,201 @@
       </w:pPr>
       <w:r>
         <w:rPr>
+          <w:rFonts w:ascii="Aptos" w:hAnsi="Aptos"/>
+        </w:rPr>
+        <w:t xml:space="preserve">El desarrollo fue realizado </w:t>
+      </w:r>
+      <w:r>
+        <w:rPr>
+          <w:rFonts w:ascii="Aptos" w:hAnsi="Aptos"/>
+        </w:rPr>
+        <w:t>por iniciativa</w:t>
+      </w:r>
+      <w:r>
+        <w:rPr>
+          <w:rFonts w:ascii="Aptos" w:hAnsi="Aptos"/>
+        </w:rPr>
+        <w:t xml:space="preserve"> y conceptualización</w:t>
+      </w:r>
+      <w:r>
+        <w:rPr>
+          <w:rFonts w:ascii="Aptos" w:hAnsi="Aptos"/>
+        </w:rPr>
+        <w:t xml:space="preserve"> </w:t>
+      </w:r>
+      <w:r>
+        <w:rPr>
+          <w:rFonts w:ascii="Aptos" w:hAnsi="Aptos"/>
+        </w:rPr>
+        <w:t>Yovanny Rodríguez</w:t>
+      </w:r>
+      <w:r>
+        <w:rPr>
+          <w:rFonts w:ascii="Aptos" w:hAnsi="Aptos"/>
+        </w:rPr>
+        <w:t>, e implementado</w:t>
+      </w:r>
+      <w:r>
+        <w:rPr>
+          <w:rFonts w:ascii="Aptos" w:hAnsi="Aptos"/>
+        </w:rPr>
+        <w:t xml:space="preserve"> </w:t>
+      </w:r>
+      <w:r>
+        <w:rPr>
+          <w:rFonts w:ascii="Aptos" w:hAnsi="Aptos"/>
+        </w:rPr>
+        <w:t xml:space="preserve">por </w:t>
+      </w:r>
+      <w:r>
+        <w:rPr>
+          <w:rFonts w:ascii="Aptos" w:hAnsi="Aptos"/>
+        </w:rPr>
+        <w:t>Delio Siret</w:t>
+      </w:r>
+      <w:r>
+        <w:rPr>
+          <w:rFonts w:ascii="Aptos" w:hAnsi="Aptos"/>
+        </w:rPr>
+        <w:t>,</w:t>
+      </w:r>
+      <w:r>
+        <w:rPr>
+          <w:rFonts w:ascii="Aptos" w:hAnsi="Aptos"/>
+        </w:rPr>
+        <w:t xml:space="preserve"> y </w:t>
+      </w:r>
+      <w:r>
+        <w:rPr>
+          <w:rFonts w:ascii="Aptos" w:hAnsi="Aptos"/>
+        </w:rPr>
+        <w:t xml:space="preserve">valiéndose de </w:t>
+      </w:r>
+      <w:r>
+        <w:rPr>
+          <w:rFonts w:ascii="Aptos" w:hAnsi="Aptos"/>
+        </w:rPr>
+        <w:t xml:space="preserve">criterios </w:t>
+      </w:r>
+      <w:r>
+        <w:rPr>
+          <w:rFonts w:ascii="Aptos" w:hAnsi="Aptos"/>
+          <w:highlight w:val="yellow"/>
+        </w:rPr>
+        <w:t xml:space="preserve">y </w:t>
+      </w:r>
+      <w:r>
+        <w:rPr>
+          <w:rFonts w:ascii="Aptos" w:hAnsi="Aptos"/>
+          <w:highlight w:val="yellow"/>
+        </w:rPr>
+        <w:t>requisitos publicados para la vacante</w:t>
+      </w:r>
+      <w:r>
+        <w:rPr>
+          <w:rFonts w:ascii="Aptos" w:hAnsi="Aptos"/>
+          <w:highlight w:val="yellow"/>
+        </w:rPr>
+        <w:t xml:space="preserve"> </w:t>
+      </w:r>
+      <w:r>
+        <w:rPr>
+          <w:rFonts w:ascii="Aptos" w:hAnsi="Aptos"/>
+          <w:highlight w:val="yellow"/>
+        </w:rPr>
+        <w:t>Gerente de Normas Eléctricas</w:t>
+      </w:r>
+      <w:r>
+        <w:rPr>
+          <w:rFonts w:ascii="Aptos" w:hAnsi="Aptos"/>
+          <w:highlight w:val="yellow"/>
+        </w:rPr>
+        <w:t>,</w:t>
+      </w:r>
+      <w:r>
+        <w:rPr>
+          <w:rFonts w:ascii="Aptos" w:hAnsi="Aptos"/>
+          <w:highlight w:val="yellow"/>
+        </w:rPr>
+        <w:t xml:space="preserve"> y posteriormente </w:t>
+      </w:r>
+      <w:r>
+        <w:rPr>
+          <w:rFonts w:ascii="Aptos" w:hAnsi="Aptos"/>
+          <w:highlight w:val="yellow"/>
+        </w:rPr>
+        <w:t>socializados con la directora</w:t>
+      </w:r>
+      <w:r>
+        <w:rPr>
+          <w:rFonts w:ascii="Aptos" w:hAnsi="Aptos"/>
+          <w:highlight w:val="yellow"/>
+        </w:rPr>
+        <w:t xml:space="preserve"> y la gerente, Annery Galván y Juana Petra De León, respectivamente.</w:t>
+      </w:r>
+    </w:p>
+    <w:p>
+      <w:pPr>
+        <w:spacing w:after="120"/>
+        <w:jc w:val="both"/>
+        <w:rPr>
+          <w:rFonts w:ascii="Aptos" w:hAnsi="Aptos"/>
+        </w:rPr>
+      </w:pPr>
+      <w:r>
+        <w:rPr>
+          <w:rFonts w:ascii="Aptos" w:hAnsi="Aptos"/>
+          <w:highlight w:val="yellow"/>
+          <w:u w:val="single"/>
+        </w:rPr>
+        <w:t>Importante</w:t>
+      </w:r>
+      <w:r>
+        <w:rPr>
+          <w:rFonts w:ascii="Aptos" w:hAnsi="Aptos"/>
+          <w:highlight w:val="yellow"/>
+        </w:rPr>
+        <w:t>: Esta iniciativa se presta</w:t>
+      </w:r>
+      <w:r>
+        <w:rPr>
+          <w:rFonts w:ascii="Aptos" w:hAnsi="Aptos"/>
+          <w:highlight w:val="yellow"/>
+        </w:rPr>
+        <w:t xml:space="preserve">, </w:t>
+      </w:r>
+      <w:r>
+        <w:rPr>
+          <w:rFonts w:ascii="Aptos" w:hAnsi="Aptos"/>
+          <w:color w:val="EE0000"/>
+          <w:highlight w:val="yellow"/>
+        </w:rPr>
+        <w:t>como dijimos</w:t>
+      </w:r>
+      <w:r>
+        <w:rPr>
+          <w:rFonts w:ascii="Aptos" w:hAnsi="Aptos"/>
+          <w:highlight w:val="yellow"/>
+        </w:rPr>
+        <w:t>, solo para el uso interno de RRHH en esta Superintendencia de Electricidad (SIE). Se prohíbe su uso fuera de la SIE o en beneficio personal o empresarial particular.</w:t>
+      </w:r>
+    </w:p>
+    <w:p>
+      <w:pPr>
+        <w:spacing w:after="120"/>
+        <w:jc w:val="both"/>
+        <w:rPr>
+          <w:rFonts w:ascii="Aptos" w:hAnsi="Aptos"/>
+        </w:rPr>
+      </w:pPr>
+      <w:r>
+        <w:rPr>
           <w:noProof/>
         </w:rPr>
         <w:drawing>
-          <wp:inline distT="0" distB="0" distL="0" distR="0" wp14:anchorId="24D4B901" wp14:editId="0FCA2685">
-            <wp:extent cx="5602605" cy="2654300"/>
-            <wp:effectExtent l="0" t="0" r="0" b="0"/>
+          <wp:inline distT="0" distB="0" distL="0" distR="0" wp14:anchorId="42FB614F" wp14:editId="40D0FB53">
+            <wp:extent cx="3063923" cy="1451570"/>
+            <wp:effectExtent l="0" t="0" r="3175" b="0"/>
             <wp:docPr id="1998079430" name="Imagen 5"/>
             <wp:cNvGraphicFramePr>
               <a:graphicFrameLocks xmlns:a="http://schemas.openxmlformats.org/drawingml/2006/main" noChangeAspect="1"/>
@@ -2695,7 +2859,7 @@
                   <pic:spPr bwMode="auto">
                     <a:xfrm>
                       <a:off x="0" y="0"/>
-                      <a:ext cx="5602605" cy="2654300"/>
+                      <a:ext cx="3071734" cy="1455271"/>
                     </a:xfrm>
                     <a:prstGeom prst="rect">
                       <a:avLst/>
@@ -2714,16 +2878,7 @@
     </w:p>
     <w:p>
       <w:pPr>
-        <w:spacing w:after="120"/>
-        <w:jc w:val="both"/>
-        <w:rPr>
-          <w:rFonts w:ascii="Aptos" w:hAnsi="Aptos"/>
-        </w:rPr>
-      </w:pPr>
-    </w:p>
-    <w:p>
-      <w:pPr>
-        <w:pStyle w:val="Ttulo1"/>
+        <w:pStyle w:val="Heading1"/>
       </w:pPr>
       <w:bookmarkStart w:id="3" w:name="_Toc230878435"/>
       <w:r>
@@ -2741,12 +2896,18 @@
         <w:rPr>
           <w:rFonts w:ascii="Aptos" w:hAnsi="Aptos"/>
         </w:rPr>
-        <w:t>Proveer una herramienta digital, trazable y configurable para apoyar la evaluación comparativa de candidatos a puestos técnicos especializados, iniciando con la vacante de Gerente de Normas Eléctricas.</w:t>
+        <w:t>Proveer una herramienta digital, trazable y configurable para apoyar la evaluación comparativa de candidatos a puestos técnicos especializados, iniciando con la vacante de Gerente de Normas Eléctrica</w:t>
+      </w:r>
+      <w:r>
+        <w:rPr>
+          <w:rFonts w:ascii="Aptos" w:hAnsi="Aptos"/>
+        </w:rPr>
+        <w:t>s, como piloto.</w:t>
       </w:r>
     </w:p>
     <w:p>
       <w:pPr>
-        <w:pStyle w:val="Listaconvietas"/>
+        <w:pStyle w:val="ListBullet"/>
         <w:tabs>
           <w:tab w:val="num" w:pos="360"/>
         </w:tabs>
@@ -2767,7 +2928,7 @@
     </w:p>
     <w:p>
       <w:pPr>
-        <w:pStyle w:val="Listaconvietas"/>
+        <w:pStyle w:val="ListBullet"/>
         <w:tabs>
           <w:tab w:val="num" w:pos="360"/>
         </w:tabs>
@@ -2788,7 +2949,7 @@
     </w:p>
     <w:p>
       <w:pPr>
-        <w:pStyle w:val="Listaconvietas"/>
+        <w:pStyle w:val="ListBullet"/>
         <w:tabs>
           <w:tab w:val="num" w:pos="360"/>
         </w:tabs>
@@ -2809,7 +2970,7 @@
     </w:p>
     <w:p>
       <w:pPr>
-        <w:pStyle w:val="Listaconvietas"/>
+        <w:pStyle w:val="ListBullet"/>
         <w:tabs>
           <w:tab w:val="num" w:pos="360"/>
         </w:tabs>
@@ -2830,7 +2991,7 @@
     </w:p>
     <w:p>
       <w:pPr>
-        <w:pStyle w:val="Listaconvietas"/>
+        <w:pStyle w:val="ListBullet"/>
         <w:tabs>
           <w:tab w:val="num" w:pos="360"/>
         </w:tabs>
@@ -2851,7 +3012,7 @@
     </w:p>
     <w:p>
       <w:pPr>
-        <w:pStyle w:val="Ttulo1"/>
+        <w:pStyle w:val="Heading1"/>
       </w:pPr>
       <w:bookmarkStart w:id="4" w:name="_Toc230878436"/>
       <w:r>
@@ -2883,7 +3044,7 @@
         <w:rPr>
           <w:rFonts w:ascii="Aptos" w:hAnsi="Aptos"/>
         </w:rPr>
-        <w:t>A partir de esa iniciativa, se coordinó con Recursos Humanos y con la Dirección de Regulación la creación de una plataforma que permitiera convertir los criterios preliminares de evaluación en una estructura digital flexible. La primera plantilla fue construida tomando como referencia el instrumento inicial en hoja de cálculo para la evaluación de aspirantes a Gerente de Normas Eléctricas, evolucionándolo hacia un sistema más robusto, con control de usuarios, expedientes documentales, ponderaciones inteligentes, criterios críticos y evaluación asistida por IA.</w:t>
+        <w:t>A partir de esa iniciativa, se coordinó con Recursos Humanos la creación de una plataforma que permitiera convertir los criterios preliminares de evaluación en una estructura digital flexible. La primera plantilla fue construida tomando como referencia el instrumento inicial en hoja de cálculo para la evaluación de aspirantes a Gerente de Normas Eléctricas, evolucionándolo hacia un sistema más robusto, con control de usuarios, expedientes documentales, ponderaciones inteligentes, criterios críticos y evaluación asistida por IA.</w:t>
       </w:r>
     </w:p>
     <w:p>
@@ -2902,7 +3063,7 @@
     </w:p>
     <w:p>
       <w:pPr>
-        <w:pStyle w:val="Ttulo1"/>
+        <w:pStyle w:val="Heading1"/>
       </w:pPr>
       <w:bookmarkStart w:id="5" w:name="_Toc230878437"/>
       <w:r>
@@ -2945,13 +3106,30 @@
           <w:rFonts w:asciiTheme="minorHAnsi" w:hAnsiTheme="minorHAnsi"/>
           <w:sz w:val="22"/>
           <w:szCs w:val="22"/>
-        </w:rPr>
-        <w:t>La Dirección de Regulación tiene entre sus responsabilidades realizar estudios técnicos y económicos, formular normas técnicas y de calidad de servicio, y determinar precios regulados, entre otras funciones propias del ámbito regulatorio. La Dirección de Fiscalización de Mercado Eléctrico Minorista, por su parte, tiene a su cargo funciones de fiscalización técnica y seguimiento del cumplimiento normativo en las actividades vinculadas al mercado eléctrico minorista, especialmente en los procesos asociados a la distribución y comercialización de electricidad a usuarios regulados. A su vez, la Dirección de Recursos Humanos administra los procesos de reclutamiento y selección conforme a las normas institucionales y legales vigentes. La plataforma propuesta opera como un puente entre estas necesidades institucionales: rigor técnico, fortalecimiento de la fiscalización del mercado eléctrico minorista y gestión ordenada del talento.</w:t>
+          <w:highlight w:val="yellow"/>
+        </w:rPr>
+        <w:t>En ese orden</w:t>
+      </w:r>
+      <w:r>
+        <w:rPr>
+          <w:rFonts w:asciiTheme="minorHAnsi" w:hAnsiTheme="minorHAnsi"/>
+          <w:sz w:val="22"/>
+          <w:szCs w:val="22"/>
+        </w:rPr>
+        <w:t xml:space="preserve">, </w:t>
+      </w:r>
+      <w:r>
+        <w:rPr>
+          <w:rFonts w:asciiTheme="minorHAnsi" w:hAnsiTheme="minorHAnsi"/>
+          <w:sz w:val="22"/>
+          <w:szCs w:val="22"/>
+        </w:rPr>
+        <w:t>la Dirección de Recursos Humanos administra los procesos de reclutamiento y selección conforme a las normas institucionales y legales vigentes. La plataforma propuesta opera como un puente entre estas necesidades institucionales: rigor técnico, fortalecimiento de la fiscalización del mercado eléctrico minorista y gestión ordenada del talento.</w:t>
       </w:r>
     </w:p>
     <w:p>
       <w:pPr>
-        <w:pStyle w:val="Ttulo1"/>
+        <w:pStyle w:val="Heading1"/>
       </w:pPr>
       <w:bookmarkStart w:id="6" w:name="_Toc230878438"/>
       <w:r>
@@ -2970,11 +3148,10 @@
         <w:rPr>
           <w:rFonts w:ascii="Aptos" w:hAnsi="Aptos"/>
         </w:rPr>
-        <w:t>El sistema no sustituye las competencias legales ni los procedimientos formales de selección de personal. Su función es servir como herramienta de apoyo técnico y documental para que las áreas competentes sustenten sus análisis con mayor consistencia. El uso de la plataforma debe observar, como mínimo, los siguientes referentes:</w:t>
+        <w:t>El sistema no sustituye las competencias ni los procedimientos formales de selección de personal. Su función es servir como herramienta de apoyo técnico y documental para que las áreas competentes sustenten sus análisis con mayor consistencia. El uso de la plataforma debe observar, como mínimo, los siguientes referentes:</w:t>
       </w:r>
     </w:p>
     <w:p>
-      <w:pPr/>
       <w:r>
         <w:rPr>
           <w:rFonts w:ascii="Aptos" w:hAnsi="Aptos"/>
@@ -2985,7 +3162,7 @@
     </w:p>
     <w:tbl>
       <w:tblPr>
-        <w:tblStyle w:val="Tablaconcuadrcula"/>
+        <w:tblStyle w:val="TableGrid"/>
         <w:tblW w:w="0" w:type="auto"/>
         <w:jc w:val="center"/>
         <w:tblLook w:val="04A0" w:firstRow="1" w:lastRow="0" w:firstColumn="1" w:lastColumn="0" w:noHBand="0" w:noVBand="1"/>
@@ -3000,7 +3177,7 @@
         </w:trPr>
         <w:tc>
           <w:tcPr>
-            <w:tcW w:w="4929" w:type="dxa"/>
+            <w:tcW w:w="4404" w:type="dxa"/>
             <w:shd w:val="clear" w:color="auto" w:fill="DCECEA"/>
             <w:vAlign w:val="center"/>
           </w:tcPr>
@@ -3020,7 +3197,7 @@
         </w:tc>
         <w:tc>
           <w:tcPr>
-            <w:tcW w:w="4929" w:type="dxa"/>
+            <w:tcW w:w="4424" w:type="dxa"/>
             <w:shd w:val="clear" w:color="auto" w:fill="DCECEA"/>
             <w:vAlign w:val="center"/>
           </w:tcPr>
@@ -3045,7 +3222,7 @@
         </w:trPr>
         <w:tc>
           <w:tcPr>
-            <w:tcW w:w="4929" w:type="dxa"/>
+            <w:tcW w:w="4404" w:type="dxa"/>
             <w:vAlign w:val="center"/>
           </w:tcPr>
           <w:p>
@@ -3064,7 +3241,7 @@
         </w:tc>
         <w:tc>
           <w:tcPr>
-            <w:tcW w:w="4929" w:type="dxa"/>
+            <w:tcW w:w="4424" w:type="dxa"/>
             <w:vAlign w:val="center"/>
           </w:tcPr>
           <w:p>
@@ -3087,7 +3264,7 @@
         </w:trPr>
         <w:tc>
           <w:tcPr>
-            <w:tcW w:w="4929" w:type="dxa"/>
+            <w:tcW w:w="4404" w:type="dxa"/>
             <w:vAlign w:val="center"/>
           </w:tcPr>
           <w:p>
@@ -3106,7 +3283,7 @@
         </w:tc>
         <w:tc>
           <w:tcPr>
-            <w:tcW w:w="4929" w:type="dxa"/>
+            <w:tcW w:w="4424" w:type="dxa"/>
             <w:vAlign w:val="center"/>
           </w:tcPr>
           <w:p>
@@ -3129,7 +3306,7 @@
         </w:trPr>
         <w:tc>
           <w:tcPr>
-            <w:tcW w:w="4929" w:type="dxa"/>
+            <w:tcW w:w="4404" w:type="dxa"/>
             <w:vAlign w:val="center"/>
           </w:tcPr>
           <w:p>
@@ -3144,11 +3321,55 @@
               </w:rPr>
               <w:t>Ley núm. 41-08 de Función Pública</w:t>
             </w:r>
+            <w:r>
+              <w:rPr>
+                <w:rFonts w:ascii="Aptos" w:hAnsi="Aptos"/>
+                <w:b/>
+                <w:sz w:val="19"/>
+              </w:rPr>
+              <w:t xml:space="preserve">, </w:t>
+            </w:r>
+            <w:r>
+              <w:rPr>
+                <w:rFonts w:ascii="Aptos" w:hAnsi="Aptos"/>
+                <w:b/>
+                <w:sz w:val="19"/>
+                <w:highlight w:val="yellow"/>
+              </w:rPr>
+              <w:t xml:space="preserve">y/o </w:t>
+            </w:r>
+            <w:r>
+              <w:rPr>
+                <w:rFonts w:ascii="Aptos" w:hAnsi="Aptos"/>
+                <w:b/>
+                <w:sz w:val="19"/>
+                <w:highlight w:val="yellow"/>
+              </w:rPr>
+              <w:t>Ley núm. 16-92</w:t>
+            </w:r>
+            <w:r>
+              <w:rPr>
+                <w:rFonts w:ascii="Aptos" w:hAnsi="Aptos"/>
+                <w:b/>
+                <w:sz w:val="19"/>
+                <w:highlight w:val="yellow"/>
+              </w:rPr>
+              <w:t xml:space="preserve"> de </w:t>
+            </w:r>
+            <w:r>
+              <w:rPr>
+                <w:rFonts w:ascii="Aptos" w:hAnsi="Aptos"/>
+                <w:b/>
+                <w:sz w:val="19"/>
+                <w:highlight w:val="yellow"/>
+              </w:rPr>
+              <w:t>Código de Trabajo de la República Dominicana</w:t>
+            </w:r>
           </w:p>
         </w:tc>
         <w:tc>
           <w:tcPr>
-            <w:tcW w:w="4929" w:type="dxa"/>
+            <w:tcW w:w="4424" w:type="dxa"/>
             <w:vAlign w:val="center"/>
           </w:tcPr>
           <w:p>
@@ -3160,48 +3381,36 @@
                 <w:rFonts w:ascii="Aptos" w:hAnsi="Aptos"/>
                 <w:sz w:val="19"/>
               </w:rPr>
-              <w:t>Aporta el marco general para la gestión pública de recursos humanos, profesionalización, organización y administración del personal en entidades públicas.</w:t>
-            </w:r>
-          </w:p>
-        </w:tc>
-      </w:tr>
-      <w:tr>
-        <w:tc>
-          <w:tcPr>
-            <w:tcW w:type="dxa" w:w="4404"/>
-            <w:shd w:fill="F4E8DE"/>
-          </w:tcPr>
-          <w:p>
-            <w:pPr>
-              <w:spacing w:after="0"/>
-            </w:pPr>
-            <w:r/>
+              <w:t xml:space="preserve">Aporta el marco general para la gestión pública </w:t>
+            </w:r>
             <w:r>
               <w:rPr>
                 <w:rFonts w:ascii="Aptos" w:hAnsi="Aptos"/>
-                <w:b/>
                 <w:sz w:val="19"/>
               </w:rPr>
-              <w:t>Código de Trabajo de la República Dominicana, Ley núm. 16-92, y Reglamento de Aplicación aprobado por Decreto núm. 258-93</w:t>
-            </w:r>
-          </w:p>
-        </w:tc>
-        <w:tc>
-          <w:tcPr>
-            <w:tcW w:type="dxa" w:w="4424"/>
-          </w:tcPr>
-          <w:p>
-            <w:pPr>
-              <w:spacing w:after="0"/>
-            </w:pPr>
-            <w:r/>
+              <w:t xml:space="preserve">y </w:t>
+            </w:r>
             <w:r>
               <w:rPr>
                 <w:rFonts w:ascii="Aptos" w:hAnsi="Aptos"/>
-                <w:b w:val="0"/>
                 <w:sz w:val="19"/>
-              </w:rPr>
-              <w:t>La Ley núm. 16-92, promulgada el 29 de mayo de 1992, aprueba el Código de Trabajo dominicano. Aunque el propio Código establece que no se aplica a funcionarios y empleados públicos salvo disposición legal o estatutaria especial, resulta pertinente como referencia complementaria en materia de principios laborales, libertad de trabajo, no discriminación, calificaciones exigidas para un empleo determinado y buenas prácticas de selección. Su Reglamento de Aplicación fue aprobado mediante el Decreto núm. 258-93, del 1 de octubre de 1993.</w:t>
+                <w:highlight w:val="yellow"/>
+              </w:rPr>
+              <w:t>privada</w:t>
+            </w:r>
+            <w:r>
+              <w:rPr>
+                <w:rFonts w:ascii="Aptos" w:hAnsi="Aptos"/>
+                <w:sz w:val="19"/>
+              </w:rPr>
+              <w:t xml:space="preserve"> </w:t>
+            </w:r>
+            <w:r>
+              <w:rPr>
+                <w:rFonts w:ascii="Aptos" w:hAnsi="Aptos"/>
+                <w:sz w:val="19"/>
+              </w:rPr>
+              <w:t>de recursos humanos, profesionalización, organización y administración del personal en entidades públicas.</w:t>
             </w:r>
           </w:p>
         </w:tc>
@@ -3212,7 +3421,7 @@
         </w:trPr>
         <w:tc>
           <w:tcPr>
-            <w:tcW w:w="4929" w:type="dxa"/>
+            <w:tcW w:w="4404" w:type="dxa"/>
             <w:vAlign w:val="center"/>
           </w:tcPr>
           <w:p>
@@ -3232,7 +3441,7 @@
         </w:tc>
         <w:tc>
           <w:tcPr>
-            <w:tcW w:w="4929" w:type="dxa"/>
+            <w:tcW w:w="4424" w:type="dxa"/>
             <w:vAlign w:val="center"/>
           </w:tcPr>
           <w:p>
@@ -3255,7 +3464,7 @@
         </w:trPr>
         <w:tc>
           <w:tcPr>
-            <w:tcW w:w="4929" w:type="dxa"/>
+            <w:tcW w:w="4404" w:type="dxa"/>
             <w:vAlign w:val="center"/>
           </w:tcPr>
           <w:p>
@@ -3274,7 +3483,7 @@
         </w:tc>
         <w:tc>
           <w:tcPr>
-            <w:tcW w:w="4929" w:type="dxa"/>
+            <w:tcW w:w="4424" w:type="dxa"/>
             <w:vAlign w:val="center"/>
           </w:tcPr>
           <w:p>
@@ -3297,7 +3506,7 @@
         </w:trPr>
         <w:tc>
           <w:tcPr>
-            <w:tcW w:w="4929" w:type="dxa"/>
+            <w:tcW w:w="4404" w:type="dxa"/>
             <w:vAlign w:val="center"/>
           </w:tcPr>
           <w:p>
@@ -3316,7 +3525,7 @@
         </w:tc>
         <w:tc>
           <w:tcPr>
-            <w:tcW w:w="4929" w:type="dxa"/>
+            <w:tcW w:w="4424" w:type="dxa"/>
             <w:vAlign w:val="center"/>
           </w:tcPr>
           <w:p>
@@ -3342,13 +3551,16 @@
     </w:p>
     <w:p>
       <w:pPr>
-        <w:pStyle w:val="Ttulo1"/>
+        <w:pStyle w:val="Heading1"/>
       </w:pPr>
       <w:bookmarkStart w:id="7" w:name="_Toc230878439"/>
       <w:r>
         <w:t>Desarrollo</w:t>
       </w:r>
       <w:bookmarkEnd w:id="7"/>
+      <w:r>
+        <w:t xml:space="preserve"> de la Aplicación</w:t>
+      </w:r>
     </w:p>
     <w:p>
       <w:pPr>
@@ -3358,25 +3570,82 @@
       <w:r>
         <w:rPr>
           <w:rFonts w:ascii="Aptos" w:hAnsi="Aptos"/>
+        </w:rPr>
+        <w:t>La arquitectura favorece despliegue reproducible, separación de responsabilidades, persistencia de información</w:t>
+      </w:r>
+      <w:r>
+        <w:rPr>
+          <w:rFonts w:ascii="Aptos" w:hAnsi="Aptos"/>
+        </w:rPr>
+        <w:t xml:space="preserve">, </w:t>
+      </w:r>
+      <w:r>
+        <w:rPr>
+          <w:rFonts w:ascii="Aptos" w:hAnsi="Aptos"/>
+        </w:rPr>
+        <w:t>operación local o institucional</w:t>
+      </w:r>
+      <w:r>
+        <w:rPr>
+          <w:rFonts w:ascii="Aptos" w:hAnsi="Aptos"/>
+          <w:highlight w:val="yellow"/>
+        </w:rPr>
+        <w:t xml:space="preserve">, </w:t>
+      </w:r>
+      <w:r>
+        <w:rPr>
+          <w:rFonts w:ascii="Aptos" w:hAnsi="Aptos"/>
+          <w:highlight w:val="yellow"/>
+        </w:rPr>
+        <w:t>g</w:t>
+      </w:r>
+      <w:r>
+        <w:rPr>
+          <w:rFonts w:ascii="Aptos" w:hAnsi="Aptos"/>
           <w:sz w:val="21"/>
-        </w:rPr>
-        <w:t>La propuesta consiste en una aplicación web contenida en Docker, desarrollada con FastAPI para el backend, React con Bun y Vite para el frontend, PostgreSQL como base de datos y un módulo de integración con Gemini para la evaluación asistida por IA. Los servicios se publican en puertos no comunes para reducir conflictos con otros servicios existentes, y el frontend consume la API mediante una ruta relativa que facilita su uso detrás de Nginx Proxy Manager, incluyendo generación asistida de plantillas mediante IA desde requisitos en texto o PDF.</w:t>
+          <w:highlight w:val="yellow"/>
+        </w:rPr>
+        <w:t>eneración asistida de plantillas</w:t>
+      </w:r>
+      <w:r>
+        <w:rPr>
+          <w:rFonts w:ascii="Aptos" w:hAnsi="Aptos"/>
+          <w:sz w:val="21"/>
+          <w:highlight w:val="yellow"/>
+        </w:rPr>
+        <w:t xml:space="preserve"> de establecimiento de criterios</w:t>
+      </w:r>
+      <w:r>
+        <w:rPr>
+          <w:rFonts w:ascii="Aptos" w:hAnsi="Aptos"/>
+          <w:sz w:val="21"/>
+          <w:highlight w:val="yellow"/>
+        </w:rPr>
+        <w:t xml:space="preserve"> mediante IA desde requisitos en texto o PDF</w:t>
+      </w:r>
+      <w:r>
+        <w:rPr>
+          <w:rFonts w:ascii="Aptos" w:hAnsi="Aptos"/>
+          <w:sz w:val="21"/>
+          <w:highlight w:val="yellow"/>
+        </w:rPr>
+        <w:t>, y reportes de evaluación</w:t>
+      </w:r>
+      <w:r>
+        <w:rPr>
+          <w:rFonts w:ascii="Aptos" w:hAnsi="Aptos"/>
+        </w:rPr>
+        <w:t>. La solución permite que el área técnica mantenga control de la plantilla y que Recursos Humanos disponga de una vista consolidada de resultados, sin convertir la IA en una decisión final automática</w:t>
+      </w:r>
+      <w:r>
+        <w:rPr>
+          <w:rFonts w:ascii="Aptos" w:hAnsi="Aptos"/>
+        </w:rPr>
+        <w:t>.</w:t>
       </w:r>
     </w:p>
     <w:p>
       <w:pPr>
-        <w:spacing w:after="120"/>
-        <w:jc w:val="both"/>
-      </w:pPr>
-      <w:r>
-        <w:rPr>
-          <w:rFonts w:ascii="Aptos" w:hAnsi="Aptos"/>
-        </w:rPr>
-        <w:t>La arquitectura favorece despliegue reproducible, separación de responsabilidades, persistencia de información y operación local o institucional. La solución permite que el área técnica mantenga control de la plantilla y que Recursos Humanos disponga de una vista consolidada de resultados, sin convertir la IA en una decisión final automática.</w:t>
-      </w:r>
-    </w:p>
-    <w:p>
-      <w:pPr>
         <w:jc w:val="both"/>
       </w:pPr>
       <w:r>
@@ -3384,9 +3653,8 @@
           <w:rFonts w:ascii="Aptos" w:hAnsi="Aptos"/>
           <w:noProof/>
         </w:rPr>
-        <w:lastRenderedPageBreak/>
         <w:drawing>
-          <wp:inline distT="0" distB="0" distL="0" distR="0" wp14:anchorId="2A1A9929" wp14:editId="5972966E">
+          <wp:inline distT="0" distB="0" distL="0" distR="0" wp14:anchorId="2A1A9929" wp14:editId="6DF00500">
             <wp:extent cx="5608955" cy="3029585"/>
             <wp:effectExtent l="0" t="0" r="0" b="0"/>
             <wp:docPr id="1510123759" name="Imagen 6"/>
@@ -3437,41 +3705,44 @@
     </w:p>
     <w:p>
       <w:pPr>
-        <w:pStyle w:val="Ttulo2"/>
+        <w:pStyle w:val="Heading2"/>
       </w:pPr>
       <w:bookmarkStart w:id="8" w:name="_Toc230878440"/>
       <w:r>
+        <w:lastRenderedPageBreak/>
         <w:t>Funcionalidades</w:t>
       </w:r>
       <w:bookmarkEnd w:id="8"/>
+      <w:r>
+        <w:t xml:space="preserve"> de la Plataforma</w:t>
+      </w:r>
     </w:p>
     <w:tbl>
       <w:tblPr>
-        <w:tblStyle w:val="Tablaconcuadrcula"/>
+        <w:tblStyle w:val="TableGrid"/>
         <w:tblW w:w="0" w:type="auto"/>
         <w:tblLook w:val="04A0" w:firstRow="1" w:lastRow="0" w:firstColumn="1" w:lastColumn="0" w:noHBand="0" w:noVBand="1"/>
       </w:tblPr>
       <w:tblGrid>
-        <w:gridCol w:w="4392"/>
-        <w:gridCol w:w="4436"/>
+        <w:gridCol w:w="4407"/>
+        <w:gridCol w:w="4421"/>
       </w:tblGrid>
       <w:tr>
         <w:tc>
           <w:tcPr>
             <w:tcW w:w="4929" w:type="dxa"/>
+            <w:shd w:val="clear" w:color="auto" w:fill="DCECEA"/>
             <w:vAlign w:val="center"/>
-            <w:shd w:fill="DCECEA"/>
           </w:tcPr>
           <w:p>
             <w:pPr>
-              <w:spacing w:after="0"/>
+              <w:jc w:val="left"/>
             </w:pPr>
-            <w:r/>
-            <w:r>
-              <w:rPr>
-                <w:rFonts w:ascii="Aptos" w:hAnsi="Aptos"/>
+            <w:r>
+              <w:rPr>
+                <w:rFonts w:ascii="Arial" w:hAnsi="Arial"/>
                 <w:b/>
-                <w:sz w:val="19"/>
+                <w:sz w:val="20"/>
               </w:rPr>
               <w:t>Funcionalidad</w:t>
             </w:r>
@@ -3480,19 +3751,18 @@
         <w:tc>
           <w:tcPr>
             <w:tcW w:w="4929" w:type="dxa"/>
+            <w:shd w:val="clear" w:color="auto" w:fill="DCECEA"/>
             <w:vAlign w:val="center"/>
-            <w:shd w:fill="DCECEA"/>
           </w:tcPr>
           <w:p>
             <w:pPr>
-              <w:spacing w:after="0"/>
+              <w:jc w:val="left"/>
             </w:pPr>
-            <w:r/>
-            <w:r>
-              <w:rPr>
-                <w:rFonts w:ascii="Aptos" w:hAnsi="Aptos"/>
+            <w:r>
+              <w:rPr>
+                <w:rFonts w:ascii="Arial" w:hAnsi="Arial"/>
                 <w:b/>
-                <w:sz w:val="19"/>
+                <w:sz w:val="20"/>
               </w:rPr>
               <w:t>Cómo apoya el proceso</w:t>
             </w:r>
@@ -3502,19 +3772,17 @@
       <w:tr>
         <w:tc>
           <w:tcPr>
-            <w:tcW w:type="dxa" w:w="4392"/>
-            <w:shd w:fill="F4E8DE"/>
+            <w:tcW w:w="4392" w:type="dxa"/>
+            <w:shd w:val="clear" w:color="auto" w:fill="F4E8DE"/>
           </w:tcPr>
           <w:p>
             <w:pPr>
-              <w:spacing w:after="0"/>
+              <w:jc w:val="left"/>
             </w:pPr>
-            <w:r/>
-            <w:r>
-              <w:rPr>
-                <w:rFonts w:ascii="Aptos" w:hAnsi="Aptos"/>
-                <w:b/>
-                <w:sz w:val="19"/>
+            <w:r>
+              <w:rPr>
+                <w:rFonts w:ascii="Arial" w:hAnsi="Arial"/>
+                <w:sz w:val="20"/>
               </w:rPr>
               <w:t>Acceso por usuarios y roles</w:t>
             </w:r>
@@ -3522,18 +3790,16 @@
         </w:tc>
         <w:tc>
           <w:tcPr>
-            <w:tcW w:type="dxa" w:w="4436"/>
+            <w:tcW w:w="4436" w:type="dxa"/>
           </w:tcPr>
           <w:p>
             <w:pPr>
-              <w:spacing w:after="0"/>
+              <w:jc w:val="left"/>
             </w:pPr>
-            <w:r/>
-            <w:r>
-              <w:rPr>
-                <w:rFonts w:ascii="Aptos" w:hAnsi="Aptos"/>
-                <w:b w:val="0"/>
-                <w:sz w:val="19"/>
+            <w:r>
+              <w:rPr>
+                <w:rFonts w:ascii="Arial" w:hAnsi="Arial"/>
+                <w:sz w:val="20"/>
               </w:rPr>
               <w:t>La plataforma permite crear usuarios con nombre, apellido, cargo, área, código de empleado y rol. Cada rol habilita únicamente las acciones que le corresponden, por ejemplo administrar usuarios, crear plantillas, evaluar candidatos o solo consultar resultados.</w:t>
             </w:r>
@@ -3543,19 +3809,17 @@
       <w:tr>
         <w:tc>
           <w:tcPr>
-            <w:tcW w:type="dxa" w:w="4392"/>
-            <w:shd w:fill="F4E8DE"/>
+            <w:tcW w:w="4392" w:type="dxa"/>
+            <w:shd w:val="clear" w:color="auto" w:fill="F4E8DE"/>
           </w:tcPr>
           <w:p>
             <w:pPr>
-              <w:spacing w:after="0"/>
+              <w:jc w:val="left"/>
             </w:pPr>
-            <w:r/>
-            <w:r>
-              <w:rPr>
-                <w:rFonts w:ascii="Aptos" w:hAnsi="Aptos"/>
-                <w:b/>
-                <w:sz w:val="19"/>
+            <w:r>
+              <w:rPr>
+                <w:rFonts w:ascii="Arial" w:hAnsi="Arial"/>
+                <w:sz w:val="20"/>
               </w:rPr>
               <w:t>Roles pensados para el proceso de selección</w:t>
             </w:r>
@@ -3563,18 +3827,16 @@
         </w:tc>
         <w:tc>
           <w:tcPr>
-            <w:tcW w:type="dxa" w:w="4436"/>
+            <w:tcW w:w="4436" w:type="dxa"/>
           </w:tcPr>
           <w:p>
             <w:pPr>
-              <w:spacing w:after="0"/>
+              <w:jc w:val="left"/>
             </w:pPr>
-            <w:r/>
-            <w:r>
-              <w:rPr>
-                <w:rFonts w:ascii="Aptos" w:hAnsi="Aptos"/>
-                <w:b w:val="0"/>
-                <w:sz w:val="19"/>
+            <w:r>
+              <w:rPr>
+                <w:rFonts w:ascii="Arial" w:hAnsi="Arial"/>
+                <w:sz w:val="20"/>
               </w:rPr>
               <w:t>Se contemplan perfiles como Administrador, Gestor de plantillas, Evaluador, Recursos Humanos y Consulta. Esto ayuda a que cada participante intervenga en la parte del proceso que le corresponde, sin exponer funciones innecesarias.</w:t>
             </w:r>
@@ -3584,40 +3846,36 @@
       <w:tr>
         <w:tc>
           <w:tcPr>
-            <w:tcW w:type="dxa" w:w="4392"/>
-            <w:shd w:fill="F4E8DE"/>
+            <w:tcW w:w="4392" w:type="dxa"/>
+            <w:shd w:val="clear" w:color="auto" w:fill="F4E8DE"/>
           </w:tcPr>
           <w:p>
             <w:pPr>
-              <w:spacing w:after="0"/>
+              <w:jc w:val="left"/>
             </w:pPr>
-            <w:r/>
-            <w:r>
-              <w:rPr>
-                <w:rFonts w:ascii="Aptos" w:hAnsi="Aptos"/>
-                <w:b/>
-                <w:sz w:val="19"/>
-              </w:rPr>
-              <w:t>Registro de candidatos ligado al evaluador</w:t>
+            <w:r>
+              <w:rPr>
+                <w:rFonts w:ascii="Arial" w:hAnsi="Arial"/>
+                <w:sz w:val="20"/>
+              </w:rPr>
+              <w:t>Contraseña temporal y administración de usuarios</w:t>
             </w:r>
           </w:p>
         </w:tc>
         <w:tc>
           <w:tcPr>
-            <w:tcW w:type="dxa" w:w="4436"/>
+            <w:tcW w:w="4436" w:type="dxa"/>
           </w:tcPr>
           <w:p>
             <w:pPr>
-              <w:spacing w:after="0"/>
+              <w:jc w:val="left"/>
             </w:pPr>
-            <w:r/>
-            <w:r>
-              <w:rPr>
-                <w:rFonts w:ascii="Aptos" w:hAnsi="Aptos"/>
-                <w:b w:val="0"/>
-                <w:sz w:val="19"/>
-              </w:rPr>
-              <w:t>Al crear un candidato ya no se escribe manualmente el nombre del evaluador. El sistema registra automáticamente la cuenta que inició sesión, fortaleciendo la trazabilidad de quién trabajó cada expediente.</w:t>
+            <w:r>
+              <w:rPr>
+                <w:rFonts w:ascii="Arial" w:hAnsi="Arial"/>
+                <w:sz w:val="20"/>
+              </w:rPr>
+              <w:t>Los usuarios nuevos ingresan con una contraseña temporal y deben cambiarla en su primer acceso. Los administradores pueden editar la información institucional de cada usuario sin modificar su contraseña, y solo restablecerla cuando sea necesario mediante una acción explícita.</w:t>
             </w:r>
           </w:p>
         </w:tc>
@@ -3625,40 +3883,36 @@
       <w:tr>
         <w:tc>
           <w:tcPr>
-            <w:tcW w:type="dxa" w:w="4392"/>
-            <w:shd w:fill="F4E8DE"/>
+            <w:tcW w:w="4392" w:type="dxa"/>
+            <w:shd w:val="clear" w:color="auto" w:fill="F4E8DE"/>
           </w:tcPr>
           <w:p>
             <w:pPr>
-              <w:spacing w:after="0"/>
+              <w:jc w:val="left"/>
             </w:pPr>
-            <w:r/>
-            <w:r>
-              <w:rPr>
-                <w:rFonts w:ascii="Aptos" w:hAnsi="Aptos"/>
-                <w:b/>
-                <w:sz w:val="19"/>
-              </w:rPr>
-              <w:t>Plantillas de evaluación reutilizables</w:t>
+            <w:r>
+              <w:rPr>
+                <w:rFonts w:ascii="Arial" w:hAnsi="Arial"/>
+                <w:sz w:val="20"/>
+              </w:rPr>
+              <w:t>Publicación de posiciones abiertas</w:t>
             </w:r>
           </w:p>
         </w:tc>
         <w:tc>
           <w:tcPr>
-            <w:tcW w:type="dxa" w:w="4436"/>
+            <w:tcW w:w="4436" w:type="dxa"/>
           </w:tcPr>
           <w:p>
             <w:pPr>
-              <w:spacing w:after="0"/>
+              <w:jc w:val="left"/>
             </w:pPr>
-            <w:r/>
-            <w:r>
-              <w:rPr>
-                <w:rFonts w:ascii="Aptos" w:hAnsi="Aptos"/>
-                <w:b w:val="0"/>
-                <w:sz w:val="19"/>
-              </w:rPr>
-              <w:t>Las vacantes pueden evaluarse con plantillas que organizan las competencias en categorías, pesos y criterios. Esto evita depender de hojas sueltas y ayuda a que todos los candidatos sean revisados con la misma estructura.</w:t>
+            <w:r>
+              <w:rPr>
+                <w:rFonts w:ascii="Arial" w:hAnsi="Arial"/>
+                <w:sz w:val="20"/>
+              </w:rPr>
+              <w:t>Desde la plantilla se puede indicar si una posición está abierta o cerrada, y si corresponde a concurso interno o externo. Las posiciones abiertas se muestran en una vista pública para que las personas interesadas puedan conocer los procesos disponibles.</w:t>
             </w:r>
           </w:p>
         </w:tc>
@@ -3666,40 +3920,36 @@
       <w:tr>
         <w:tc>
           <w:tcPr>
-            <w:tcW w:type="dxa" w:w="4392"/>
-            <w:shd w:fill="F4E8DE"/>
+            <w:tcW w:w="4392" w:type="dxa"/>
+            <w:shd w:val="clear" w:color="auto" w:fill="F4E8DE"/>
           </w:tcPr>
           <w:p>
             <w:pPr>
-              <w:spacing w:after="0"/>
+              <w:jc w:val="left"/>
             </w:pPr>
-            <w:r/>
-            <w:r>
-              <w:rPr>
-                <w:rFonts w:ascii="Aptos" w:hAnsi="Aptos"/>
-                <w:b/>
-                <w:sz w:val="19"/>
-              </w:rPr>
-              <w:t>Creación de plantillas desde cero o con apoyo de IA</w:t>
+            <w:r>
+              <w:rPr>
+                <w:rFonts w:ascii="Arial" w:hAnsi="Arial"/>
+                <w:sz w:val="20"/>
+              </w:rPr>
+              <w:t>Postulación en línea de participantes</w:t>
             </w:r>
           </w:p>
         </w:tc>
         <w:tc>
           <w:tcPr>
-            <w:tcW w:type="dxa" w:w="4436"/>
+            <w:tcW w:w="4436" w:type="dxa"/>
           </w:tcPr>
           <w:p>
             <w:pPr>
-              <w:spacing w:after="0"/>
+              <w:jc w:val="left"/>
             </w:pPr>
-            <w:r/>
-            <w:r>
-              <w:rPr>
-                <w:rFonts w:ascii="Aptos" w:hAnsi="Aptos"/>
-                <w:b w:val="0"/>
-                <w:sz w:val="19"/>
-              </w:rPr>
-              <w:t>Al crear una plantilla se puede comenzar manualmente o pedir a la IA que genere un borrador a partir de un PDF o de requisitos escritos. Ese borrador siempre debe revisarse antes de guardarse y aplicarse a candidatos.</w:t>
+            <w:r>
+              <w:rPr>
+                <w:rFonts w:ascii="Arial" w:hAnsi="Arial"/>
+                <w:sz w:val="20"/>
+              </w:rPr>
+              <w:t>Los aspirantes pueden aplicar directamente desde la página pública, completando sus datos personales y cargando los documentos de soporte. Esto reduce el trabajo manual de crear candidatos y cargar expedientes uno por uno.</w:t>
             </w:r>
           </w:p>
         </w:tc>
@@ -3707,40 +3957,36 @@
       <w:tr>
         <w:tc>
           <w:tcPr>
-            <w:tcW w:type="dxa" w:w="4392"/>
-            <w:shd w:fill="F4E8DE"/>
+            <w:tcW w:w="4392" w:type="dxa"/>
+            <w:shd w:val="clear" w:color="auto" w:fill="F4E8DE"/>
           </w:tcPr>
           <w:p>
             <w:pPr>
-              <w:spacing w:after="0"/>
+              <w:jc w:val="left"/>
             </w:pPr>
-            <w:r/>
-            <w:r>
-              <w:rPr>
-                <w:rFonts w:ascii="Aptos" w:hAnsi="Aptos"/>
-                <w:b/>
-                <w:sz w:val="19"/>
-              </w:rPr>
-              <w:t>Criterios manuales y criterios asistidos por IA</w:t>
+            <w:r>
+              <w:rPr>
+                <w:rFonts w:ascii="Arial" w:hAnsi="Arial"/>
+                <w:sz w:val="20"/>
+              </w:rPr>
+              <w:t>Control básico para concursos internos</w:t>
             </w:r>
           </w:p>
         </w:tc>
         <w:tc>
           <w:tcPr>
-            <w:tcW w:type="dxa" w:w="4436"/>
+            <w:tcW w:w="4436" w:type="dxa"/>
           </w:tcPr>
           <w:p>
             <w:pPr>
-              <w:spacing w:after="0"/>
+              <w:jc w:val="left"/>
             </w:pPr>
-            <w:r/>
-            <w:r>
-              <w:rPr>
-                <w:rFonts w:ascii="Aptos" w:hAnsi="Aptos"/>
-                <w:b w:val="0"/>
-                <w:sz w:val="19"/>
-              </w:rPr>
-              <w:t>Cada criterio puede configurarse para revisión manual o para apoyo de IA. Los criterios manuales quedan para entrevista, examen temático o juicio experto; los criterios asistidos por IA se basan en la evidencia documental cargada.</w:t>
+            <w:r>
+              <w:rPr>
+                <w:rFonts w:ascii="Arial" w:hAnsi="Arial"/>
+                <w:sz w:val="20"/>
+              </w:rPr>
+              <w:t>Cuando una posición se marca como concurso interno, el formulario solicita correo institucional y código de empleado. Por el momento, mientras no se configure un servicio de correo, la validación se limita a exigir que el correo pertenezca al dominio sie.gov.do.</w:t>
             </w:r>
           </w:p>
         </w:tc>
@@ -3748,40 +3994,36 @@
       <w:tr>
         <w:tc>
           <w:tcPr>
-            <w:tcW w:type="dxa" w:w="4392"/>
-            <w:shd w:fill="F4E8DE"/>
+            <w:tcW w:w="4392" w:type="dxa"/>
+            <w:shd w:val="clear" w:color="auto" w:fill="F4E8DE"/>
           </w:tcPr>
           <w:p>
             <w:pPr>
-              <w:spacing w:after="0"/>
+              <w:jc w:val="left"/>
             </w:pPr>
-            <w:r/>
-            <w:r>
-              <w:rPr>
-                <w:rFonts w:ascii="Aptos" w:hAnsi="Aptos"/>
-                <w:b/>
-                <w:sz w:val="19"/>
-              </w:rPr>
-              <w:t>Criterios críticos de cumplimiento obligatorio</w:t>
+            <w:r>
+              <w:rPr>
+                <w:rFonts w:ascii="Arial" w:hAnsi="Arial"/>
+                <w:sz w:val="20"/>
+              </w:rPr>
+              <w:t>Registro automático del expediente recibido</w:t>
             </w:r>
           </w:p>
         </w:tc>
         <w:tc>
           <w:tcPr>
-            <w:tcW w:type="dxa" w:w="4436"/>
+            <w:tcW w:w="4436" w:type="dxa"/>
           </w:tcPr>
           <w:p>
             <w:pPr>
-              <w:spacing w:after="0"/>
+              <w:jc w:val="left"/>
             </w:pPr>
-            <w:r/>
-            <w:r>
-              <w:rPr>
-                <w:rFonts w:ascii="Aptos" w:hAnsi="Aptos"/>
-                <w:b w:val="0"/>
-                <w:sz w:val="19"/>
-              </w:rPr>
-              <w:t>Algunos requisitos pueden marcarse como críticos, por ejemplo una formación profesional indispensable. Si el candidato no cumple ese requisito, el resultado general queda en cero, aun cuando tenga buenos puntajes en otros aspectos.</w:t>
+            <w:r>
+              <w:rPr>
+                <w:rFonts w:ascii="Arial" w:hAnsi="Arial"/>
+                <w:sz w:val="20"/>
+              </w:rPr>
+              <w:t>Cada postulación enviada desde la página pública crea automáticamente un candidato asociado a la posición correspondiente, con sus datos de contacto y documentos disponibles para revisión por los evaluadores.</w:t>
             </w:r>
           </w:p>
         </w:tc>
@@ -3789,40 +4031,36 @@
       <w:tr>
         <w:tc>
           <w:tcPr>
-            <w:tcW w:type="dxa" w:w="4392"/>
-            <w:shd w:fill="F4E8DE"/>
+            <w:tcW w:w="4392" w:type="dxa"/>
+            <w:shd w:val="clear" w:color="auto" w:fill="F4E8DE"/>
           </w:tcPr>
           <w:p>
             <w:pPr>
-              <w:spacing w:after="0"/>
+              <w:jc w:val="left"/>
             </w:pPr>
-            <w:r/>
-            <w:r>
-              <w:rPr>
-                <w:rFonts w:ascii="Aptos" w:hAnsi="Aptos"/>
-                <w:b/>
-                <w:sz w:val="19"/>
-              </w:rPr>
-              <w:t>Expediente digital por candidato</w:t>
+            <w:r>
+              <w:rPr>
+                <w:rFonts w:ascii="Arial" w:hAnsi="Arial"/>
+                <w:sz w:val="20"/>
+              </w:rPr>
+              <w:t>Registro de candidatos ligado al evaluador</w:t>
             </w:r>
           </w:p>
         </w:tc>
         <w:tc>
           <w:tcPr>
-            <w:tcW w:type="dxa" w:w="4436"/>
+            <w:tcW w:w="4436" w:type="dxa"/>
           </w:tcPr>
           <w:p>
             <w:pPr>
-              <w:spacing w:after="0"/>
+              <w:jc w:val="left"/>
             </w:pPr>
-            <w:r/>
-            <w:r>
-              <w:rPr>
-                <w:rFonts w:ascii="Aptos" w:hAnsi="Aptos"/>
-                <w:b w:val="0"/>
-                <w:sz w:val="19"/>
-              </w:rPr>
-              <w:t>Cada candidato puede tener sus documentos en PDF o imagen dentro de la plataforma. Los documentos pueden abrirse para consulta, eliminarse si fueron cargados por error y asociarse a los criterios que sustentan la evaluación.</w:t>
+            <w:r>
+              <w:rPr>
+                <w:rFonts w:ascii="Arial" w:hAnsi="Arial"/>
+                <w:sz w:val="20"/>
+              </w:rPr>
+              <w:t>Cuando un candidato se crea desde el panel interno, ya no se escribe manualmente el nombre del evaluador. El sistema registra automáticamente la cuenta que inició sesión, fortaleciendo la trazabilidad de quién trabajó cada expediente.</w:t>
             </w:r>
           </w:p>
         </w:tc>
@@ -3830,40 +4068,36 @@
       <w:tr>
         <w:tc>
           <w:tcPr>
-            <w:tcW w:type="dxa" w:w="4392"/>
-            <w:shd w:fill="F4E8DE"/>
+            <w:tcW w:w="4392" w:type="dxa"/>
+            <w:shd w:val="clear" w:color="auto" w:fill="F4E8DE"/>
           </w:tcPr>
           <w:p>
             <w:pPr>
-              <w:spacing w:after="0"/>
+              <w:jc w:val="left"/>
             </w:pPr>
-            <w:r/>
-            <w:r>
-              <w:rPr>
-                <w:rFonts w:ascii="Aptos" w:hAnsi="Aptos"/>
-                <w:b/>
-                <w:sz w:val="19"/>
-              </w:rPr>
-              <w:t>Evidencia vinculada a cada criterio</w:t>
+            <w:r>
+              <w:rPr>
+                <w:rFonts w:ascii="Arial" w:hAnsi="Arial"/>
+                <w:sz w:val="20"/>
+              </w:rPr>
+              <w:t>Plantillas de evaluación reutilizables</w:t>
             </w:r>
           </w:p>
         </w:tc>
         <w:tc>
           <w:tcPr>
-            <w:tcW w:type="dxa" w:w="4436"/>
+            <w:tcW w:w="4436" w:type="dxa"/>
           </w:tcPr>
           <w:p>
             <w:pPr>
-              <w:spacing w:after="0"/>
+              <w:jc w:val="left"/>
             </w:pPr>
-            <w:r/>
-            <w:r>
-              <w:rPr>
-                <w:rFonts w:ascii="Aptos" w:hAnsi="Aptos"/>
-                <w:b w:val="0"/>
-                <w:sz w:val="19"/>
-              </w:rPr>
-              <w:t>La evaluación permite indicar qué documentos respaldan cada puntuación. Cuando interviene la IA, también se guarda cuáles documentos utilizó como referencia, facilitando la revisión posterior.</w:t>
+            <w:r>
+              <w:rPr>
+                <w:rFonts w:ascii="Arial" w:hAnsi="Arial"/>
+                <w:sz w:val="20"/>
+              </w:rPr>
+              <w:t>Las vacantes pueden evaluarse con plantillas que organizan las competencias en categorías, pesos y criterios. Esto evita depender de hojas sueltas y ayuda a que todos los candidatos sean revisados con la misma estructura.</w:t>
             </w:r>
           </w:p>
         </w:tc>
@@ -3871,40 +4105,36 @@
       <w:tr>
         <w:tc>
           <w:tcPr>
-            <w:tcW w:type="dxa" w:w="4392"/>
-            <w:shd w:fill="F4E8DE"/>
+            <w:tcW w:w="4392" w:type="dxa"/>
+            <w:shd w:val="clear" w:color="auto" w:fill="F4E8DE"/>
           </w:tcPr>
           <w:p>
             <w:pPr>
-              <w:spacing w:after="0"/>
+              <w:jc w:val="left"/>
             </w:pPr>
-            <w:r/>
-            <w:r>
-              <w:rPr>
-                <w:rFonts w:ascii="Aptos" w:hAnsi="Aptos"/>
-                <w:b/>
-                <w:sz w:val="19"/>
-              </w:rPr>
-              <w:t>Evaluación automática como apoyo, no como decisión final</w:t>
+            <w:r>
+              <w:rPr>
+                <w:rFonts w:ascii="Arial" w:hAnsi="Arial"/>
+                <w:sz w:val="20"/>
+              </w:rPr>
+              <w:t>Edición flexible de categorías, pesos y criterios</w:t>
             </w:r>
           </w:p>
         </w:tc>
         <w:tc>
           <w:tcPr>
-            <w:tcW w:type="dxa" w:w="4436"/>
+            <w:tcW w:w="4436" w:type="dxa"/>
           </w:tcPr>
           <w:p>
             <w:pPr>
-              <w:spacing w:after="0"/>
+              <w:jc w:val="left"/>
             </w:pPr>
-            <w:r/>
-            <w:r>
-              <w:rPr>
-                <w:rFonts w:ascii="Aptos" w:hAnsi="Aptos"/>
-                <w:b w:val="0"/>
-                <w:sz w:val="19"/>
-              </w:rPr>
-              <w:t>La integración con Gemini permite sugerir puntuaciones y comentarios a partir del expediente. La herramienta agiliza la lectura documental, pero la decisión y validación final permanecen en manos del equipo humano responsable.</w:t>
+            <w:r>
+              <w:rPr>
+                <w:rFonts w:ascii="Arial" w:hAnsi="Arial"/>
+                <w:sz w:val="20"/>
+              </w:rPr>
+              <w:t>El editor permite definir las categorías de la plantilla, asignar sus pesos en porcentaje y crear criterios dentro de cada categoría. Los controles ayudan a no exceder el 100% y muestran si falta o sobra peso por distribuir.</w:t>
             </w:r>
           </w:p>
         </w:tc>
@@ -3912,40 +4142,36 @@
       <w:tr>
         <w:tc>
           <w:tcPr>
-            <w:tcW w:type="dxa" w:w="4392"/>
-            <w:shd w:fill="F4E8DE"/>
+            <w:tcW w:w="4392" w:type="dxa"/>
+            <w:shd w:val="clear" w:color="auto" w:fill="F4E8DE"/>
           </w:tcPr>
           <w:p>
             <w:pPr>
-              <w:spacing w:after="0"/>
+              <w:jc w:val="left"/>
             </w:pPr>
-            <w:r/>
-            <w:r>
-              <w:rPr>
-                <w:rFonts w:ascii="Aptos" w:hAnsi="Aptos"/>
-                <w:b/>
-                <w:sz w:val="19"/>
-              </w:rPr>
-              <w:t>Nota complementaria del evaluador</w:t>
+            <w:r>
+              <w:rPr>
+                <w:rFonts w:ascii="Arial" w:hAnsi="Arial"/>
+                <w:sz w:val="20"/>
+              </w:rPr>
+              <w:t>Criterios críticos sin ponderación</w:t>
             </w:r>
           </w:p>
         </w:tc>
         <w:tc>
           <w:tcPr>
-            <w:tcW w:type="dxa" w:w="4436"/>
+            <w:tcW w:w="4436" w:type="dxa"/>
           </w:tcPr>
           <w:p>
             <w:pPr>
-              <w:spacing w:after="0"/>
+              <w:jc w:val="left"/>
             </w:pPr>
-            <w:r/>
-            <w:r>
-              <w:rPr>
-                <w:rFonts w:ascii="Aptos" w:hAnsi="Aptos"/>
-                <w:b w:val="0"/>
-                <w:sz w:val="19"/>
-              </w:rPr>
-              <w:t>En los criterios asistidos por IA existe un espacio para que el evaluador humano complete o precise la explicación cuando el comentario automático resulte incompleto o requiera contexto institucional adicional.</w:t>
+            <w:r>
+              <w:rPr>
+                <w:rFonts w:ascii="Arial" w:hAnsi="Arial"/>
+                <w:sz w:val="20"/>
+              </w:rPr>
+              <w:t>Algunos requisitos pueden marcarse como críticos, por ejemplo una formación profesional indispensable. Estos criterios se evalúan como cumple o no cumple, no consumen peso de la categoría y, si no se cumplen, el resultado general queda en cero.</w:t>
             </w:r>
           </w:p>
         </w:tc>
@@ -3953,40 +4179,36 @@
       <w:tr>
         <w:tc>
           <w:tcPr>
-            <w:tcW w:type="dxa" w:w="4392"/>
-            <w:shd w:fill="F4E8DE"/>
+            <w:tcW w:w="4392" w:type="dxa"/>
+            <w:shd w:val="clear" w:color="auto" w:fill="F4E8DE"/>
           </w:tcPr>
           <w:p>
             <w:pPr>
-              <w:spacing w:after="0"/>
+              <w:jc w:val="left"/>
             </w:pPr>
-            <w:r/>
-            <w:r>
-              <w:rPr>
-                <w:rFonts w:ascii="Aptos" w:hAnsi="Aptos"/>
-                <w:b/>
-                <w:sz w:val="19"/>
-              </w:rPr>
-              <w:t>Reevaluación puntual de criterios</w:t>
+            <w:r>
+              <w:rPr>
+                <w:rFonts w:ascii="Arial" w:hAnsi="Arial"/>
+                <w:sz w:val="20"/>
+              </w:rPr>
+              <w:t>Creación de plantillas desde cero o con apoyo de IA</w:t>
             </w:r>
           </w:p>
         </w:tc>
         <w:tc>
           <w:tcPr>
-            <w:tcW w:type="dxa" w:w="4436"/>
+            <w:tcW w:w="4436" w:type="dxa"/>
           </w:tcPr>
           <w:p>
             <w:pPr>
-              <w:spacing w:after="0"/>
+              <w:jc w:val="left"/>
             </w:pPr>
-            <w:r/>
-            <w:r>
-              <w:rPr>
-                <w:rFonts w:ascii="Aptos" w:hAnsi="Aptos"/>
-                <w:b w:val="0"/>
-                <w:sz w:val="19"/>
-              </w:rPr>
-              <w:t>Si se ajusta un criterio asistido por IA o se necesita revisar un punto específico, puede reevaluarse solo ese criterio sin repetir toda la evaluación del candidato.</w:t>
+            <w:r>
+              <w:rPr>
+                <w:rFonts w:ascii="Arial" w:hAnsi="Arial"/>
+                <w:sz w:val="20"/>
+              </w:rPr>
+              <w:t>Al crear una plantilla se puede comenzar manualmente o pedir a la IA que genere un borrador a partir de un PDF o de requisitos escritos. Ese borrador siempre debe revisarse antes de guardarse y aplicarse a candidatos.</w:t>
             </w:r>
           </w:p>
         </w:tc>
@@ -3994,40 +4216,36 @@
       <w:tr>
         <w:tc>
           <w:tcPr>
-            <w:tcW w:type="dxa" w:w="4392"/>
-            <w:shd w:fill="F4E8DE"/>
+            <w:tcW w:w="4392" w:type="dxa"/>
+            <w:shd w:val="clear" w:color="auto" w:fill="F4E8DE"/>
           </w:tcPr>
           <w:p>
             <w:pPr>
-              <w:spacing w:after="0"/>
+              <w:jc w:val="left"/>
             </w:pPr>
-            <w:r/>
-            <w:r>
-              <w:rPr>
-                <w:rFonts w:ascii="Aptos" w:hAnsi="Aptos"/>
-                <w:b/>
-                <w:sz w:val="19"/>
-              </w:rPr>
-              <w:t>Guardado automático de la evaluación</w:t>
+            <w:r>
+              <w:rPr>
+                <w:rFonts w:ascii="Arial" w:hAnsi="Arial"/>
+                <w:sz w:val="20"/>
+              </w:rPr>
+              <w:t>Archivo o eliminación de plantillas</w:t>
             </w:r>
           </w:p>
         </w:tc>
         <w:tc>
           <w:tcPr>
-            <w:tcW w:type="dxa" w:w="4436"/>
+            <w:tcW w:w="4436" w:type="dxa"/>
           </w:tcPr>
           <w:p>
             <w:pPr>
-              <w:spacing w:after="0"/>
+              <w:jc w:val="left"/>
             </w:pPr>
-            <w:r/>
-            <w:r>
-              <w:rPr>
-                <w:rFonts w:ascii="Aptos" w:hAnsi="Aptos"/>
-                <w:b w:val="0"/>
-                <w:sz w:val="19"/>
-              </w:rPr>
-              <w:t>Las puntuaciones, comentarios, notas complementarias y referencias documentales se guardan automáticamente, reduciendo el riesgo de pérdida de información durante el trabajo.</w:t>
+            <w:r>
+              <w:rPr>
+                <w:rFonts w:ascii="Arial" w:hAnsi="Arial"/>
+                <w:sz w:val="20"/>
+              </w:rPr>
+              <w:t>Las plantillas pueden eliminarse cuando no tienen candidatos asociados. Si ya fueron usadas en evaluaciones, se archivan para preservar el historial y evitar pérdida de información.</w:t>
             </w:r>
           </w:p>
         </w:tc>
@@ -4035,40 +4253,36 @@
       <w:tr>
         <w:tc>
           <w:tcPr>
-            <w:tcW w:type="dxa" w:w="4392"/>
-            <w:shd w:fill="F4E8DE"/>
+            <w:tcW w:w="4392" w:type="dxa"/>
+            <w:shd w:val="clear" w:color="auto" w:fill="F4E8DE"/>
           </w:tcPr>
           <w:p>
             <w:pPr>
-              <w:spacing w:after="0"/>
+              <w:jc w:val="left"/>
             </w:pPr>
-            <w:r/>
-            <w:r>
-              <w:rPr>
-                <w:rFonts w:ascii="Aptos" w:hAnsi="Aptos"/>
-                <w:b/>
-                <w:sz w:val="19"/>
-              </w:rPr>
-              <w:t>Protección de evaluaciones ya realizadas</w:t>
+            <w:r>
+              <w:rPr>
+                <w:rFonts w:ascii="Arial" w:hAnsi="Arial"/>
+                <w:sz w:val="20"/>
+              </w:rPr>
+              <w:t>Criterios manuales y criterios asistidos por IA</w:t>
             </w:r>
           </w:p>
         </w:tc>
         <w:tc>
           <w:tcPr>
-            <w:tcW w:type="dxa" w:w="4436"/>
+            <w:tcW w:w="4436" w:type="dxa"/>
           </w:tcPr>
           <w:p>
             <w:pPr>
-              <w:spacing w:after="0"/>
+              <w:jc w:val="left"/>
             </w:pPr>
-            <w:r/>
-            <w:r>
-              <w:rPr>
-                <w:rFonts w:ascii="Aptos" w:hAnsi="Aptos"/>
-                <w:b w:val="0"/>
-                <w:sz w:val="19"/>
-              </w:rPr>
-              <w:t>Si se modifica una plantilla, el sistema evita borrar todo el trabajo previo. Solo se invalida la evaluación vinculada al criterio que cambió, cuando corresponde.</w:t>
+            <w:r>
+              <w:rPr>
+                <w:rFonts w:ascii="Arial" w:hAnsi="Arial"/>
+                <w:sz w:val="20"/>
+              </w:rPr>
+              <w:t>Cada criterio puede configurarse para revisión manual o para apoyo de IA. Los criterios manuales quedan para entrevista, examen temático o juicio experto; los criterios asistidos por IA se basan en la evidencia documental cargada.</w:t>
             </w:r>
           </w:p>
         </w:tc>
@@ -4076,40 +4290,36 @@
       <w:tr>
         <w:tc>
           <w:tcPr>
-            <w:tcW w:type="dxa" w:w="4392"/>
-            <w:shd w:fill="F4E8DE"/>
+            <w:tcW w:w="4392" w:type="dxa"/>
+            <w:shd w:val="clear" w:color="auto" w:fill="F4E8DE"/>
           </w:tcPr>
           <w:p>
             <w:pPr>
-              <w:spacing w:after="0"/>
+              <w:jc w:val="left"/>
             </w:pPr>
-            <w:r/>
-            <w:r>
-              <w:rPr>
-                <w:rFonts w:ascii="Aptos" w:hAnsi="Aptos"/>
-                <w:b/>
-                <w:sz w:val="19"/>
-              </w:rPr>
-              <w:t>Resultados comparativos por plantilla</w:t>
+            <w:r>
+              <w:rPr>
+                <w:rFonts w:ascii="Arial" w:hAnsi="Arial"/>
+                <w:sz w:val="20"/>
+              </w:rPr>
+              <w:t>Expediente digital por candidato</w:t>
             </w:r>
           </w:p>
         </w:tc>
         <w:tc>
           <w:tcPr>
-            <w:tcW w:type="dxa" w:w="4436"/>
+            <w:tcW w:w="4436" w:type="dxa"/>
           </w:tcPr>
           <w:p>
             <w:pPr>
-              <w:spacing w:after="0"/>
+              <w:jc w:val="left"/>
             </w:pPr>
-            <w:r/>
-            <w:r>
-              <w:rPr>
-                <w:rFonts w:ascii="Aptos" w:hAnsi="Aptos"/>
-                <w:b w:val="0"/>
-                <w:sz w:val="19"/>
-              </w:rPr>
-              <w:t>Las gráficas y rankings se muestran de acuerdo con la plantilla seleccionada. Esto permite comparar candidatos de una misma vacante sin mezclar resultados de procesos distintos.</w:t>
+            <w:r>
+              <w:rPr>
+                <w:rFonts w:ascii="Arial" w:hAnsi="Arial"/>
+                <w:sz w:val="20"/>
+              </w:rPr>
+              <w:t>Cada candidato puede tener sus documentos en PDF o imagen dentro de la plataforma. Los documentos pueden abrirse para consulta, eliminarse si fueron cargados por error y asociarse a los criterios que sustentan la evaluación.</w:t>
             </w:r>
           </w:p>
         </w:tc>
@@ -4117,40 +4327,36 @@
       <w:tr>
         <w:tc>
           <w:tcPr>
-            <w:tcW w:type="dxa" w:w="4392"/>
-            <w:shd w:fill="F4E8DE"/>
+            <w:tcW w:w="4392" w:type="dxa"/>
+            <w:shd w:val="clear" w:color="auto" w:fill="F4E8DE"/>
           </w:tcPr>
           <w:p>
             <w:pPr>
-              <w:spacing w:after="0"/>
+              <w:jc w:val="left"/>
             </w:pPr>
-            <w:r/>
-            <w:r>
-              <w:rPr>
-                <w:rFonts w:ascii="Aptos" w:hAnsi="Aptos"/>
-                <w:b/>
-                <w:sz w:val="19"/>
-              </w:rPr>
-              <w:t>Visualizaciones para apoyar la decisión</w:t>
+            <w:r>
+              <w:rPr>
+                <w:rFonts w:ascii="Arial" w:hAnsi="Arial"/>
+                <w:sz w:val="20"/>
+              </w:rPr>
+              <w:t>Validación de tamaño de documentos</w:t>
             </w:r>
           </w:p>
         </w:tc>
         <w:tc>
           <w:tcPr>
-            <w:tcW w:type="dxa" w:w="4436"/>
+            <w:tcW w:w="4436" w:type="dxa"/>
           </w:tcPr>
           <w:p>
             <w:pPr>
-              <w:spacing w:after="0"/>
+              <w:jc w:val="left"/>
             </w:pPr>
-            <w:r/>
-            <w:r>
-              <w:rPr>
-                <w:rFonts w:ascii="Aptos" w:hAnsi="Aptos"/>
-                <w:b w:val="0"/>
-                <w:sz w:val="19"/>
-              </w:rPr>
-              <w:t>La plataforma presenta ranking global, comparación compacta y gráficos por categoría. Estas vistas ayudan a Recursos Humanos y al área técnica a identificar fortalezas, brechas y diferencias entre aspirantes.</w:t>
+            <w:r>
+              <w:rPr>
+                <w:rFonts w:ascii="Arial" w:hAnsi="Arial"/>
+                <w:sz w:val="20"/>
+              </w:rPr>
+              <w:t>En la postulación pública, la plataforma calcula el tamaño total de los archivos seleccionados y advierte al participante si excede el máximo permitido, evitando que intente enviar documentos que serían rechazados por el servidor.</w:t>
             </w:r>
           </w:p>
         </w:tc>
@@ -4158,38 +4364,574 @@
       <w:tr>
         <w:tc>
           <w:tcPr>
-            <w:tcW w:type="dxa" w:w="4392"/>
-            <w:shd w:fill="F4E8DE"/>
+            <w:tcW w:w="4392" w:type="dxa"/>
+            <w:shd w:val="clear" w:color="auto" w:fill="F4E8DE"/>
           </w:tcPr>
           <w:p>
             <w:pPr>
-              <w:spacing w:after="0"/>
+              <w:jc w:val="left"/>
             </w:pPr>
-            <w:r/>
-            <w:r>
-              <w:rPr>
-                <w:rFonts w:ascii="Aptos" w:hAnsi="Aptos"/>
-                <w:b/>
-                <w:sz w:val="19"/>
-              </w:rPr>
-              <w:t>Respaldo de la información</w:t>
+            <w:r>
+              <w:rPr>
+                <w:rFonts w:ascii="Arial" w:hAnsi="Arial"/>
+                <w:sz w:val="20"/>
+              </w:rPr>
+              <w:t>Evidencia vinculada a cada criterio</w:t>
             </w:r>
           </w:p>
         </w:tc>
         <w:tc>
           <w:tcPr>
-            <w:tcW w:type="dxa" w:w="4436"/>
+            <w:tcW w:w="4436" w:type="dxa"/>
           </w:tcPr>
           <w:p>
             <w:pPr>
-              <w:spacing w:after="0"/>
+              <w:jc w:val="left"/>
             </w:pPr>
-            <w:r/>
-            <w:r>
-              <w:rPr>
-                <w:rFonts w:ascii="Aptos" w:hAnsi="Aptos"/>
-                <w:b w:val="0"/>
-                <w:sz w:val="19"/>
+            <w:r>
+              <w:rPr>
+                <w:rFonts w:ascii="Arial" w:hAnsi="Arial"/>
+                <w:sz w:val="20"/>
+              </w:rPr>
+              <w:t>La evaluación permite indicar qué documentos respaldan cada puntuación. Cuando interviene la IA, también se guarda cuáles documentos utilizó como referencia, facilitando la revisión posterior.</w:t>
+            </w:r>
+          </w:p>
+        </w:tc>
+      </w:tr>
+      <w:tr>
+        <w:tc>
+          <w:tcPr>
+            <w:tcW w:type="dxa" w:w="4407"/>
+          </w:tcPr>
+          <w:p>
+            <w:pPr>
+              <w:jc w:val="left"/>
+            </w:pPr>
+            <w:r>
+              <w:rPr>
+                <w:rFonts w:ascii="Arial" w:hAnsi="Arial"/>
+                <w:sz w:val="20"/>
+              </w:rPr>
+              <w:t>Evaluación automática como apoyo, no como decisión final</w:t>
+            </w:r>
+          </w:p>
+        </w:tc>
+        <w:tc>
+          <w:tcPr>
+            <w:tcW w:type="dxa" w:w="4421"/>
+          </w:tcPr>
+          <w:p>
+            <w:pPr>
+              <w:jc w:val="left"/>
+            </w:pPr>
+            <w:r>
+              <w:rPr>
+                <w:rFonts w:ascii="Arial" w:hAnsi="Arial"/>
+                <w:sz w:val="20"/>
+              </w:rPr>
+              <w:t>La integración con Gemini permite sugerir puntuaciones y comentarios a partir del expediente. La herramienta agiliza la lectura documental, pero la decisión y validación final permanecen en manos del equipo humano responsable.</w:t>
+            </w:r>
+          </w:p>
+        </w:tc>
+      </w:tr>
+      <w:tr>
+        <w:tc>
+          <w:tcPr>
+            <w:tcW w:type="dxa" w:w="4407"/>
+          </w:tcPr>
+          <w:p>
+            <w:pPr>
+              <w:jc w:val="left"/>
+            </w:pPr>
+            <w:r>
+              <w:rPr>
+                <w:rFonts w:ascii="Arial" w:hAnsi="Arial"/>
+                <w:sz w:val="20"/>
+              </w:rPr>
+              <w:t>Uso de notas de plantilla para orientar la IA</w:t>
+            </w:r>
+          </w:p>
+        </w:tc>
+        <w:tc>
+          <w:tcPr>
+            <w:tcW w:type="dxa" w:w="4421"/>
+          </w:tcPr>
+          <w:p>
+            <w:pPr>
+              <w:jc w:val="left"/>
+            </w:pPr>
+            <w:r>
+              <w:rPr>
+                <w:rFonts w:ascii="Arial" w:hAnsi="Arial"/>
+                <w:sz w:val="20"/>
+              </w:rPr>
+              <w:t>Las notas o evidencias esperadas definidas en cada criterio sirven como instrucciones para que la IA evalúe con mayor precisión y se ajuste al enfoque definido por el área técnica.</w:t>
+            </w:r>
+          </w:p>
+        </w:tc>
+      </w:tr>
+      <w:tr>
+        <w:tc>
+          <w:tcPr>
+            <w:tcW w:type="dxa" w:w="4407"/>
+          </w:tcPr>
+          <w:p>
+            <w:pPr>
+              <w:jc w:val="left"/>
+            </w:pPr>
+            <w:r>
+              <w:rPr>
+                <w:rFonts w:ascii="Arial" w:hAnsi="Arial"/>
+                <w:sz w:val="20"/>
+              </w:rPr>
+              <w:t>Nota complementaria del evaluador</w:t>
+            </w:r>
+          </w:p>
+        </w:tc>
+        <w:tc>
+          <w:tcPr>
+            <w:tcW w:type="dxa" w:w="4421"/>
+          </w:tcPr>
+          <w:p>
+            <w:pPr>
+              <w:jc w:val="left"/>
+            </w:pPr>
+            <w:r>
+              <w:rPr>
+                <w:rFonts w:ascii="Arial" w:hAnsi="Arial"/>
+                <w:sz w:val="20"/>
+              </w:rPr>
+              <w:t>En los criterios asistidos por IA existe un espacio para que el evaluador humano complete o precise la explicación cuando el comentario automático resulte incompleto o requiera contexto institucional adicional.</w:t>
+            </w:r>
+          </w:p>
+        </w:tc>
+      </w:tr>
+      <w:tr>
+        <w:tc>
+          <w:tcPr>
+            <w:tcW w:type="dxa" w:w="4407"/>
+          </w:tcPr>
+          <w:p>
+            <w:pPr>
+              <w:jc w:val="left"/>
+            </w:pPr>
+            <w:r>
+              <w:rPr>
+                <w:rFonts w:ascii="Arial" w:hAnsi="Arial"/>
+                <w:sz w:val="20"/>
+              </w:rPr>
+              <w:t>Reevaluación puntual de criterios</w:t>
+            </w:r>
+          </w:p>
+        </w:tc>
+        <w:tc>
+          <w:tcPr>
+            <w:tcW w:type="dxa" w:w="4421"/>
+          </w:tcPr>
+          <w:p>
+            <w:pPr>
+              <w:jc w:val="left"/>
+            </w:pPr>
+            <w:r>
+              <w:rPr>
+                <w:rFonts w:ascii="Arial" w:hAnsi="Arial"/>
+                <w:sz w:val="20"/>
+              </w:rPr>
+              <w:t>Si se ajusta un criterio asistido por IA o se necesita revisar un punto específico, puede reevaluarse solo ese criterio sin repetir toda la evaluación del candidato.</w:t>
+            </w:r>
+          </w:p>
+        </w:tc>
+      </w:tr>
+      <w:tr>
+        <w:tc>
+          <w:tcPr>
+            <w:tcW w:type="dxa" w:w="4407"/>
+          </w:tcPr>
+          <w:p>
+            <w:pPr>
+              <w:jc w:val="left"/>
+            </w:pPr>
+            <w:r>
+              <w:rPr>
+                <w:rFonts w:ascii="Arial" w:hAnsi="Arial"/>
+                <w:sz w:val="20"/>
+              </w:rPr>
+              <w:t>Guardado automático de la evaluación</w:t>
+            </w:r>
+          </w:p>
+        </w:tc>
+        <w:tc>
+          <w:tcPr>
+            <w:tcW w:type="dxa" w:w="4421"/>
+          </w:tcPr>
+          <w:p>
+            <w:pPr>
+              <w:jc w:val="left"/>
+            </w:pPr>
+            <w:r>
+              <w:rPr>
+                <w:rFonts w:ascii="Arial" w:hAnsi="Arial"/>
+                <w:sz w:val="20"/>
+              </w:rPr>
+              <w:t>Las puntuaciones, comentarios, notas complementarias y referencias documentales se guardan automáticamente, reduciendo el riesgo de pérdida de información durante el trabajo.</w:t>
+            </w:r>
+          </w:p>
+        </w:tc>
+      </w:tr>
+      <w:tr>
+        <w:tc>
+          <w:tcPr>
+            <w:tcW w:type="dxa" w:w="4407"/>
+          </w:tcPr>
+          <w:p>
+            <w:pPr>
+              <w:jc w:val="left"/>
+            </w:pPr>
+            <w:r>
+              <w:rPr>
+                <w:rFonts w:ascii="Arial" w:hAnsi="Arial"/>
+                <w:sz w:val="20"/>
+              </w:rPr>
+              <w:t>Protección de evaluaciones ya realizadas</w:t>
+            </w:r>
+          </w:p>
+        </w:tc>
+        <w:tc>
+          <w:tcPr>
+            <w:tcW w:type="dxa" w:w="4421"/>
+          </w:tcPr>
+          <w:p>
+            <w:pPr>
+              <w:jc w:val="left"/>
+            </w:pPr>
+            <w:r>
+              <w:rPr>
+                <w:rFonts w:ascii="Arial" w:hAnsi="Arial"/>
+                <w:sz w:val="20"/>
+              </w:rPr>
+              <w:t>Si se modifica una plantilla, el sistema evita borrar todo el trabajo previo. Solo se invalida la evaluación vinculada al criterio que cambió, cuando corresponde.</w:t>
+            </w:r>
+          </w:p>
+        </w:tc>
+      </w:tr>
+      <w:tr>
+        <w:tc>
+          <w:tcPr>
+            <w:tcW w:type="dxa" w:w="4407"/>
+          </w:tcPr>
+          <w:p>
+            <w:pPr>
+              <w:jc w:val="left"/>
+            </w:pPr>
+            <w:r>
+              <w:rPr>
+                <w:rFonts w:ascii="Arial" w:hAnsi="Arial"/>
+                <w:sz w:val="20"/>
+              </w:rPr>
+              <w:t>Bonificación adicional controlada</w:t>
+            </w:r>
+          </w:p>
+        </w:tc>
+        <w:tc>
+          <w:tcPr>
+            <w:tcW w:type="dxa" w:w="4421"/>
+          </w:tcPr>
+          <w:p>
+            <w:pPr>
+              <w:jc w:val="left"/>
+            </w:pPr>
+            <w:r>
+              <w:rPr>
+                <w:rFonts w:ascii="Arial" w:hAnsi="Arial"/>
+                <w:sz w:val="20"/>
+              </w:rPr>
+              <w:t>Luego de la evaluación principal, la IA puede realizar una segunda revisión global para identificar méritos adicionales no contemplados directamente por los criterios. Esta bonificación se justifica por separado y nunca permite superar el 100% del resultado final.</w:t>
+            </w:r>
+          </w:p>
+        </w:tc>
+      </w:tr>
+      <w:tr>
+        <w:tc>
+          <w:tcPr>
+            <w:tcW w:type="dxa" w:w="4407"/>
+          </w:tcPr>
+          <w:p>
+            <w:pPr>
+              <w:jc w:val="left"/>
+            </w:pPr>
+            <w:r>
+              <w:rPr>
+                <w:rFonts w:ascii="Arial" w:hAnsi="Arial"/>
+                <w:sz w:val="20"/>
+              </w:rPr>
+              <w:t>Decisión final del evaluador</w:t>
+            </w:r>
+          </w:p>
+        </w:tc>
+        <w:tc>
+          <w:tcPr>
+            <w:tcW w:type="dxa" w:w="4421"/>
+          </w:tcPr>
+          <w:p>
+            <w:pPr>
+              <w:jc w:val="left"/>
+            </w:pPr>
+            <w:r>
+              <w:rPr>
+                <w:rFonts w:ascii="Arial" w:hAnsi="Arial"/>
+                <w:sz w:val="20"/>
+              </w:rPr>
+              <w:t>Al cierre del análisis, el evaluador puede marcar si el candidato califica o no califica y dejar comentarios u observaciones generales. Esto separa el resultado calculado de la decisión humana documentada.</w:t>
+            </w:r>
+          </w:p>
+        </w:tc>
+      </w:tr>
+      <w:tr>
+        <w:tc>
+          <w:tcPr>
+            <w:tcW w:type="dxa" w:w="4407"/>
+          </w:tcPr>
+          <w:p>
+            <w:pPr>
+              <w:jc w:val="left"/>
+            </w:pPr>
+            <w:r>
+              <w:rPr>
+                <w:rFonts w:ascii="Arial" w:hAnsi="Arial"/>
+                <w:sz w:val="20"/>
+              </w:rPr>
+              <w:t>Resultados comparativos por plantilla</w:t>
+            </w:r>
+          </w:p>
+        </w:tc>
+        <w:tc>
+          <w:tcPr>
+            <w:tcW w:type="dxa" w:w="4421"/>
+          </w:tcPr>
+          <w:p>
+            <w:pPr>
+              <w:jc w:val="left"/>
+            </w:pPr>
+            <w:r>
+              <w:rPr>
+                <w:rFonts w:ascii="Arial" w:hAnsi="Arial"/>
+                <w:sz w:val="20"/>
+              </w:rPr>
+              <w:t>Las gráficas y rankings se muestran de acuerdo con la plantilla seleccionada. Esto permite comparar candidatos de una misma vacante sin mezclar resultados de procesos distintos.</w:t>
+            </w:r>
+          </w:p>
+        </w:tc>
+      </w:tr>
+      <w:tr>
+        <w:tc>
+          <w:tcPr>
+            <w:tcW w:type="dxa" w:w="4407"/>
+          </w:tcPr>
+          <w:p>
+            <w:pPr>
+              <w:jc w:val="left"/>
+            </w:pPr>
+            <w:r>
+              <w:rPr>
+                <w:rFonts w:ascii="Arial" w:hAnsi="Arial"/>
+                <w:sz w:val="20"/>
+              </w:rPr>
+              <w:t>Visualizaciones para apoyar la decisión</w:t>
+            </w:r>
+          </w:p>
+        </w:tc>
+        <w:tc>
+          <w:tcPr>
+            <w:tcW w:type="dxa" w:w="4421"/>
+          </w:tcPr>
+          <w:p>
+            <w:pPr>
+              <w:jc w:val="left"/>
+            </w:pPr>
+            <w:r>
+              <w:rPr>
+                <w:rFonts w:ascii="Arial" w:hAnsi="Arial"/>
+                <w:sz w:val="20"/>
+              </w:rPr>
+              <w:t>La plataforma presenta ranking global, comparación compacta y gráficos por categoría. Estas vistas ayudan a Recursos Humanos y al área técnica a identificar fortalezas, brechas y diferencias entre aspirantes.</w:t>
+            </w:r>
+          </w:p>
+        </w:tc>
+      </w:tr>
+      <w:tr>
+        <w:tc>
+          <w:tcPr>
+            <w:tcW w:type="dxa" w:w="4407"/>
+          </w:tcPr>
+          <w:p>
+            <w:pPr>
+              <w:jc w:val="left"/>
+            </w:pPr>
+            <w:r>
+              <w:rPr>
+                <w:rFonts w:ascii="Arial" w:hAnsi="Arial"/>
+                <w:sz w:val="20"/>
+              </w:rPr>
+              <w:t>Reportes individuales en Word</w:t>
+            </w:r>
+          </w:p>
+        </w:tc>
+        <w:tc>
+          <w:tcPr>
+            <w:tcW w:type="dxa" w:w="4421"/>
+          </w:tcPr>
+          <w:p>
+            <w:pPr>
+              <w:jc w:val="left"/>
+            </w:pPr>
+            <w:r>
+              <w:rPr>
+                <w:rFonts w:ascii="Arial" w:hAnsi="Arial"/>
+                <w:sz w:val="20"/>
+              </w:rPr>
+              <w:t>La plataforma puede generar un reporte profesional por candidato, con logo institucional, perfil evaluado, estructura de ponderaciones, análisis de resultados, documentos revisados y conclusión.</w:t>
+            </w:r>
+          </w:p>
+        </w:tc>
+      </w:tr>
+      <w:tr>
+        <w:tc>
+          <w:tcPr>
+            <w:tcW w:type="dxa" w:w="4407"/>
+          </w:tcPr>
+          <w:p>
+            <w:pPr>
+              <w:jc w:val="left"/>
+            </w:pPr>
+            <w:r>
+              <w:rPr>
+                <w:rFonts w:ascii="Arial" w:hAnsi="Arial"/>
+                <w:sz w:val="20"/>
+              </w:rPr>
+              <w:t>Configuración del modelo de IA</w:t>
+            </w:r>
+          </w:p>
+        </w:tc>
+        <w:tc>
+          <w:tcPr>
+            <w:tcW w:type="dxa" w:w="4421"/>
+          </w:tcPr>
+          <w:p>
+            <w:pPr>
+              <w:jc w:val="left"/>
+            </w:pPr>
+            <w:r>
+              <w:rPr>
+                <w:rFonts w:ascii="Arial" w:hAnsi="Arial"/>
+                <w:sz w:val="20"/>
+              </w:rPr>
+              <w:t>Los administradores pueden registrar la clave de Gemini y seleccionar el modelo disponible para las evaluaciones automáticas. Esto permite ajustar la plataforma según las capacidades y costos del servicio de IA utilizado.</w:t>
+            </w:r>
+          </w:p>
+        </w:tc>
+      </w:tr>
+      <w:tr>
+        <w:tc>
+          <w:tcPr>
+            <w:tcW w:type="dxa" w:w="4407"/>
+          </w:tcPr>
+          <w:p>
+            <w:pPr>
+              <w:jc w:val="left"/>
+            </w:pPr>
+            <w:r>
+              <w:rPr>
+                <w:rFonts w:ascii="Arial" w:hAnsi="Arial"/>
+                <w:sz w:val="20"/>
+              </w:rPr>
+              <w:t>Trazabilidad de uso y costos de IA</w:t>
+            </w:r>
+          </w:p>
+        </w:tc>
+        <w:tc>
+          <w:tcPr>
+            <w:tcW w:type="dxa" w:w="4421"/>
+          </w:tcPr>
+          <w:p>
+            <w:pPr>
+              <w:jc w:val="left"/>
+            </w:pPr>
+            <w:r>
+              <w:rPr>
+                <w:rFonts w:ascii="Arial" w:hAnsi="Arial"/>
+                <w:sz w:val="20"/>
+              </w:rPr>
+              <w:t>El sistema registra las interacciones con el modelo, incluyendo prompts, respuestas, tokens utilizados, costos estimados, uso de caché cuando aplica y consumo por usuario. Esto facilita control presupuestario y auditoría del uso de IA.</w:t>
+            </w:r>
+          </w:p>
+        </w:tc>
+      </w:tr>
+      <w:tr>
+        <w:tc>
+          <w:tcPr>
+            <w:tcW w:type="dxa" w:w="4407"/>
+          </w:tcPr>
+          <w:p>
+            <w:pPr>
+              <w:jc w:val="left"/>
+            </w:pPr>
+            <w:r>
+              <w:rPr>
+                <w:rFonts w:ascii="Arial" w:hAnsi="Arial"/>
+                <w:sz w:val="20"/>
+              </w:rPr>
+              <w:t>Cuotas mensuales de IA por usuario</w:t>
+            </w:r>
+          </w:p>
+        </w:tc>
+        <w:tc>
+          <w:tcPr>
+            <w:tcW w:type="dxa" w:w="4421"/>
+          </w:tcPr>
+          <w:p>
+            <w:pPr>
+              <w:jc w:val="left"/>
+            </w:pPr>
+            <w:r>
+              <w:rPr>
+                <w:rFonts w:ascii="Arial" w:hAnsi="Arial"/>
+                <w:sz w:val="20"/>
+              </w:rPr>
+              <w:t>Los administradores pueden definir un tope mensual de consumo de IA para cada usuario no administrador. Esto ayuda a controlar costos y evitar usos no previstos.</w:t>
+            </w:r>
+          </w:p>
+        </w:tc>
+      </w:tr>
+      <w:tr>
+        <w:tc>
+          <w:tcPr>
+            <w:tcW w:type="dxa" w:w="4407"/>
+          </w:tcPr>
+          <w:p>
+            <w:pPr>
+              <w:jc w:val="left"/>
+            </w:pPr>
+            <w:r>
+              <w:rPr>
+                <w:rFonts w:ascii="Arial" w:hAnsi="Arial"/>
+                <w:sz w:val="20"/>
+              </w:rPr>
+              <w:t>Respaldo de la información</w:t>
+            </w:r>
+          </w:p>
+        </w:tc>
+        <w:tc>
+          <w:tcPr>
+            <w:tcW w:type="dxa" w:w="4421"/>
+          </w:tcPr>
+          <w:p>
+            <w:pPr>
+              <w:jc w:val="left"/>
+            </w:pPr>
+            <w:r>
+              <w:rPr>
+                <w:rFonts w:ascii="Arial" w:hAnsi="Arial"/>
+                <w:sz w:val="20"/>
               </w:rPr>
               <w:t>La base de datos puede respaldarse para conservar plantillas, usuarios, candidatos, expedientes y evaluaciones ante cambios importantes o necesidad de recuperación.</w:t>
             </w:r>
@@ -4200,26 +4942,41 @@
     <w:p/>
     <w:p>
       <w:pPr>
-        <w:pStyle w:val="Ttulo2"/>
+        <w:spacing w:line="278" w:lineRule="auto"/>
+        <w:rPr>
+          <w:rFonts w:asciiTheme="majorHAnsi" w:eastAsiaTheme="majorEastAsia" w:hAnsiTheme="majorHAnsi" w:cstheme="majorBidi"/>
+          <w:color w:val="0F4761" w:themeColor="accent1" w:themeShade="BF"/>
+          <w:sz w:val="32"/>
+          <w:szCs w:val="32"/>
+        </w:rPr>
       </w:pPr>
       <w:bookmarkStart w:id="9" w:name="_Toc230878441"/>
       <w:r>
-        <w:t xml:space="preserve">Flujo </w:t>
-      </w:r>
-      <w:r>
-        <w:t xml:space="preserve">propuesto </w:t>
-      </w:r>
-      <w:r>
-        <w:t>de uso</w:t>
-      </w:r>
-      <w:bookmarkEnd w:id="9"/>
-      <w:r>
-        <w:t xml:space="preserve"> </w:t>
+        <w:br w:type="page"/>
       </w:r>
     </w:p>
     <w:p>
       <w:pPr>
-        <w:pStyle w:val="Listaconnmeros"/>
+        <w:pStyle w:val="Heading2"/>
+      </w:pPr>
+      <w:r>
+        <w:lastRenderedPageBreak/>
+        <w:t xml:space="preserve">Flujo </w:t>
+      </w:r>
+      <w:r>
+        <w:t xml:space="preserve">propuesto </w:t>
+      </w:r>
+      <w:r>
+        <w:t>de uso</w:t>
+      </w:r>
+      <w:bookmarkEnd w:id="9"/>
+      <w:r>
+        <w:t xml:space="preserve"> </w:t>
+      </w:r>
+    </w:p>
+    <w:p>
+      <w:pPr>
+        <w:pStyle w:val="ListNumber"/>
         <w:tabs>
           <w:tab w:val="num" w:pos="360"/>
         </w:tabs>
@@ -4241,7 +4998,7 @@
     </w:p>
     <w:p>
       <w:pPr>
-        <w:pStyle w:val="Listaconnmeros"/>
+        <w:pStyle w:val="ListNumber"/>
         <w:tabs>
           <w:tab w:val="num" w:pos="360"/>
         </w:tabs>
@@ -4263,7 +5020,7 @@
     </w:p>
     <w:p>
       <w:pPr>
-        <w:pStyle w:val="Listaconnmeros"/>
+        <w:pStyle w:val="ListNumber"/>
         <w:tabs>
           <w:tab w:val="num" w:pos="360"/>
         </w:tabs>
@@ -4285,7 +5042,7 @@
     </w:p>
     <w:p>
       <w:pPr>
-        <w:pStyle w:val="Listaconnmeros"/>
+        <w:pStyle w:val="ListNumber"/>
         <w:tabs>
           <w:tab w:val="num" w:pos="360"/>
         </w:tabs>
@@ -4302,12 +5059,55 @@
           <w:sz w:val="22"/>
           <w:lang w:val="es-DO"/>
         </w:rPr>
-        <w:t>Los criterios manuales son completados por el evaluador experto con puntuación y evidencia.</w:t>
+        <w:t>Los criterios manuales son completados</w:t>
+      </w:r>
+      <w:r>
+        <w:rPr>
+          <w:sz w:val="22"/>
+          <w:lang w:val="es-DO"/>
+        </w:rPr>
+        <w:t xml:space="preserve"> con </w:t>
+      </w:r>
+      <w:r>
+        <w:rPr>
+          <w:sz w:val="22"/>
+          <w:lang w:val="es-DO"/>
+        </w:rPr>
+        <w:t>puntuación y evidencia</w:t>
+      </w:r>
+      <w:r>
+        <w:rPr>
+          <w:sz w:val="22"/>
+          <w:lang w:val="es-DO"/>
+        </w:rPr>
+        <w:t xml:space="preserve"> por el evaluador experto</w:t>
+      </w:r>
+      <w:r>
+        <w:rPr>
+          <w:sz w:val="22"/>
+          <w:lang w:val="es-DO"/>
+        </w:rPr>
+        <w:t xml:space="preserve"> </w:t>
+      </w:r>
+      <w:r>
+        <w:rPr>
+          <w:sz w:val="22"/>
+          <w:highlight w:val="yellow"/>
+          <w:lang w:val="es-DO"/>
+        </w:rPr>
+        <w:t>técnico del área solicitante</w:t>
+      </w:r>
+      <w:r>
+        <w:rPr>
+          <w:sz w:val="22"/>
+          <w:lang w:val="es-DO"/>
+        </w:rPr>
+        <w:t>.</w:t>
       </w:r>
     </w:p>
     <w:p>
       <w:pPr>
-        <w:pStyle w:val="Listaconnmeros"/>
+        <w:pStyle w:val="ListNumber"/>
         <w:tabs>
           <w:tab w:val="num" w:pos="360"/>
         </w:tabs>
@@ -4324,12 +5124,12 @@
           <w:sz w:val="22"/>
           <w:lang w:val="es-DO"/>
         </w:rPr>
-        <w:t>Los criterios IA se procesan con Gemini, usando el expediente documental y las notas de evaluación como instrucciones.</w:t>
+        <w:t>Los criterios IA se procesan usando el expediente documental y las notas de evaluación como instrucciones.</w:t>
       </w:r>
     </w:p>
     <w:p>
       <w:pPr>
-        <w:pStyle w:val="Listaconnmeros"/>
+        <w:pStyle w:val="ListNumber"/>
         <w:tabs>
           <w:tab w:val="num" w:pos="360"/>
         </w:tabs>
@@ -4351,7 +5151,7 @@
     </w:p>
     <w:p>
       <w:pPr>
-        <w:pStyle w:val="Listaconnmeros"/>
+        <w:pStyle w:val="ListNumber"/>
         <w:tabs>
           <w:tab w:val="num" w:pos="360"/>
         </w:tabs>
@@ -4383,7 +5183,7 @@
     </w:p>
     <w:p>
       <w:pPr>
-        <w:pStyle w:val="Ttulo1"/>
+        <w:pStyle w:val="Heading1"/>
       </w:pPr>
       <w:bookmarkStart w:id="10" w:name="_Toc230878442"/>
       <w:r>
@@ -4404,12 +5204,25 @@
         <w:rPr>
           <w:rFonts w:ascii="Aptos" w:hAnsi="Aptos"/>
         </w:rPr>
-        <w:t>La inteligencia artificial se incorpora como un mecanismo de asistencia, no como autoridad decisoria. Su uso busca acelerar la lectura de expedientes, sugerir puntuaciones, identificar evidencias y homogeneizar parte del análisis. Sin embargo, la interpretación final debe permanecer bajo responsabilidad de los evaluadores designados por las áreas competentes.</w:t>
+        <w:t xml:space="preserve">La inteligencia artificial se incorpora como un mecanismo de asistencia, </w:t>
+      </w:r>
+      <w:r>
+        <w:rPr>
+          <w:rFonts w:ascii="Aptos" w:hAnsi="Aptos"/>
+          <w:u w:val="single"/>
+        </w:rPr>
+        <w:t>no como autoridad decisoria</w:t>
+      </w:r>
+      <w:r>
+        <w:rPr>
+          <w:rFonts w:ascii="Aptos" w:hAnsi="Aptos"/>
+        </w:rPr>
+        <w:t>. Su uso busca acelerar la lectura de expedientes, sugerir puntuaciones, identificar evidencias y homogeneizar parte del análisis. Sin embargo, la interpretación final debe permanecer bajo responsabilidad de los evaluadores designados por las áreas competentes.</w:t>
       </w:r>
     </w:p>
     <w:p>
       <w:pPr>
-        <w:pStyle w:val="Listaconvietas"/>
+        <w:pStyle w:val="ListBullet"/>
         <w:tabs>
           <w:tab w:val="num" w:pos="360"/>
         </w:tabs>
@@ -4425,37 +5238,40 @@
           <w:sz w:val="22"/>
           <w:lang w:val="es-DO"/>
         </w:rPr>
-        <w:lastRenderedPageBreak/>
         <w:t>Las notas o evidencias esperadas de cada criterio se usan como instrucciones para orientar la evaluación automática.</w:t>
       </w:r>
     </w:p>
     <w:p>
       <w:pPr>
-        <w:pStyle w:val="Listaconvietas"/>
-      </w:pPr>
-      <w:r>
-        <w:rPr>
-          <w:rFonts w:ascii="Aptos" w:hAnsi="Aptos"/>
-          <w:sz w:val="21"/>
+        <w:pStyle w:val="ListBullet"/>
+        <w:rPr>
+          <w:lang w:val="es-ES"/>
+        </w:rPr>
+      </w:pPr>
+      <w:r>
+        <w:rPr>
+          <w:lang w:val="es-ES"/>
         </w:rPr>
         <w:t>Los criterios evaluados con IA incorporan una nota complementaria editable por el evaluador, destinada a completar o matizar el juicio automático sin alterar la evidencia original generada por el modelo.</w:t>
       </w:r>
     </w:p>
     <w:p>
       <w:pPr>
-        <w:pStyle w:val="Listaconvietas"/>
-      </w:pPr>
-      <w:r>
-        <w:rPr>
-          <w:rFonts w:ascii="Aptos" w:hAnsi="Aptos"/>
-          <w:sz w:val="21"/>
+        <w:pStyle w:val="ListBullet"/>
+        <w:rPr>
+          <w:lang w:val="es-ES"/>
+        </w:rPr>
+      </w:pPr>
+      <w:r>
+        <w:rPr>
+          <w:lang w:val="es-ES"/>
         </w:rPr>
         <w:t>La generación de plantillas con IA se maneja como borrador revisable: el modelo propone estructura, pesos y criterios, pero el evaluador o administrador debe validar el contenido antes de guardarlo y aplicarlo a candidatos.</w:t>
       </w:r>
     </w:p>
     <w:p>
       <w:pPr>
-        <w:pStyle w:val="Listaconvietas"/>
+        <w:pStyle w:val="ListBullet"/>
         <w:tabs>
           <w:tab w:val="num" w:pos="360"/>
         </w:tabs>
@@ -4476,7 +5292,7 @@
     </w:p>
     <w:p>
       <w:pPr>
-        <w:pStyle w:val="Listaconvietas"/>
+        <w:pStyle w:val="ListBullet"/>
         <w:tabs>
           <w:tab w:val="num" w:pos="360"/>
         </w:tabs>
@@ -4497,7 +5313,7 @@
     </w:p>
     <w:p>
       <w:pPr>
-        <w:pStyle w:val="Listaconvietas"/>
+        <w:pStyle w:val="ListBullet"/>
         <w:tabs>
           <w:tab w:val="num" w:pos="360"/>
         </w:tabs>
@@ -4513,12 +5329,13 @@
           <w:sz w:val="22"/>
           <w:lang w:val="es-DO"/>
         </w:rPr>
+        <w:lastRenderedPageBreak/>
         <w:t>Las referencias documentales permiten identificar qué archivos sustentaron cada comentario o puntuación.</w:t>
       </w:r>
     </w:p>
     <w:p>
       <w:pPr>
-        <w:pStyle w:val="Listaconvietas"/>
+        <w:pStyle w:val="ListBullet"/>
         <w:tabs>
           <w:tab w:val="num" w:pos="360"/>
         </w:tabs>
@@ -4539,7 +5356,7 @@
     </w:p>
     <w:p>
       <w:pPr>
-        <w:pStyle w:val="Listaconvietas"/>
+        <w:pStyle w:val="ListBullet"/>
         <w:numPr>
           <w:ilvl w:val="0"/>
           <w:numId w:val="0"/>
@@ -4553,7 +5370,7 @@
     </w:p>
     <w:p>
       <w:pPr>
-        <w:pStyle w:val="Ttulo1"/>
+        <w:pStyle w:val="Heading1"/>
       </w:pPr>
       <w:bookmarkStart w:id="11" w:name="_Toc230878443"/>
       <w:r>
@@ -4567,7 +5384,7 @@
     </w:p>
     <w:p>
       <w:pPr>
-        <w:pStyle w:val="Listaconvietas"/>
+        <w:pStyle w:val="ListBullet"/>
         <w:tabs>
           <w:tab w:val="num" w:pos="360"/>
         </w:tabs>
@@ -4588,7 +5405,7 @@
     </w:p>
     <w:p>
       <w:pPr>
-        <w:pStyle w:val="Listaconvietas"/>
+        <w:pStyle w:val="ListBullet"/>
         <w:tabs>
           <w:tab w:val="num" w:pos="360"/>
         </w:tabs>
@@ -4609,7 +5426,7 @@
     </w:p>
     <w:p>
       <w:pPr>
-        <w:pStyle w:val="Listaconvietas"/>
+        <w:pStyle w:val="ListBullet"/>
         <w:tabs>
           <w:tab w:val="num" w:pos="360"/>
         </w:tabs>
@@ -4630,7 +5447,7 @@
     </w:p>
     <w:p>
       <w:pPr>
-        <w:pStyle w:val="Listaconvietas"/>
+        <w:pStyle w:val="ListBullet"/>
         <w:tabs>
           <w:tab w:val="num" w:pos="360"/>
         </w:tabs>
@@ -4651,7 +5468,7 @@
     </w:p>
     <w:p>
       <w:pPr>
-        <w:pStyle w:val="Listaconvietas"/>
+        <w:pStyle w:val="ListBullet"/>
         <w:tabs>
           <w:tab w:val="num" w:pos="360"/>
         </w:tabs>
@@ -4672,7 +5489,7 @@
     </w:p>
     <w:p>
       <w:pPr>
-        <w:pStyle w:val="Listaconvietas"/>
+        <w:pStyle w:val="ListBullet"/>
         <w:tabs>
           <w:tab w:val="num" w:pos="360"/>
         </w:tabs>
@@ -4693,7 +5510,7 @@
     </w:p>
     <w:p>
       <w:pPr>
-        <w:pStyle w:val="Listaconvietas"/>
+        <w:pStyle w:val="ListBullet"/>
         <w:tabs>
           <w:tab w:val="num" w:pos="360"/>
         </w:tabs>
@@ -4714,7 +5531,7 @@
     </w:p>
     <w:p>
       <w:pPr>
-        <w:pStyle w:val="Listaconvietas"/>
+        <w:pStyle w:val="ListBullet"/>
         <w:numPr>
           <w:ilvl w:val="0"/>
           <w:numId w:val="0"/>
@@ -4733,7 +5550,7 @@
     </w:p>
     <w:p>
       <w:pPr>
-        <w:pStyle w:val="Ttulo1"/>
+        <w:pStyle w:val="Heading1"/>
       </w:pPr>
       <w:bookmarkStart w:id="12" w:name="_Toc230878444"/>
       <w:r>
@@ -4747,7 +5564,7 @@
     </w:p>
     <w:tbl>
       <w:tblPr>
-        <w:tblStyle w:val="Tablaconcuadrcula"/>
+        <w:tblStyle w:val="TableGrid"/>
         <w:tblW w:w="0" w:type="auto"/>
         <w:jc w:val="center"/>
         <w:tblLook w:val="04A0" w:firstRow="1" w:lastRow="0" w:firstColumn="1" w:lastColumn="0" w:noHBand="0" w:noVBand="1"/>
@@ -4978,7 +5795,7 @@
     </w:tbl>
     <w:p>
       <w:pPr>
-        <w:pStyle w:val="Listaconvietas"/>
+        <w:pStyle w:val="ListBullet"/>
         <w:numPr>
           <w:ilvl w:val="0"/>
           <w:numId w:val="0"/>
@@ -4992,7 +5809,21 @@
     </w:p>
     <w:p>
       <w:pPr>
-        <w:pStyle w:val="Ttulo1"/>
+        <w:spacing w:line="278" w:lineRule="auto"/>
+        <w:rPr>
+          <w:rFonts w:ascii="Aptos" w:eastAsiaTheme="minorEastAsia" w:hAnsi="Aptos"/>
+          <w:kern w:val="0"/>
+          <w:sz w:val="21"/>
+          <w14:ligatures w14:val="none"/>
+        </w:rPr>
+      </w:pPr>
+      <w:r>
+        <w:br w:type="page"/>
+      </w:r>
+    </w:p>
+    <w:p>
+      <w:pPr>
+        <w:pStyle w:val="Heading1"/>
       </w:pPr>
       <w:r>
         <w:rPr>
@@ -5022,7 +5853,7 @@
           <w:rFonts w:ascii="Aptos" w:hAnsi="Aptos"/>
           <w:sz w:val="21"/>
         </w:rPr>
-        <w:t>La plataforma cuenta con una versión funcional desplegada en contenedores Docker. Incluye acceso por roles, gestión de usuarios institucionales, edición avanzada de plantillas, generación asistida de plantillas con IA, carga y consulta de documentos, evaluación manual y asistida por IA, criterios críticos, nota complementaria del evaluador, guardado automático, visualización comparativa por plantilla, configuración del modelo Gemini y respaldo de base de datos. La primera plantilla corresponde a la evaluación de aspirantes a Gerente de Normas Eléctricas.</w:t>
+        <w:t>La plataforma cuenta con una versión funcional desplegada. Incluye acceso por roles, gestión de usuarios institucionales, edición avanzada de plantillas, generación asistida de plantillas con IA, carga y consulta de documentos, evaluación manual y asistida por IA, criterios críticos, nota complementaria del evaluador, guardado automático, visualización comparativa por plantilla, configuración del modelo Gemini y respaldo de base de datos. La primera plantilla corresponde a la evaluación de aspirantes a Gerente de Normas Eléctricas.</w:t>
       </w:r>
     </w:p>
     <w:p>
@@ -5039,7 +5870,7 @@
     </w:p>
     <w:p>
       <w:pPr>
-        <w:pStyle w:val="Ttulo1"/>
+        <w:pStyle w:val="Heading1"/>
       </w:pPr>
       <w:r>
         <w:rPr>
@@ -5060,7 +5891,7 @@
     </w:p>
     <w:p>
       <w:pPr>
-        <w:pStyle w:val="Listaconvietas"/>
+        <w:pStyle w:val="ListBullet"/>
         <w:tabs>
           <w:tab w:val="num" w:pos="360"/>
         </w:tabs>
@@ -5080,7 +5911,7 @@
     </w:p>
     <w:p>
       <w:pPr>
-        <w:pStyle w:val="Listaconvietas"/>
+        <w:pStyle w:val="ListBullet"/>
         <w:tabs>
           <w:tab w:val="num" w:pos="360"/>
         </w:tabs>
@@ -5100,7 +5931,7 @@
     </w:p>
     <w:p>
       <w:pPr>
-        <w:pStyle w:val="Listaconvietas"/>
+        <w:pStyle w:val="ListBullet"/>
         <w:tabs>
           <w:tab w:val="num" w:pos="360"/>
         </w:tabs>
@@ -5120,7 +5951,7 @@
     </w:p>
     <w:p>
       <w:pPr>
-        <w:pStyle w:val="Listaconvietas"/>
+        <w:pStyle w:val="ListBullet"/>
         <w:tabs>
           <w:tab w:val="num" w:pos="360"/>
         </w:tabs>
@@ -5140,7 +5971,7 @@
     </w:p>
     <w:p>
       <w:pPr>
-        <w:pStyle w:val="Listaconvietas"/>
+        <w:pStyle w:val="ListBullet"/>
         <w:tabs>
           <w:tab w:val="num" w:pos="360"/>
         </w:tabs>
@@ -5160,11 +5991,14 @@
     </w:p>
     <w:p>
       <w:pPr>
-        <w:pStyle w:val="Listaconvietas"/>
+        <w:pStyle w:val="ListBullet"/>
         <w:tabs>
           <w:tab w:val="num" w:pos="360"/>
         </w:tabs>
         <w:spacing w:after="60" w:line="278" w:lineRule="auto"/>
+        <w:rPr>
+          <w:lang w:val="es-ES"/>
+        </w:rPr>
       </w:pPr>
       <w:r>
         <w:rPr>
@@ -5176,7 +6010,7 @@
     </w:p>
     <w:p>
       <w:pPr>
-        <w:pStyle w:val="Ttulo1"/>
+        <w:pStyle w:val="Heading1"/>
       </w:pPr>
       <w:r>
         <w:rPr>
@@ -5222,84 +6056,26 @@
         <w:rPr>
           <w:rFonts w:ascii="Aptos" w:hAnsi="Aptos"/>
         </w:rPr>
-        <w:t>el equipo de la DFMEMI</w:t>
+        <w:t xml:space="preserve">el equipo </w:t>
       </w:r>
       <w:r>
         <w:rPr>
           <w:rFonts w:ascii="Aptos" w:hAnsi="Aptos"/>
+          <w:highlight w:val="yellow"/>
+        </w:rPr>
+        <w:t>suscribiente</w:t>
+      </w:r>
+      <w:r>
+        <w:rPr>
+          <w:rFonts w:ascii="Aptos" w:hAnsi="Aptos"/>
         </w:rPr>
         <w:t xml:space="preserve"> </w:t>
       </w:r>
-      <w:proofErr w:type="gramStart"/>
       <w:r>
         <w:rPr>
           <w:rFonts w:ascii="Aptos" w:hAnsi="Aptos"/>
         </w:rPr>
-        <w:t xml:space="preserve">y </w:t>
-      </w:r>
-      <w:r>
-        <w:rPr>
-          <w:rFonts w:ascii="Aptos" w:hAnsi="Aptos"/>
-        </w:rPr>
-        <w:t xml:space="preserve"> la</w:t>
-      </w:r>
-      <w:proofErr w:type="gramEnd"/>
-      <w:r>
-        <w:rPr>
-          <w:rFonts w:ascii="Aptos" w:hAnsi="Aptos"/>
-        </w:rPr>
-        <w:t xml:space="preserve"> coordinación de Recursos Humanos y </w:t>
-      </w:r>
-      <w:proofErr w:type="gramStart"/>
-      <w:r>
-        <w:rPr>
-          <w:rFonts w:ascii="Aptos" w:hAnsi="Aptos"/>
-        </w:rPr>
-        <w:t>Regulación,</w:t>
-      </w:r>
-      <w:proofErr w:type="gramEnd"/>
-      <w:r>
-        <w:rPr>
-          <w:rFonts w:ascii="Aptos" w:hAnsi="Aptos"/>
-        </w:rPr>
-        <w:t xml:space="preserve"> demuestra una oportunidad concreta de modernización institucional: convertir una necesidad puntual de evaluación en una plataforma reutilizable para futuras vacantes técnicas y procesos de análisis especializado.</w:t>
-      </w:r>
-    </w:p>
-    <w:p>
-      <w:r>
-        <w:br w:type="page"/>
-      </w:r>
-    </w:p>
-    <w:p>
-      <w:pPr>
-        <w:pStyle w:val="Ttulo1"/>
-      </w:pPr>
-      <w:r>
-        <w:t>Referencias consultadas</w:t>
-      </w:r>
-    </w:p>
-    <w:p>
-      <w:pPr>
-        <w:pStyle w:val="Listaconvietas"/>
-      </w:pPr>
-      <w:r>
-        <w:rPr>
-          <w:rFonts w:ascii="Aptos" w:hAnsi="Aptos"/>
-          <w:sz w:val="20"/>
-        </w:rPr>
-        <w:t>Poder Judicial de la República Dominicana. Código de Trabajo de la República Dominicana, Ley No. 16-92: https://poderjudicial.gob.do/wp-content/uploads/2021/06/Codigo_Trabajo.pdf</w:t>
-      </w:r>
-    </w:p>
-    <w:p>
-      <w:pPr>
-        <w:pStyle w:val="Listaconvietas"/>
-      </w:pPr>
-      <w:r>
-        <w:rPr>
-          <w:rFonts w:ascii="Aptos" w:hAnsi="Aptos"/>
-          <w:sz w:val="20"/>
-        </w:rPr>
-        <w:t>Ministerio de Trabajo. Código Laboral, Ley 16-92 promulgada el 29 de mayo de 1992: https://transparencia.mt.gob.do/index.php/base-legal/item/codigo-laboral</w:t>
+        <w:t>demuestra una oportunidad concreta de modernización institucional: convertir una necesidad puntual de evaluación en una plataforma reutilizable para futuras vacantes técnicas y procesos de análisis especializado.</w:t>
       </w:r>
     </w:p>
     <w:sectPr>
@@ -5346,7 +6122,7 @@
 <w:ftr xmlns:wpc="http://schemas.microsoft.com/office/word/2010/wordprocessingCanvas" xmlns:cx="http://schemas.microsoft.com/office/drawing/2014/chartex" xmlns:cx1="http://schemas.microsoft.com/office/drawing/2015/9/8/chartex" xmlns:cx2="http://schemas.microsoft.com/office/drawing/2015/10/21/chartex" xmlns:cx3="http://schemas.microsoft.com/office/drawing/2016/5/9/chartex" xmlns:cx4="http://schemas.microsoft.com/office/drawing/2016/5/10/chartex" xmlns:cx5="http://schemas.microsoft.com/office/drawing/2016/5/11/chartex" xmlns:cx6="http://schemas.microsoft.com/office/drawing/2016/5/12/chartex" xmlns:cx7="http://schemas.microsoft.com/office/drawing/2016/5/13/chartex" xmlns:cx8="http://schemas.microsoft.com/office/drawing/2016/5/14/chartex" xmlns:mc="http://schemas.openxmlformats.org/markup-compatibility/2006" xmlns:aink="http://schemas.microsoft.com/office/drawing/2016/ink" xmlns:am3d="http://schemas.microsoft.com/office/drawing/2017/model3d" xmlns:o="urn:schemas-microsoft-com:office:office" xmlns:oel="http://schemas.microsoft.com/office/2019/extlst" xmlns:r="http://schemas.openxmlformats.org/officeDocument/2006/relationships" xmlns:m="http://schemas.openxmlformats.org/officeDocument/2006/math" xmlns:v="urn:schemas-microsoft-com:vml" xmlns:wp14="http://schemas.microsoft.com/office/word/2010/wordprocessingDrawing" xmlns:wp="http://schemas.openxmlformats.org/drawingml/2006/wordprocessingDrawing" xmlns:w10="urn:schemas-microsoft-com:office:word" xmlns:w="http://schemas.openxmlformats.org/wordprocessingml/2006/main" xmlns:w14="http://schemas.microsoft.com/office/word/2010/wordml" xmlns:w15="http://schemas.microsoft.com/office/word/2012/wordml" xmlns:w16cex="http://schemas.microsoft.com/office/word/2018/wordml/cex" xmlns:w16cid="http://schemas.microsoft.com/office/word/2016/wordml/cid" xmlns:w16="http://schemas.microsoft.com/office/word/2018/wordml" xmlns:w16du="http://schemas.microsoft.com/office/word/2023/wordml/word16du" xmlns:w16sdtdh="http://schemas.microsoft.com/office/word/2020/wordml/sdtdatahash" xmlns:w16sdtfl="http://schemas.microsoft.com/office/word/2024/wordml/sdtformatlock" xmlns:w16se="http://schemas.microsoft.com/office/word/2015/wordml/symex" xmlns:wpg="http://schemas.microsoft.com/office/word/2010/wordprocessingGroup" xmlns:wpi="http://schemas.microsoft.com/office/word/2010/wordprocessingInk" xmlns:wne="http://schemas.microsoft.com/office/word/2006/wordml" xmlns:wps="http://schemas.microsoft.com/office/word/2010/wordprocessingShape" mc:Ignorable="w14 w15 w16se w16cid w16 w16cex w16sdtdh w16sdtfl w16du wp14">
   <w:p>
     <w:pPr>
-      <w:pStyle w:val="Piedepgina"/>
+      <w:pStyle w:val="Footer"/>
       <w:pBdr>
         <w:top w:val="single" w:sz="4" w:space="0" w:color="D9D9D9"/>
       </w:pBdr>
@@ -5570,7 +6346,7 @@
               <w:sz w:val="20"/>
               <w:szCs w:val="20"/>
             </w:rPr>
-            <w:t>Encargado</w:t>
+            <w:t>Sustentante</w:t>
           </w:r>
         </w:p>
       </w:tc>
@@ -5601,34 +6377,12 @@
             <w:t>Yovanny Rodríguez</w:t>
           </w:r>
         </w:p>
-        <w:p>
-          <w:pPr>
-            <w:pStyle w:val="NormalWeb"/>
-            <w:spacing w:before="0" w:beforeAutospacing="0" w:after="0" w:afterAutospacing="0"/>
-            <w:jc w:val="center"/>
-            <w:rPr>
-              <w:rFonts w:ascii="Arial" w:hAnsi="Arial" w:cs="Arial"/>
-              <w:color w:val="000000"/>
-              <w:sz w:val="20"/>
-              <w:szCs w:val="20"/>
-            </w:rPr>
-          </w:pPr>
-          <w:r>
-            <w:rPr>
-              <w:rFonts w:ascii="Arial" w:hAnsi="Arial" w:cs="Arial"/>
-              <w:color w:val="000000"/>
-              <w:sz w:val="20"/>
-              <w:szCs w:val="20"/>
-            </w:rPr>
-            <w:t xml:space="preserve">Director </w:t>
-          </w:r>
-        </w:p>
       </w:tc>
     </w:tr>
   </w:tbl>
   <w:p>
     <w:pPr>
-      <w:pStyle w:val="Piedepgina"/>
+      <w:pStyle w:val="Footer"/>
     </w:pPr>
   </w:p>
 </w:ftr>
@@ -5638,7 +6392,7 @@
 <w:ftr xmlns:wpc="http://schemas.microsoft.com/office/word/2010/wordprocessingCanvas" xmlns:cx="http://schemas.microsoft.com/office/drawing/2014/chartex" xmlns:cx1="http://schemas.microsoft.com/office/drawing/2015/9/8/chartex" xmlns:cx2="http://schemas.microsoft.com/office/drawing/2015/10/21/chartex" xmlns:cx3="http://schemas.microsoft.com/office/drawing/2016/5/9/chartex" xmlns:cx4="http://schemas.microsoft.com/office/drawing/2016/5/10/chartex" xmlns:cx5="http://schemas.microsoft.com/office/drawing/2016/5/11/chartex" xmlns:cx6="http://schemas.microsoft.com/office/drawing/2016/5/12/chartex" xmlns:cx7="http://schemas.microsoft.com/office/drawing/2016/5/13/chartex" xmlns:cx8="http://schemas.microsoft.com/office/drawing/2016/5/14/chartex" xmlns:mc="http://schemas.openxmlformats.org/markup-compatibility/2006" xmlns:aink="http://schemas.microsoft.com/office/drawing/2016/ink" xmlns:am3d="http://schemas.microsoft.com/office/drawing/2017/model3d" xmlns:o="urn:schemas-microsoft-com:office:office" xmlns:oel="http://schemas.microsoft.com/office/2019/extlst" xmlns:r="http://schemas.openxmlformats.org/officeDocument/2006/relationships" xmlns:m="http://schemas.openxmlformats.org/officeDocument/2006/math" xmlns:v="urn:schemas-microsoft-com:vml" xmlns:wp14="http://schemas.microsoft.com/office/word/2010/wordprocessingDrawing" xmlns:wp="http://schemas.openxmlformats.org/drawingml/2006/wordprocessingDrawing" xmlns:w10="urn:schemas-microsoft-com:office:word" xmlns:w="http://schemas.openxmlformats.org/wordprocessingml/2006/main" xmlns:w14="http://schemas.microsoft.com/office/word/2010/wordml" xmlns:w15="http://schemas.microsoft.com/office/word/2012/wordml" xmlns:w16cex="http://schemas.microsoft.com/office/word/2018/wordml/cex" xmlns:w16cid="http://schemas.microsoft.com/office/word/2016/wordml/cid" xmlns:w16="http://schemas.microsoft.com/office/word/2018/wordml" xmlns:w16du="http://schemas.microsoft.com/office/word/2023/wordml/word16du" xmlns:w16sdtdh="http://schemas.microsoft.com/office/word/2020/wordml/sdtdatahash" xmlns:w16sdtfl="http://schemas.microsoft.com/office/word/2024/wordml/sdtformatlock" xmlns:w16se="http://schemas.microsoft.com/office/word/2015/wordml/symex" xmlns:wpg="http://schemas.microsoft.com/office/word/2010/wordprocessingGroup" xmlns:wpi="http://schemas.microsoft.com/office/word/2010/wordprocessingInk" xmlns:wne="http://schemas.microsoft.com/office/word/2006/wordml" xmlns:wps="http://schemas.microsoft.com/office/word/2010/wordprocessingShape" mc:Ignorable="w14 w15 w16se w16cid w16 w16cex w16sdtdh w16sdtfl w16du wp14">
   <w:tbl>
     <w:tblPr>
-      <w:tblStyle w:val="Tablaconcuadrcula"/>
+      <w:tblStyle w:val="TableGrid"/>
       <w:tblW w:w="8870" w:type="dxa"/>
       <w:tblLayout w:type="fixed"/>
       <w:tblLook w:val="04A0" w:firstRow="1" w:lastRow="0" w:firstColumn="1" w:lastColumn="0" w:noHBand="0" w:noVBand="1"/>
@@ -5669,7 +6423,7 @@
         </w:tcPr>
         <w:p>
           <w:pPr>
-            <w:pStyle w:val="Piedepgina"/>
+            <w:pStyle w:val="Footer"/>
             <w:jc w:val="center"/>
             <w:rPr>
               <w:rFonts w:ascii="Arial Narrow" w:hAnsi="Arial Narrow" w:cs="Arial"/>
@@ -5693,7 +6447,7 @@
         </w:tcPr>
         <w:p>
           <w:pPr>
-            <w:pStyle w:val="Piedepgina"/>
+            <w:pStyle w:val="Footer"/>
           </w:pPr>
         </w:p>
       </w:tc>
@@ -5709,7 +6463,7 @@
         </w:tcPr>
         <w:p>
           <w:pPr>
-            <w:pStyle w:val="Piedepgina"/>
+            <w:pStyle w:val="Footer"/>
           </w:pPr>
         </w:p>
       </w:tc>
@@ -5726,7 +6480,7 @@
         </w:tcPr>
         <w:p>
           <w:pPr>
-            <w:pStyle w:val="Piedepgina"/>
+            <w:pStyle w:val="Footer"/>
             <w:jc w:val="center"/>
           </w:pPr>
         </w:p>
@@ -5749,7 +6503,7 @@
         </w:tcPr>
         <w:p>
           <w:pPr>
-            <w:pStyle w:val="Piedepgina"/>
+            <w:pStyle w:val="Footer"/>
             <w:jc w:val="center"/>
             <w:rPr>
               <w:rFonts w:ascii="Arial Narrow" w:hAnsi="Arial Narrow" w:cs="Arial"/>
@@ -5784,7 +6538,7 @@
         </w:tcPr>
         <w:p>
           <w:pPr>
-            <w:pStyle w:val="Piedepgina"/>
+            <w:pStyle w:val="Footer"/>
             <w:jc w:val="center"/>
           </w:pPr>
         </w:p>
@@ -5802,7 +6556,7 @@
         </w:tcPr>
         <w:p>
           <w:pPr>
-            <w:pStyle w:val="Piedepgina"/>
+            <w:pStyle w:val="Footer"/>
             <w:jc w:val="center"/>
           </w:pPr>
         </w:p>
@@ -5821,7 +6575,7 @@
         </w:tcPr>
         <w:p>
           <w:pPr>
-            <w:pStyle w:val="Piedepgina"/>
+            <w:pStyle w:val="Footer"/>
             <w:jc w:val="center"/>
             <w:rPr>
               <w:rFonts w:ascii="Arial Narrow" w:hAnsi="Arial Narrow" w:cs="Arial"/>
@@ -5863,7 +6617,7 @@
         </w:tcPr>
         <w:p>
           <w:pPr>
-            <w:pStyle w:val="Piedepgina"/>
+            <w:pStyle w:val="Footer"/>
             <w:jc w:val="center"/>
             <w:rPr>
               <w:rFonts w:ascii="Arial" w:hAnsi="Arial" w:cs="Arial"/>
@@ -5885,7 +6639,7 @@
         </w:p>
         <w:p>
           <w:pPr>
-            <w:pStyle w:val="Piedepgina"/>
+            <w:pStyle w:val="Footer"/>
             <w:jc w:val="center"/>
             <w:rPr>
               <w:rFonts w:ascii="Arial Narrow" w:hAnsi="Arial Narrow" w:cs="Arial"/>
@@ -5920,7 +6674,7 @@
         </w:tcPr>
         <w:p>
           <w:pPr>
-            <w:pStyle w:val="Piedepgina"/>
+            <w:pStyle w:val="Footer"/>
             <w:jc w:val="center"/>
           </w:pPr>
         </w:p>
@@ -5938,7 +6692,7 @@
         </w:tcPr>
         <w:p>
           <w:pPr>
-            <w:pStyle w:val="Piedepgina"/>
+            <w:pStyle w:val="Footer"/>
             <w:jc w:val="center"/>
           </w:pPr>
         </w:p>
@@ -5987,7 +6741,7 @@
         </w:p>
         <w:p>
           <w:pPr>
-            <w:pStyle w:val="Piedepgina"/>
+            <w:pStyle w:val="Footer"/>
             <w:jc w:val="center"/>
           </w:pPr>
           <w:r>
@@ -6005,7 +6759,7 @@
   </w:tbl>
   <w:p>
     <w:pPr>
-      <w:pStyle w:val="Piedepgina"/>
+      <w:pStyle w:val="Footer"/>
     </w:pPr>
   </w:p>
 </w:ftr>
@@ -6040,7 +6794,7 @@
 <w:hdr xmlns:wpc="http://schemas.microsoft.com/office/word/2010/wordprocessingCanvas" xmlns:cx="http://schemas.microsoft.com/office/drawing/2014/chartex" xmlns:cx1="http://schemas.microsoft.com/office/drawing/2015/9/8/chartex" xmlns:cx2="http://schemas.microsoft.com/office/drawing/2015/10/21/chartex" xmlns:cx3="http://schemas.microsoft.com/office/drawing/2016/5/9/chartex" xmlns:cx4="http://schemas.microsoft.com/office/drawing/2016/5/10/chartex" xmlns:cx5="http://schemas.microsoft.com/office/drawing/2016/5/11/chartex" xmlns:cx6="http://schemas.microsoft.com/office/drawing/2016/5/12/chartex" xmlns:cx7="http://schemas.microsoft.com/office/drawing/2016/5/13/chartex" xmlns:cx8="http://schemas.microsoft.com/office/drawing/2016/5/14/chartex" xmlns:mc="http://schemas.openxmlformats.org/markup-compatibility/2006" xmlns:aink="http://schemas.microsoft.com/office/drawing/2016/ink" xmlns:am3d="http://schemas.microsoft.com/office/drawing/2017/model3d" xmlns:o="urn:schemas-microsoft-com:office:office" xmlns:oel="http://schemas.microsoft.com/office/2019/extlst" xmlns:r="http://schemas.openxmlformats.org/officeDocument/2006/relationships" xmlns:m="http://schemas.openxmlformats.org/officeDocument/2006/math" xmlns:v="urn:schemas-microsoft-com:vml" xmlns:wp14="http://schemas.microsoft.com/office/word/2010/wordprocessingDrawing" xmlns:wp="http://schemas.openxmlformats.org/drawingml/2006/wordprocessingDrawing" xmlns:w10="urn:schemas-microsoft-com:office:word" xmlns:w="http://schemas.openxmlformats.org/wordprocessingml/2006/main" xmlns:w14="http://schemas.microsoft.com/office/word/2010/wordml" xmlns:w15="http://schemas.microsoft.com/office/word/2012/wordml" xmlns:w16cex="http://schemas.microsoft.com/office/word/2018/wordml/cex" xmlns:w16cid="http://schemas.microsoft.com/office/word/2016/wordml/cid" xmlns:w16="http://schemas.microsoft.com/office/word/2018/wordml" xmlns:w16du="http://schemas.microsoft.com/office/word/2023/wordml/word16du" xmlns:w16sdtdh="http://schemas.microsoft.com/office/word/2020/wordml/sdtdatahash" xmlns:w16sdtfl="http://schemas.microsoft.com/office/word/2024/wordml/sdtformatlock" xmlns:w16se="http://schemas.microsoft.com/office/word/2015/wordml/symex" xmlns:wpg="http://schemas.microsoft.com/office/word/2010/wordprocessingGroup" xmlns:wpi="http://schemas.microsoft.com/office/word/2010/wordprocessingInk" xmlns:wne="http://schemas.microsoft.com/office/word/2006/wordml" xmlns:wps="http://schemas.microsoft.com/office/word/2010/wordprocessingShape" mc:Ignorable="w14 w15 w16se w16cid w16 w16cex w16sdtdh w16sdtfl w16du wp14">
   <w:p>
     <w:pPr>
-      <w:pStyle w:val="Ttulo4"/>
+      <w:pStyle w:val="Heading4"/>
       <w:numPr>
         <w:ilvl w:val="0"/>
         <w:numId w:val="0"/>
@@ -6130,7 +6884,7 @@
   </w:p>
   <w:p>
     <w:pPr>
-      <w:pStyle w:val="Encabezado"/>
+      <w:pStyle w:val="Header"/>
       <w:tabs>
         <w:tab w:val="right" w:pos="8981"/>
       </w:tabs>
@@ -6186,7 +6940,7 @@
   </w:p>
   <w:tbl>
     <w:tblPr>
-      <w:tblStyle w:val="Tablaconcuadrcula"/>
+      <w:tblStyle w:val="TableGrid"/>
       <w:tblW w:w="0" w:type="auto"/>
       <w:tblBorders>
         <w:top w:val="none" w:sz="0" w:space="0" w:color="auto"/>
@@ -6209,7 +6963,7 @@
         </w:tcPr>
         <w:p>
           <w:pPr>
-            <w:pStyle w:val="Encabezado"/>
+            <w:pStyle w:val="Header"/>
             <w:tabs>
               <w:tab w:val="right" w:pos="8981"/>
             </w:tabs>
@@ -6233,7 +6987,7 @@
         </w:tcPr>
         <w:p>
           <w:pPr>
-            <w:pStyle w:val="Encabezado"/>
+            <w:pStyle w:val="Header"/>
             <w:tabs>
               <w:tab w:val="right" w:pos="8981"/>
             </w:tabs>
@@ -6265,7 +7019,7 @@
         </w:tcPr>
         <w:p>
           <w:pPr>
-            <w:pStyle w:val="Encabezado"/>
+            <w:pStyle w:val="Header"/>
             <w:tabs>
               <w:tab w:val="right" w:pos="8981"/>
             </w:tabs>
@@ -6331,7 +7085,7 @@
         </w:tcPr>
         <w:p>
           <w:pPr>
-            <w:pStyle w:val="Encabezado"/>
+            <w:pStyle w:val="Header"/>
             <w:tabs>
               <w:tab w:val="right" w:pos="8981"/>
             </w:tabs>
@@ -6388,7 +7142,7 @@
   </w:tbl>
   <w:p>
     <w:pPr>
-      <w:pStyle w:val="Encabezado"/>
+      <w:pStyle w:val="Header"/>
     </w:pPr>
   </w:p>
 </w:hdr>
@@ -6403,7 +7157,7 @@
     <w:lvl w:ilvl="0">
       <w:start w:val="1"/>
       <w:numFmt w:val="decimal"/>
-      <w:pStyle w:val="Listaconnmeros"/>
+      <w:pStyle w:val="ListNumber"/>
       <w:lvlText w:val="%1."/>
       <w:lvlJc w:val="left"/>
       <w:pPr>
@@ -6421,7 +7175,7 @@
     <w:lvl w:ilvl="0">
       <w:start w:val="1"/>
       <w:numFmt w:val="bullet"/>
-      <w:pStyle w:val="Listaconvietas"/>
+      <w:pStyle w:val="ListBullet"/>
       <w:lvlText w:val=""/>
       <w:lvlJc w:val="left"/>
       <w:pPr>
@@ -9690,7 +10444,7 @@
     <w:lvl w:ilvl="0">
       <w:start w:val="1"/>
       <w:numFmt w:val="decimal"/>
-      <w:pStyle w:val="Ttulo1"/>
+      <w:pStyle w:val="Heading1"/>
       <w:lvlText w:val="%1"/>
       <w:lvlJc w:val="left"/>
       <w:pPr>
@@ -9700,7 +10454,7 @@
     <w:lvl w:ilvl="1">
       <w:start w:val="1"/>
       <w:numFmt w:val="decimal"/>
-      <w:pStyle w:val="Ttulo2"/>
+      <w:pStyle w:val="Heading2"/>
       <w:lvlText w:val="%1.%2"/>
       <w:lvlJc w:val="left"/>
       <w:pPr>
@@ -9710,7 +10464,7 @@
     <w:lvl w:ilvl="2">
       <w:start w:val="1"/>
       <w:numFmt w:val="decimal"/>
-      <w:pStyle w:val="Ttulo3"/>
+      <w:pStyle w:val="Heading3"/>
       <w:lvlText w:val="%1.%2.%3"/>
       <w:lvlJc w:val="left"/>
       <w:pPr>
@@ -9720,7 +10474,7 @@
     <w:lvl w:ilvl="3">
       <w:start w:val="1"/>
       <w:numFmt w:val="decimal"/>
-      <w:pStyle w:val="Ttulo4"/>
+      <w:pStyle w:val="Heading4"/>
       <w:lvlText w:val="%1.%2.%3.%4"/>
       <w:lvlJc w:val="left"/>
       <w:pPr>
@@ -9730,7 +10484,7 @@
     <w:lvl w:ilvl="4">
       <w:start w:val="1"/>
       <w:numFmt w:val="decimal"/>
-      <w:pStyle w:val="Ttulo5"/>
+      <w:pStyle w:val="Heading5"/>
       <w:lvlText w:val="%1.%2.%3.%4.%5"/>
       <w:lvlJc w:val="left"/>
       <w:pPr>
@@ -9740,7 +10494,7 @@
     <w:lvl w:ilvl="5">
       <w:start w:val="1"/>
       <w:numFmt w:val="decimal"/>
-      <w:pStyle w:val="Ttulo6"/>
+      <w:pStyle w:val="Heading6"/>
       <w:lvlText w:val="%1.%2.%3.%4.%5.%6"/>
       <w:lvlJc w:val="left"/>
       <w:pPr>
@@ -9750,7 +10504,7 @@
     <w:lvl w:ilvl="6">
       <w:start w:val="1"/>
       <w:numFmt w:val="decimal"/>
-      <w:pStyle w:val="Ttulo7"/>
+      <w:pStyle w:val="Heading7"/>
       <w:lvlText w:val="%1.%2.%3.%4.%5.%6.%7"/>
       <w:lvlJc w:val="left"/>
       <w:pPr>
@@ -9760,7 +10514,7 @@
     <w:lvl w:ilvl="7">
       <w:start w:val="1"/>
       <w:numFmt w:val="decimal"/>
-      <w:pStyle w:val="Ttulo8"/>
+      <w:pStyle w:val="Heading8"/>
       <w:lvlText w:val="%1.%2.%3.%4.%5.%6.%7.%8"/>
       <w:lvlJc w:val="left"/>
       <w:pPr>
@@ -9770,7 +10524,7 @@
     <w:lvl w:ilvl="8">
       <w:start w:val="1"/>
       <w:numFmt w:val="decimal"/>
-      <w:pStyle w:val="Ttulo9"/>
+      <w:pStyle w:val="Heading9"/>
       <w:lvlText w:val="%1.%2.%3.%4.%5.%6.%7.%8.%9"/>
       <w:lvlJc w:val="left"/>
       <w:pPr>
@@ -12197,11 +12951,11 @@
       <w:szCs w:val="22"/>
     </w:rPr>
   </w:style>
-  <w:style w:type="paragraph" w:styleId="Ttulo1">
+  <w:style w:type="paragraph" w:styleId="Heading1">
     <w:name w:val="heading 1"/>
     <w:basedOn w:val="Normal"/>
     <w:next w:val="Normal"/>
-    <w:link w:val="Ttulo1Car"/>
+    <w:link w:val="Heading1Char"/>
     <w:uiPriority w:val="9"/>
     <w:qFormat/>
     <w:rsid w:val="00905485"/>
@@ -12221,11 +12975,11 @@
       <w:szCs w:val="40"/>
     </w:rPr>
   </w:style>
-  <w:style w:type="paragraph" w:styleId="Ttulo2">
+  <w:style w:type="paragraph" w:styleId="Heading2">
     <w:name w:val="heading 2"/>
     <w:basedOn w:val="Normal"/>
     <w:next w:val="Normal"/>
-    <w:link w:val="Ttulo2Car"/>
+    <w:link w:val="Heading2Char"/>
     <w:uiPriority w:val="9"/>
     <w:unhideWhenUsed/>
     <w:qFormat/>
@@ -12247,11 +13001,11 @@
       <w:szCs w:val="32"/>
     </w:rPr>
   </w:style>
-  <w:style w:type="paragraph" w:styleId="Ttulo3">
+  <w:style w:type="paragraph" w:styleId="Heading3">
     <w:name w:val="heading 3"/>
     <w:basedOn w:val="Normal"/>
     <w:next w:val="Normal"/>
-    <w:link w:val="Ttulo3Car"/>
+    <w:link w:val="Heading3Char"/>
     <w:uiPriority w:val="9"/>
     <w:unhideWhenUsed/>
     <w:qFormat/>
@@ -12273,11 +13027,11 @@
       <w:szCs w:val="28"/>
     </w:rPr>
   </w:style>
-  <w:style w:type="paragraph" w:styleId="Ttulo4">
+  <w:style w:type="paragraph" w:styleId="Heading4">
     <w:name w:val="heading 4"/>
     <w:basedOn w:val="Normal"/>
     <w:next w:val="Normal"/>
-    <w:link w:val="Ttulo4Car"/>
+    <w:link w:val="Heading4Char"/>
     <w:uiPriority w:val="9"/>
     <w:unhideWhenUsed/>
     <w:qFormat/>
@@ -12299,11 +13053,11 @@
       <w:color w:val="0F4761" w:themeColor="accent1" w:themeShade="BF"/>
     </w:rPr>
   </w:style>
-  <w:style w:type="paragraph" w:styleId="Ttulo5">
+  <w:style w:type="paragraph" w:styleId="Heading5">
     <w:name w:val="heading 5"/>
     <w:basedOn w:val="Normal"/>
     <w:next w:val="Normal"/>
-    <w:link w:val="Ttulo5Car"/>
+    <w:link w:val="Heading5Char"/>
     <w:uiPriority w:val="9"/>
     <w:semiHidden/>
     <w:unhideWhenUsed/>
@@ -12324,11 +13078,11 @@
       <w:color w:val="0F4761" w:themeColor="accent1" w:themeShade="BF"/>
     </w:rPr>
   </w:style>
-  <w:style w:type="paragraph" w:styleId="Ttulo6">
+  <w:style w:type="paragraph" w:styleId="Heading6">
     <w:name w:val="heading 6"/>
     <w:basedOn w:val="Normal"/>
     <w:next w:val="Normal"/>
-    <w:link w:val="Ttulo6Car"/>
+    <w:link w:val="Heading6Char"/>
     <w:uiPriority w:val="9"/>
     <w:semiHidden/>
     <w:unhideWhenUsed/>
@@ -12351,11 +13105,11 @@
       <w:color w:val="595959" w:themeColor="text1" w:themeTint="A6"/>
     </w:rPr>
   </w:style>
-  <w:style w:type="paragraph" w:styleId="Ttulo7">
+  <w:style w:type="paragraph" w:styleId="Heading7">
     <w:name w:val="heading 7"/>
     <w:basedOn w:val="Normal"/>
     <w:next w:val="Normal"/>
-    <w:link w:val="Ttulo7Car"/>
+    <w:link w:val="Heading7Char"/>
     <w:uiPriority w:val="9"/>
     <w:semiHidden/>
     <w:unhideWhenUsed/>
@@ -12376,11 +13130,11 @@
       <w:color w:val="595959" w:themeColor="text1" w:themeTint="A6"/>
     </w:rPr>
   </w:style>
-  <w:style w:type="paragraph" w:styleId="Ttulo8">
+  <w:style w:type="paragraph" w:styleId="Heading8">
     <w:name w:val="heading 8"/>
     <w:basedOn w:val="Normal"/>
     <w:next w:val="Normal"/>
-    <w:link w:val="Ttulo8Car"/>
+    <w:link w:val="Heading8Char"/>
     <w:uiPriority w:val="9"/>
     <w:semiHidden/>
     <w:unhideWhenUsed/>
@@ -12403,11 +13157,11 @@
       <w:color w:val="272727" w:themeColor="text1" w:themeTint="D8"/>
     </w:rPr>
   </w:style>
-  <w:style w:type="paragraph" w:styleId="Ttulo9">
+  <w:style w:type="paragraph" w:styleId="Heading9">
     <w:name w:val="heading 9"/>
     <w:basedOn w:val="Normal"/>
     <w:next w:val="Normal"/>
-    <w:link w:val="Ttulo9Car"/>
+    <w:link w:val="Heading9Char"/>
     <w:uiPriority w:val="9"/>
     <w:semiHidden/>
     <w:unhideWhenUsed/>
@@ -12428,12 +13182,13 @@
       <w:color w:val="272727" w:themeColor="text1" w:themeTint="D8"/>
     </w:rPr>
   </w:style>
-  <w:style w:type="character" w:default="1" w:styleId="Fuentedeprrafopredeter">
+  <w:style w:type="character" w:default="1" w:styleId="DefaultParagraphFont">
     <w:name w:val="Default Paragraph Font"/>
     <w:uiPriority w:val="1"/>
+    <w:semiHidden/>
     <w:unhideWhenUsed/>
   </w:style>
-  <w:style w:type="table" w:default="1" w:styleId="Tablanormal">
+  <w:style w:type="table" w:default="1" w:styleId="TableNormal">
     <w:name w:val="Normal Table"/>
     <w:uiPriority w:val="99"/>
     <w:semiHidden/>
@@ -12448,16 +13203,16 @@
       </w:tblCellMar>
     </w:tblPr>
   </w:style>
-  <w:style w:type="numbering" w:default="1" w:styleId="Sinlista">
+  <w:style w:type="numbering" w:default="1" w:styleId="NoList">
     <w:name w:val="No List"/>
     <w:uiPriority w:val="99"/>
     <w:semiHidden/>
     <w:unhideWhenUsed/>
   </w:style>
-  <w:style w:type="character" w:customStyle="1" w:styleId="Ttulo1Car">
-    <w:name w:val="Título 1 Car"/>
-    <w:basedOn w:val="Fuentedeprrafopredeter"/>
-    <w:link w:val="Ttulo1"/>
+  <w:style w:type="character" w:customStyle="1" w:styleId="Heading1Char">
+    <w:name w:val="Heading 1 Char"/>
+    <w:basedOn w:val="DefaultParagraphFont"/>
+    <w:link w:val="Heading1"/>
     <w:uiPriority w:val="9"/>
     <w:rsid w:val="00905485"/>
     <w:rPr>
@@ -12467,10 +13222,10 @@
       <w:szCs w:val="40"/>
     </w:rPr>
   </w:style>
-  <w:style w:type="character" w:customStyle="1" w:styleId="Ttulo2Car">
-    <w:name w:val="Título 2 Car"/>
-    <w:basedOn w:val="Fuentedeprrafopredeter"/>
-    <w:link w:val="Ttulo2"/>
+  <w:style w:type="character" w:customStyle="1" w:styleId="Heading2Char">
+    <w:name w:val="Heading 2 Char"/>
+    <w:basedOn w:val="DefaultParagraphFont"/>
+    <w:link w:val="Heading2"/>
     <w:uiPriority w:val="9"/>
     <w:rsid w:val="00905485"/>
     <w:rPr>
@@ -12480,10 +13235,10 @@
       <w:szCs w:val="32"/>
     </w:rPr>
   </w:style>
-  <w:style w:type="character" w:customStyle="1" w:styleId="Ttulo3Car">
-    <w:name w:val="Título 3 Car"/>
-    <w:basedOn w:val="Fuentedeprrafopredeter"/>
-    <w:link w:val="Ttulo3"/>
+  <w:style w:type="character" w:customStyle="1" w:styleId="Heading3Char">
+    <w:name w:val="Heading 3 Char"/>
+    <w:basedOn w:val="DefaultParagraphFont"/>
+    <w:link w:val="Heading3"/>
     <w:uiPriority w:val="9"/>
     <w:rsid w:val="00905485"/>
     <w:rPr>
@@ -12493,10 +13248,10 @@
       <w:szCs w:val="28"/>
     </w:rPr>
   </w:style>
-  <w:style w:type="character" w:customStyle="1" w:styleId="Ttulo4Car">
-    <w:name w:val="Título 4 Car"/>
-    <w:basedOn w:val="Fuentedeprrafopredeter"/>
-    <w:link w:val="Ttulo4"/>
+  <w:style w:type="character" w:customStyle="1" w:styleId="Heading4Char">
+    <w:name w:val="Heading 4 Char"/>
+    <w:basedOn w:val="DefaultParagraphFont"/>
+    <w:link w:val="Heading4"/>
     <w:uiPriority w:val="9"/>
     <w:rsid w:val="00905485"/>
     <w:rPr>
@@ -12506,10 +13261,10 @@
       <w:color w:val="0F4761" w:themeColor="accent1" w:themeShade="BF"/>
     </w:rPr>
   </w:style>
-  <w:style w:type="character" w:customStyle="1" w:styleId="Ttulo5Car">
-    <w:name w:val="Título 5 Car"/>
-    <w:basedOn w:val="Fuentedeprrafopredeter"/>
-    <w:link w:val="Ttulo5"/>
+  <w:style w:type="character" w:customStyle="1" w:styleId="Heading5Char">
+    <w:name w:val="Heading 5 Char"/>
+    <w:basedOn w:val="DefaultParagraphFont"/>
+    <w:link w:val="Heading5"/>
     <w:uiPriority w:val="9"/>
     <w:semiHidden/>
     <w:rsid w:val="00905485"/>
@@ -12518,10 +13273,10 @@
       <w:color w:val="0F4761" w:themeColor="accent1" w:themeShade="BF"/>
     </w:rPr>
   </w:style>
-  <w:style w:type="character" w:customStyle="1" w:styleId="Ttulo6Car">
-    <w:name w:val="Título 6 Car"/>
-    <w:basedOn w:val="Fuentedeprrafopredeter"/>
-    <w:link w:val="Ttulo6"/>
+  <w:style w:type="character" w:customStyle="1" w:styleId="Heading6Char">
+    <w:name w:val="Heading 6 Char"/>
+    <w:basedOn w:val="DefaultParagraphFont"/>
+    <w:link w:val="Heading6"/>
     <w:uiPriority w:val="9"/>
     <w:semiHidden/>
     <w:rsid w:val="00905485"/>
@@ -12532,10 +13287,10 @@
       <w:color w:val="595959" w:themeColor="text1" w:themeTint="A6"/>
     </w:rPr>
   </w:style>
-  <w:style w:type="character" w:customStyle="1" w:styleId="Ttulo7Car">
-    <w:name w:val="Título 7 Car"/>
-    <w:basedOn w:val="Fuentedeprrafopredeter"/>
-    <w:link w:val="Ttulo7"/>
+  <w:style w:type="character" w:customStyle="1" w:styleId="Heading7Char">
+    <w:name w:val="Heading 7 Char"/>
+    <w:basedOn w:val="DefaultParagraphFont"/>
+    <w:link w:val="Heading7"/>
     <w:uiPriority w:val="9"/>
     <w:semiHidden/>
     <w:rsid w:val="00905485"/>
@@ -12544,10 +13299,10 @@
       <w:color w:val="595959" w:themeColor="text1" w:themeTint="A6"/>
     </w:rPr>
   </w:style>
-  <w:style w:type="character" w:customStyle="1" w:styleId="Ttulo8Car">
-    <w:name w:val="Título 8 Car"/>
-    <w:basedOn w:val="Fuentedeprrafopredeter"/>
-    <w:link w:val="Ttulo8"/>
+  <w:style w:type="character" w:customStyle="1" w:styleId="Heading8Char">
+    <w:name w:val="Heading 8 Char"/>
+    <w:basedOn w:val="DefaultParagraphFont"/>
+    <w:link w:val="Heading8"/>
     <w:uiPriority w:val="9"/>
     <w:semiHidden/>
     <w:rsid w:val="00905485"/>
@@ -12558,10 +13313,10 @@
       <w:color w:val="272727" w:themeColor="text1" w:themeTint="D8"/>
     </w:rPr>
   </w:style>
-  <w:style w:type="character" w:customStyle="1" w:styleId="Ttulo9Car">
-    <w:name w:val="Título 9 Car"/>
-    <w:basedOn w:val="Fuentedeprrafopredeter"/>
-    <w:link w:val="Ttulo9"/>
+  <w:style w:type="character" w:customStyle="1" w:styleId="Heading9Char">
+    <w:name w:val="Heading 9 Char"/>
+    <w:basedOn w:val="DefaultParagraphFont"/>
+    <w:link w:val="Heading9"/>
     <w:uiPriority w:val="9"/>
     <w:semiHidden/>
     <w:rsid w:val="00905485"/>
@@ -12570,11 +13325,11 @@
       <w:color w:val="272727" w:themeColor="text1" w:themeTint="D8"/>
     </w:rPr>
   </w:style>
-  <w:style w:type="paragraph" w:styleId="Ttulo">
+  <w:style w:type="paragraph" w:styleId="Title">
     <w:name w:val="Title"/>
     <w:basedOn w:val="Normal"/>
     <w:next w:val="Normal"/>
-    <w:link w:val="TtuloCar"/>
+    <w:link w:val="TitleChar"/>
     <w:uiPriority w:val="10"/>
     <w:qFormat/>
     <w:rsid w:val="00905485"/>
@@ -12590,10 +13345,10 @@
       <w:szCs w:val="56"/>
     </w:rPr>
   </w:style>
-  <w:style w:type="character" w:customStyle="1" w:styleId="TtuloCar">
-    <w:name w:val="Título Car"/>
-    <w:basedOn w:val="Fuentedeprrafopredeter"/>
-    <w:link w:val="Ttulo"/>
+  <w:style w:type="character" w:customStyle="1" w:styleId="TitleChar">
+    <w:name w:val="Title Char"/>
+    <w:basedOn w:val="DefaultParagraphFont"/>
+    <w:link w:val="Title"/>
     <w:uiPriority w:val="10"/>
     <w:rsid w:val="00905485"/>
     <w:rPr>
@@ -12604,11 +13359,11 @@
       <w:szCs w:val="56"/>
     </w:rPr>
   </w:style>
-  <w:style w:type="paragraph" w:styleId="Subttulo">
+  <w:style w:type="paragraph" w:styleId="Subtitle">
     <w:name w:val="Subtitle"/>
     <w:basedOn w:val="Normal"/>
     <w:next w:val="Normal"/>
-    <w:link w:val="SubttuloCar"/>
+    <w:link w:val="SubtitleChar"/>
     <w:uiPriority w:val="11"/>
     <w:qFormat/>
     <w:rsid w:val="00905485"/>
@@ -12625,10 +13380,10 @@
       <w:szCs w:val="28"/>
     </w:rPr>
   </w:style>
-  <w:style w:type="character" w:customStyle="1" w:styleId="SubttuloCar">
-    <w:name w:val="Subtítulo Car"/>
-    <w:basedOn w:val="Fuentedeprrafopredeter"/>
-    <w:link w:val="Subttulo"/>
+  <w:style w:type="character" w:customStyle="1" w:styleId="SubtitleChar">
+    <w:name w:val="Subtitle Char"/>
+    <w:basedOn w:val="DefaultParagraphFont"/>
+    <w:link w:val="Subtitle"/>
     <w:uiPriority w:val="11"/>
     <w:rsid w:val="00905485"/>
     <w:rPr>
@@ -12639,11 +13394,11 @@
       <w:szCs w:val="28"/>
     </w:rPr>
   </w:style>
-  <w:style w:type="paragraph" w:styleId="Cita">
+  <w:style w:type="paragraph" w:styleId="Quote">
     <w:name w:val="Quote"/>
     <w:basedOn w:val="Normal"/>
     <w:next w:val="Normal"/>
-    <w:link w:val="CitaCar"/>
+    <w:link w:val="QuoteChar"/>
     <w:uiPriority w:val="29"/>
     <w:qFormat/>
     <w:rsid w:val="00905485"/>
@@ -12657,10 +13412,10 @@
       <w:color w:val="404040" w:themeColor="text1" w:themeTint="BF"/>
     </w:rPr>
   </w:style>
-  <w:style w:type="character" w:customStyle="1" w:styleId="CitaCar">
-    <w:name w:val="Cita Car"/>
-    <w:basedOn w:val="Fuentedeprrafopredeter"/>
-    <w:link w:val="Cita"/>
+  <w:style w:type="character" w:customStyle="1" w:styleId="QuoteChar">
+    <w:name w:val="Quote Char"/>
+    <w:basedOn w:val="DefaultParagraphFont"/>
+    <w:link w:val="Quote"/>
     <w:uiPriority w:val="29"/>
     <w:rsid w:val="00905485"/>
     <w:rPr>
@@ -12669,7 +13424,7 @@
       <w:color w:val="404040" w:themeColor="text1" w:themeTint="BF"/>
     </w:rPr>
   </w:style>
-  <w:style w:type="paragraph" w:styleId="Prrafodelista">
+  <w:style w:type="paragraph" w:styleId="ListParagraph">
     <w:name w:val="List Paragraph"/>
     <w:basedOn w:val="Normal"/>
     <w:uiPriority w:val="34"/>
@@ -12680,9 +13435,9 @@
       <w:contextualSpacing/>
     </w:pPr>
   </w:style>
-  <w:style w:type="character" w:styleId="nfasisintenso">
+  <w:style w:type="character" w:styleId="IntenseEmphasis">
     <w:name w:val="Intense Emphasis"/>
-    <w:basedOn w:val="Fuentedeprrafopredeter"/>
+    <w:basedOn w:val="DefaultParagraphFont"/>
     <w:uiPriority w:val="21"/>
     <w:qFormat/>
     <w:rsid w:val="00905485"/>
@@ -12692,11 +13447,11 @@
       <w:color w:val="0F4761" w:themeColor="accent1" w:themeShade="BF"/>
     </w:rPr>
   </w:style>
-  <w:style w:type="paragraph" w:styleId="Citadestacada">
+  <w:style w:type="paragraph" w:styleId="IntenseQuote">
     <w:name w:val="Intense Quote"/>
     <w:basedOn w:val="Normal"/>
     <w:next w:val="Normal"/>
-    <w:link w:val="CitadestacadaCar"/>
+    <w:link w:val="IntenseQuoteChar"/>
     <w:uiPriority w:val="30"/>
     <w:qFormat/>
     <w:rsid w:val="00905485"/>
@@ -12715,10 +13470,10 @@
       <w:color w:val="0F4761" w:themeColor="accent1" w:themeShade="BF"/>
     </w:rPr>
   </w:style>
-  <w:style w:type="character" w:customStyle="1" w:styleId="CitadestacadaCar">
-    <w:name w:val="Cita destacada Car"/>
-    <w:basedOn w:val="Fuentedeprrafopredeter"/>
-    <w:link w:val="Citadestacada"/>
+  <w:style w:type="character" w:customStyle="1" w:styleId="IntenseQuoteChar">
+    <w:name w:val="Intense Quote Char"/>
+    <w:basedOn w:val="DefaultParagraphFont"/>
+    <w:link w:val="IntenseQuote"/>
     <w:uiPriority w:val="30"/>
     <w:rsid w:val="00905485"/>
     <w:rPr>
@@ -12727,9 +13482,9 @@
       <w:color w:val="0F4761" w:themeColor="accent1" w:themeShade="BF"/>
     </w:rPr>
   </w:style>
-  <w:style w:type="character" w:styleId="Referenciaintensa">
+  <w:style w:type="character" w:styleId="IntenseReference">
     <w:name w:val="Intense Reference"/>
-    <w:basedOn w:val="Fuentedeprrafopredeter"/>
+    <w:basedOn w:val="DefaultParagraphFont"/>
     <w:uiPriority w:val="32"/>
     <w:qFormat/>
     <w:rsid w:val="00905485"/>
@@ -12741,10 +13496,10 @@
       <w:spacing w:val="5"/>
     </w:rPr>
   </w:style>
-  <w:style w:type="paragraph" w:styleId="Encabezado">
+  <w:style w:type="paragraph" w:styleId="Header">
     <w:name w:val="header"/>
     <w:basedOn w:val="Normal"/>
-    <w:link w:val="EncabezadoCar"/>
+    <w:link w:val="HeaderChar"/>
     <w:unhideWhenUsed/>
     <w:rsid w:val="008F19D0"/>
     <w:pPr>
@@ -12755,10 +13510,10 @@
       <w:spacing w:after="0" w:line="240" w:lineRule="auto"/>
     </w:pPr>
   </w:style>
-  <w:style w:type="character" w:customStyle="1" w:styleId="EncabezadoCar">
-    <w:name w:val="Encabezado Car"/>
-    <w:basedOn w:val="Fuentedeprrafopredeter"/>
-    <w:link w:val="Encabezado"/>
+  <w:style w:type="character" w:customStyle="1" w:styleId="HeaderChar">
+    <w:name w:val="Header Char"/>
+    <w:basedOn w:val="DefaultParagraphFont"/>
+    <w:link w:val="Header"/>
     <w:uiPriority w:val="99"/>
     <w:rsid w:val="008F19D0"/>
     <w:rPr>
@@ -12766,10 +13521,10 @@
       <w:szCs w:val="22"/>
     </w:rPr>
   </w:style>
-  <w:style w:type="paragraph" w:styleId="Piedepgina">
+  <w:style w:type="paragraph" w:styleId="Footer">
     <w:name w:val="footer"/>
     <w:basedOn w:val="Normal"/>
-    <w:link w:val="PiedepginaCar"/>
+    <w:link w:val="FooterChar"/>
     <w:uiPriority w:val="99"/>
     <w:unhideWhenUsed/>
     <w:rsid w:val="008F19D0"/>
@@ -12781,10 +13536,10 @@
       <w:spacing w:after="0" w:line="240" w:lineRule="auto"/>
     </w:pPr>
   </w:style>
-  <w:style w:type="character" w:customStyle="1" w:styleId="PiedepginaCar">
-    <w:name w:val="Pie de página Car"/>
-    <w:basedOn w:val="Fuentedeprrafopredeter"/>
-    <w:link w:val="Piedepgina"/>
+  <w:style w:type="character" w:customStyle="1" w:styleId="FooterChar">
+    <w:name w:val="Footer Char"/>
+    <w:basedOn w:val="DefaultParagraphFont"/>
+    <w:link w:val="Footer"/>
     <w:uiPriority w:val="99"/>
     <w:rsid w:val="008F19D0"/>
     <w:rPr>
@@ -12810,9 +13565,9 @@
       <w14:ligatures w14:val="none"/>
     </w:rPr>
   </w:style>
-  <w:style w:type="paragraph" w:styleId="TtuloTDC">
+  <w:style w:type="paragraph" w:styleId="TOCHeading">
     <w:name w:val="TOC Heading"/>
-    <w:basedOn w:val="Ttulo1"/>
+    <w:basedOn w:val="Heading1"/>
     <w:next w:val="Normal"/>
     <w:uiPriority w:val="39"/>
     <w:unhideWhenUsed/>
@@ -12830,7 +13585,7 @@
       <w14:ligatures w14:val="none"/>
     </w:rPr>
   </w:style>
-  <w:style w:type="paragraph" w:styleId="TDC2">
+  <w:style w:type="paragraph" w:styleId="TOC2">
     <w:name w:val="toc 2"/>
     <w:basedOn w:val="Normal"/>
     <w:next w:val="Normal"/>
@@ -12843,7 +13598,7 @@
       <w:ind w:left="220"/>
     </w:pPr>
   </w:style>
-  <w:style w:type="paragraph" w:styleId="TDC3">
+  <w:style w:type="paragraph" w:styleId="TOC3">
     <w:name w:val="toc 3"/>
     <w:basedOn w:val="Normal"/>
     <w:next w:val="Normal"/>
@@ -12856,9 +13611,9 @@
       <w:ind w:left="440"/>
     </w:pPr>
   </w:style>
-  <w:style w:type="character" w:styleId="Hipervnculo">
+  <w:style w:type="character" w:styleId="Hyperlink">
     <w:name w:val="Hyperlink"/>
-    <w:basedOn w:val="Fuentedeprrafopredeter"/>
+    <w:basedOn w:val="DefaultParagraphFont"/>
     <w:uiPriority w:val="99"/>
     <w:unhideWhenUsed/>
     <w:rsid w:val="003F51F5"/>
@@ -12867,9 +13622,9 @@
       <w:u w:val="single"/>
     </w:rPr>
   </w:style>
-  <w:style w:type="paragraph" w:styleId="Sinespaciado">
+  <w:style w:type="paragraph" w:styleId="NoSpacing">
     <w:name w:val="No Spacing"/>
-    <w:link w:val="SinespaciadoCar"/>
+    <w:link w:val="NoSpacingChar"/>
     <w:uiPriority w:val="1"/>
     <w:qFormat/>
     <w:rsid w:val="006B1FCD"/>
@@ -12885,10 +13640,10 @@
       <w14:ligatures w14:val="none"/>
     </w:rPr>
   </w:style>
-  <w:style w:type="character" w:customStyle="1" w:styleId="SinespaciadoCar">
-    <w:name w:val="Sin espaciado Car"/>
-    <w:basedOn w:val="Fuentedeprrafopredeter"/>
-    <w:link w:val="Sinespaciado"/>
+  <w:style w:type="character" w:customStyle="1" w:styleId="NoSpacingChar">
+    <w:name w:val="No Spacing Char"/>
+    <w:basedOn w:val="DefaultParagraphFont"/>
+    <w:link w:val="NoSpacing"/>
     <w:uiPriority w:val="1"/>
     <w:rsid w:val="006B1FCD"/>
     <w:rPr>
@@ -12900,9 +13655,9 @@
       <w14:ligatures w14:val="none"/>
     </w:rPr>
   </w:style>
-  <w:style w:type="table" w:styleId="Tablaconcuadrcula">
+  <w:style w:type="table" w:styleId="TableGrid">
     <w:name w:val="Table Grid"/>
-    <w:basedOn w:val="Tablanormal"/>
+    <w:basedOn w:val="TableNormal"/>
     <w:uiPriority w:val="59"/>
     <w:rsid w:val="00BC7368"/>
     <w:pPr>
@@ -12927,9 +13682,9 @@
       </w:tblBorders>
     </w:tblPr>
   </w:style>
-  <w:style w:type="character" w:styleId="Mencinsinresolver">
+  <w:style w:type="character" w:styleId="UnresolvedMention">
     <w:name w:val="Unresolved Mention"/>
-    <w:basedOn w:val="Fuentedeprrafopredeter"/>
+    <w:basedOn w:val="DefaultParagraphFont"/>
     <w:uiPriority w:val="99"/>
     <w:semiHidden/>
     <w:unhideWhenUsed/>
@@ -12939,7 +13694,7 @@
       <w:shd w:val="clear" w:color="auto" w:fill="E1DFDD"/>
     </w:rPr>
   </w:style>
-  <w:style w:type="paragraph" w:styleId="TDC1">
+  <w:style w:type="paragraph" w:styleId="TOC1">
     <w:name w:val="toc 1"/>
     <w:basedOn w:val="Normal"/>
     <w:next w:val="Normal"/>
@@ -12951,9 +13706,9 @@
       <w:spacing w:after="100"/>
     </w:pPr>
   </w:style>
-  <w:style w:type="character" w:styleId="Textodelmarcadordeposicin">
+  <w:style w:type="character" w:styleId="PlaceholderText">
     <w:name w:val="Placeholder Text"/>
-    <w:basedOn w:val="Fuentedeprrafopredeter"/>
+    <w:basedOn w:val="DefaultParagraphFont"/>
     <w:uiPriority w:val="99"/>
     <w:semiHidden/>
     <w:rsid w:val="00106566"/>
@@ -12961,7 +13716,7 @@
       <w:color w:val="666666"/>
     </w:rPr>
   </w:style>
-  <w:style w:type="paragraph" w:styleId="Listaconvietas">
+  <w:style w:type="paragraph" w:styleId="ListBullet">
     <w:name w:val="List Bullet"/>
     <w:basedOn w:val="Normal"/>
     <w:uiPriority w:val="99"/>
@@ -12985,7 +13740,7 @@
       <w14:ligatures w14:val="none"/>
     </w:rPr>
   </w:style>
-  <w:style w:type="paragraph" w:styleId="Listaconnmeros">
+  <w:style w:type="paragraph" w:styleId="ListNumber">
     <w:name w:val="List Number"/>
     <w:basedOn w:val="Normal"/>
     <w:uiPriority w:val="99"/>

</xml_diff>

<commit_message>
Summarize platform functionality section
</commit_message>
<xml_diff>
--- a/docs/Informe VALCV.docx
+++ b/docs/Informe VALCV.docx
@@ -3784,7 +3784,7 @@
                 <w:rFonts w:ascii="Arial" w:hAnsi="Arial"/>
                 <w:sz w:val="20"/>
               </w:rPr>
-              <w:t>Acceso por usuarios y roles</w:t>
+              <w:t>Gestión de acceso y trazabilidad institucional</w:t>
             </w:r>
           </w:p>
         </w:tc>
@@ -3801,7 +3801,7 @@
                 <w:rFonts w:ascii="Arial" w:hAnsi="Arial"/>
                 <w:sz w:val="20"/>
               </w:rPr>
-              <w:t>La plataforma permite crear usuarios con nombre, apellido, cargo, área, código de empleado y rol. Cada rol habilita únicamente las acciones que le corresponden, por ejemplo administrar usuarios, crear plantillas, evaluar candidatos o solo consultar resultados.</w:t>
+              <w:t>La plataforma organiza el acceso por usuarios y roles, permitiendo que cada participante intervenga según sus responsabilidades. Esto fortalece la trazabilidad del proceso y reduce la exposición de funciones que no corresponden a cada perfil.</w:t>
             </w:r>
           </w:p>
         </w:tc>
@@ -3821,7 +3821,7 @@
                 <w:rFonts w:ascii="Arial" w:hAnsi="Arial"/>
                 <w:sz w:val="20"/>
               </w:rPr>
-              <w:t>Roles pensados para el proceso de selección</w:t>
+              <w:t>Publicación y recepción de postulaciones</w:t>
             </w:r>
           </w:p>
         </w:tc>
@@ -3838,7 +3838,7 @@
                 <w:rFonts w:ascii="Arial" w:hAnsi="Arial"/>
                 <w:sz w:val="20"/>
               </w:rPr>
-              <w:t>Se contemplan perfiles como Administrador, Gestor de plantillas, Evaluador, Recursos Humanos y Consulta. Esto ayuda a que cada participante intervenga en la parte del proceso que le corresponde, sin exponer funciones innecesarias.</w:t>
+              <w:t>El sistema permite publicar posiciones abiertas, distinguir procesos internos y externos, y recibir postulaciones con datos básicos y documentos de soporte. Esta capacidad disminuye la carga operativa de registrar manualmente cada participante.</w:t>
             </w:r>
           </w:p>
         </w:tc>
@@ -3858,7 +3858,7 @@
                 <w:rFonts w:ascii="Arial" w:hAnsi="Arial"/>
                 <w:sz w:val="20"/>
               </w:rPr>
-              <w:t>Contraseña temporal y administración de usuarios</w:t>
+              <w:t>Plantillas de evaluación configurables</w:t>
             </w:r>
           </w:p>
         </w:tc>
@@ -3875,7 +3875,7 @@
                 <w:rFonts w:ascii="Arial" w:hAnsi="Arial"/>
                 <w:sz w:val="20"/>
               </w:rPr>
-              <w:t>Los usuarios nuevos ingresan con una contraseña temporal y deben cambiarla en su primer acceso. Los administradores pueden editar la información institucional de cada usuario sin modificar su contraseña, y solo restablecerla cuando sea necesario mediante una acción explícita.</w:t>
+              <w:t>Las vacantes se evalúan mediante plantillas reutilizables que agrupan categorías, pesos y criterios. Esto facilita que los candidatos sean revisados con una estructura común, ajustable a las necesidades del perfil evaluado.</w:t>
             </w:r>
           </w:p>
         </w:tc>
@@ -3895,7 +3895,7 @@
                 <w:rFonts w:ascii="Arial" w:hAnsi="Arial"/>
                 <w:sz w:val="20"/>
               </w:rPr>
-              <w:t>Publicación de posiciones abiertas</w:t>
+              <w:t>Expediente digital del candidato</w:t>
             </w:r>
           </w:p>
         </w:tc>
@@ -3912,7 +3912,7 @@
                 <w:rFonts w:ascii="Arial" w:hAnsi="Arial"/>
                 <w:sz w:val="20"/>
               </w:rPr>
-              <w:t>Desde la plantilla se puede indicar si una posición está abierta o cerrada, y si corresponde a concurso interno o externo. Las posiciones abiertas se muestran en una vista pública para que las personas interesadas puedan conocer los procesos disponibles.</w:t>
+              <w:t>Cada candidato cuenta con un expediente documental centralizado, compuesto por archivos de soporte en PDF o imagen. La documentación puede consultarse desde la plataforma y servir como base de la evaluación técnica.</w:t>
             </w:r>
           </w:p>
         </w:tc>
@@ -3932,7 +3932,7 @@
                 <w:rFonts w:ascii="Arial" w:hAnsi="Arial"/>
                 <w:sz w:val="20"/>
               </w:rPr>
-              <w:t>Postulación en línea de participantes</w:t>
+              <w:t>Evaluación combinada: juicio experto e IA</w:t>
             </w:r>
           </w:p>
         </w:tc>
@@ -3949,7 +3949,7 @@
                 <w:rFonts w:ascii="Arial" w:hAnsi="Arial"/>
                 <w:sz w:val="20"/>
               </w:rPr>
-              <w:t>Los aspirantes pueden aplicar directamente desde la página pública, completando sus datos personales y cargando los documentos de soporte. Esto reduce el trabajo manual de crear candidatos y cargar expedientes uno por uno.</w:t>
+              <w:t>La plataforma integra criterios de evaluación manual y criterios asistidos por inteligencia artificial. La IA apoya la lectura y organización de evidencias, pero la revisión, validación y decisión final permanecen bajo responsabilidad humana.</w:t>
             </w:r>
           </w:p>
         </w:tc>
@@ -3969,7 +3969,7 @@
                 <w:rFonts w:ascii="Arial" w:hAnsi="Arial"/>
                 <w:sz w:val="20"/>
               </w:rPr>
-              <w:t>Control básico para concursos internos</w:t>
+              <w:t>Control de requisitos críticos y méritos adicionales</w:t>
             </w:r>
           </w:p>
         </w:tc>
@@ -3986,7 +3986,7 @@
                 <w:rFonts w:ascii="Arial" w:hAnsi="Arial"/>
                 <w:sz w:val="20"/>
               </w:rPr>
-              <w:t>Cuando una posición se marca como concurso interno, el formulario solicita correo institucional y código de empleado. Por el momento, mientras no se configure un servicio de correo, la validación se limita a exigir que el correo pertenezca al dominio sie.gov.do.</w:t>
+              <w:t>El sistema permite distinguir requisitos obligatorios que condicionan la elegibilidad del candidato y, de forma separada, reconocer méritos adicionales debidamente justificados sin desordenar la estructura principal de evaluación.</w:t>
             </w:r>
           </w:p>
         </w:tc>
@@ -4006,7 +4006,7 @@
                 <w:rFonts w:ascii="Arial" w:hAnsi="Arial"/>
                 <w:sz w:val="20"/>
               </w:rPr>
-              <w:t>Registro automático del expediente recibido</w:t>
+              <w:t>Resultados comparativos y reportes</w:t>
             </w:r>
           </w:p>
         </w:tc>
@@ -4023,7 +4023,7 @@
                 <w:rFonts w:ascii="Arial" w:hAnsi="Arial"/>
                 <w:sz w:val="20"/>
               </w:rPr>
-              <w:t>Cada postulación enviada desde la página pública crea automáticamente un candidato asociado a la posición correspondiente, con sus datos de contacto y documentos disponibles para revisión por los evaluadores.</w:t>
+              <w:t>La solución presenta resultados por perfil evaluado mediante vistas comparativas, rankings y reportes individuales. Esto facilita la discusión entre Recursos Humanos y el área técnica sin sustituir los canales formales de decisión.</w:t>
             </w:r>
           </w:p>
         </w:tc>
@@ -4043,7 +4043,7 @@
                 <w:rFonts w:ascii="Arial" w:hAnsi="Arial"/>
                 <w:sz w:val="20"/>
               </w:rPr>
-              <w:t>Registro de candidatos ligado al evaluador</w:t>
+              <w:t>Gobernanza, control y respaldo de la información</w:t>
             </w:r>
           </w:p>
         </w:tc>
@@ -4060,880 +4060,7 @@
                 <w:rFonts w:ascii="Arial" w:hAnsi="Arial"/>
                 <w:sz w:val="20"/>
               </w:rPr>
-              <w:t>Cuando un candidato se crea desde el panel interno, ya no se escribe manualmente el nombre del evaluador. El sistema registra automáticamente la cuenta que inició sesión, fortaleciendo la trazabilidad de quién trabajó cada expediente.</w:t>
-            </w:r>
-          </w:p>
-        </w:tc>
-      </w:tr>
-      <w:tr>
-        <w:tc>
-          <w:tcPr>
-            <w:tcW w:w="4392" w:type="dxa"/>
-            <w:shd w:val="clear" w:color="auto" w:fill="F4E8DE"/>
-          </w:tcPr>
-          <w:p>
-            <w:pPr>
-              <w:jc w:val="left"/>
-            </w:pPr>
-            <w:r>
-              <w:rPr>
-                <w:rFonts w:ascii="Arial" w:hAnsi="Arial"/>
-                <w:sz w:val="20"/>
-              </w:rPr>
-              <w:t>Plantillas de evaluación reutilizables</w:t>
-            </w:r>
-          </w:p>
-        </w:tc>
-        <w:tc>
-          <w:tcPr>
-            <w:tcW w:w="4436" w:type="dxa"/>
-          </w:tcPr>
-          <w:p>
-            <w:pPr>
-              <w:jc w:val="left"/>
-            </w:pPr>
-            <w:r>
-              <w:rPr>
-                <w:rFonts w:ascii="Arial" w:hAnsi="Arial"/>
-                <w:sz w:val="20"/>
-              </w:rPr>
-              <w:t>Las vacantes pueden evaluarse con plantillas que organizan las competencias en categorías, pesos y criterios. Esto evita depender de hojas sueltas y ayuda a que todos los candidatos sean revisados con la misma estructura.</w:t>
-            </w:r>
-          </w:p>
-        </w:tc>
-      </w:tr>
-      <w:tr>
-        <w:tc>
-          <w:tcPr>
-            <w:tcW w:w="4392" w:type="dxa"/>
-            <w:shd w:val="clear" w:color="auto" w:fill="F4E8DE"/>
-          </w:tcPr>
-          <w:p>
-            <w:pPr>
-              <w:jc w:val="left"/>
-            </w:pPr>
-            <w:r>
-              <w:rPr>
-                <w:rFonts w:ascii="Arial" w:hAnsi="Arial"/>
-                <w:sz w:val="20"/>
-              </w:rPr>
-              <w:t>Edición flexible de categorías, pesos y criterios</w:t>
-            </w:r>
-          </w:p>
-        </w:tc>
-        <w:tc>
-          <w:tcPr>
-            <w:tcW w:w="4436" w:type="dxa"/>
-          </w:tcPr>
-          <w:p>
-            <w:pPr>
-              <w:jc w:val="left"/>
-            </w:pPr>
-            <w:r>
-              <w:rPr>
-                <w:rFonts w:ascii="Arial" w:hAnsi="Arial"/>
-                <w:sz w:val="20"/>
-              </w:rPr>
-              <w:t>El editor permite definir las categorías de la plantilla, asignar sus pesos en porcentaje y crear criterios dentro de cada categoría. Los controles ayudan a no exceder el 100% y muestran si falta o sobra peso por distribuir.</w:t>
-            </w:r>
-          </w:p>
-        </w:tc>
-      </w:tr>
-      <w:tr>
-        <w:tc>
-          <w:tcPr>
-            <w:tcW w:w="4392" w:type="dxa"/>
-            <w:shd w:val="clear" w:color="auto" w:fill="F4E8DE"/>
-          </w:tcPr>
-          <w:p>
-            <w:pPr>
-              <w:jc w:val="left"/>
-            </w:pPr>
-            <w:r>
-              <w:rPr>
-                <w:rFonts w:ascii="Arial" w:hAnsi="Arial"/>
-                <w:sz w:val="20"/>
-              </w:rPr>
-              <w:t>Criterios críticos sin ponderación</w:t>
-            </w:r>
-          </w:p>
-        </w:tc>
-        <w:tc>
-          <w:tcPr>
-            <w:tcW w:w="4436" w:type="dxa"/>
-          </w:tcPr>
-          <w:p>
-            <w:pPr>
-              <w:jc w:val="left"/>
-            </w:pPr>
-            <w:r>
-              <w:rPr>
-                <w:rFonts w:ascii="Arial" w:hAnsi="Arial"/>
-                <w:sz w:val="20"/>
-              </w:rPr>
-              <w:t>Algunos requisitos pueden marcarse como críticos, por ejemplo una formación profesional indispensable. Estos criterios se evalúan como cumple o no cumple, no consumen peso de la categoría y, si no se cumplen, el resultado general queda en cero.</w:t>
-            </w:r>
-          </w:p>
-        </w:tc>
-      </w:tr>
-      <w:tr>
-        <w:tc>
-          <w:tcPr>
-            <w:tcW w:w="4392" w:type="dxa"/>
-            <w:shd w:val="clear" w:color="auto" w:fill="F4E8DE"/>
-          </w:tcPr>
-          <w:p>
-            <w:pPr>
-              <w:jc w:val="left"/>
-            </w:pPr>
-            <w:r>
-              <w:rPr>
-                <w:rFonts w:ascii="Arial" w:hAnsi="Arial"/>
-                <w:sz w:val="20"/>
-              </w:rPr>
-              <w:t>Creación de plantillas desde cero o con apoyo de IA</w:t>
-            </w:r>
-          </w:p>
-        </w:tc>
-        <w:tc>
-          <w:tcPr>
-            <w:tcW w:w="4436" w:type="dxa"/>
-          </w:tcPr>
-          <w:p>
-            <w:pPr>
-              <w:jc w:val="left"/>
-            </w:pPr>
-            <w:r>
-              <w:rPr>
-                <w:rFonts w:ascii="Arial" w:hAnsi="Arial"/>
-                <w:sz w:val="20"/>
-              </w:rPr>
-              <w:t>Al crear una plantilla se puede comenzar manualmente o pedir a la IA que genere un borrador a partir de un PDF o de requisitos escritos. Ese borrador siempre debe revisarse antes de guardarse y aplicarse a candidatos.</w:t>
-            </w:r>
-          </w:p>
-        </w:tc>
-      </w:tr>
-      <w:tr>
-        <w:tc>
-          <w:tcPr>
-            <w:tcW w:w="4392" w:type="dxa"/>
-            <w:shd w:val="clear" w:color="auto" w:fill="F4E8DE"/>
-          </w:tcPr>
-          <w:p>
-            <w:pPr>
-              <w:jc w:val="left"/>
-            </w:pPr>
-            <w:r>
-              <w:rPr>
-                <w:rFonts w:ascii="Arial" w:hAnsi="Arial"/>
-                <w:sz w:val="20"/>
-              </w:rPr>
-              <w:t>Archivo o eliminación de plantillas</w:t>
-            </w:r>
-          </w:p>
-        </w:tc>
-        <w:tc>
-          <w:tcPr>
-            <w:tcW w:w="4436" w:type="dxa"/>
-          </w:tcPr>
-          <w:p>
-            <w:pPr>
-              <w:jc w:val="left"/>
-            </w:pPr>
-            <w:r>
-              <w:rPr>
-                <w:rFonts w:ascii="Arial" w:hAnsi="Arial"/>
-                <w:sz w:val="20"/>
-              </w:rPr>
-              <w:t>Las plantillas pueden eliminarse cuando no tienen candidatos asociados. Si ya fueron usadas en evaluaciones, se archivan para preservar el historial y evitar pérdida de información.</w:t>
-            </w:r>
-          </w:p>
-        </w:tc>
-      </w:tr>
-      <w:tr>
-        <w:tc>
-          <w:tcPr>
-            <w:tcW w:w="4392" w:type="dxa"/>
-            <w:shd w:val="clear" w:color="auto" w:fill="F4E8DE"/>
-          </w:tcPr>
-          <w:p>
-            <w:pPr>
-              <w:jc w:val="left"/>
-            </w:pPr>
-            <w:r>
-              <w:rPr>
-                <w:rFonts w:ascii="Arial" w:hAnsi="Arial"/>
-                <w:sz w:val="20"/>
-              </w:rPr>
-              <w:t>Criterios manuales y criterios asistidos por IA</w:t>
-            </w:r>
-          </w:p>
-        </w:tc>
-        <w:tc>
-          <w:tcPr>
-            <w:tcW w:w="4436" w:type="dxa"/>
-          </w:tcPr>
-          <w:p>
-            <w:pPr>
-              <w:jc w:val="left"/>
-            </w:pPr>
-            <w:r>
-              <w:rPr>
-                <w:rFonts w:ascii="Arial" w:hAnsi="Arial"/>
-                <w:sz w:val="20"/>
-              </w:rPr>
-              <w:t>Cada criterio puede configurarse para revisión manual o para apoyo de IA. Los criterios manuales quedan para entrevista, examen temático o juicio experto; los criterios asistidos por IA se basan en la evidencia documental cargada.</w:t>
-            </w:r>
-          </w:p>
-        </w:tc>
-      </w:tr>
-      <w:tr>
-        <w:tc>
-          <w:tcPr>
-            <w:tcW w:w="4392" w:type="dxa"/>
-            <w:shd w:val="clear" w:color="auto" w:fill="F4E8DE"/>
-          </w:tcPr>
-          <w:p>
-            <w:pPr>
-              <w:jc w:val="left"/>
-            </w:pPr>
-            <w:r>
-              <w:rPr>
-                <w:rFonts w:ascii="Arial" w:hAnsi="Arial"/>
-                <w:sz w:val="20"/>
-              </w:rPr>
-              <w:t>Expediente digital por candidato</w:t>
-            </w:r>
-          </w:p>
-        </w:tc>
-        <w:tc>
-          <w:tcPr>
-            <w:tcW w:w="4436" w:type="dxa"/>
-          </w:tcPr>
-          <w:p>
-            <w:pPr>
-              <w:jc w:val="left"/>
-            </w:pPr>
-            <w:r>
-              <w:rPr>
-                <w:rFonts w:ascii="Arial" w:hAnsi="Arial"/>
-                <w:sz w:val="20"/>
-              </w:rPr>
-              <w:t>Cada candidato puede tener sus documentos en PDF o imagen dentro de la plataforma. Los documentos pueden abrirse para consulta, eliminarse si fueron cargados por error y asociarse a los criterios que sustentan la evaluación.</w:t>
-            </w:r>
-          </w:p>
-        </w:tc>
-      </w:tr>
-      <w:tr>
-        <w:tc>
-          <w:tcPr>
-            <w:tcW w:w="4392" w:type="dxa"/>
-            <w:shd w:val="clear" w:color="auto" w:fill="F4E8DE"/>
-          </w:tcPr>
-          <w:p>
-            <w:pPr>
-              <w:jc w:val="left"/>
-            </w:pPr>
-            <w:r>
-              <w:rPr>
-                <w:rFonts w:ascii="Arial" w:hAnsi="Arial"/>
-                <w:sz w:val="20"/>
-              </w:rPr>
-              <w:t>Validación de tamaño de documentos</w:t>
-            </w:r>
-          </w:p>
-        </w:tc>
-        <w:tc>
-          <w:tcPr>
-            <w:tcW w:w="4436" w:type="dxa"/>
-          </w:tcPr>
-          <w:p>
-            <w:pPr>
-              <w:jc w:val="left"/>
-            </w:pPr>
-            <w:r>
-              <w:rPr>
-                <w:rFonts w:ascii="Arial" w:hAnsi="Arial"/>
-                <w:sz w:val="20"/>
-              </w:rPr>
-              <w:t>En la postulación pública, la plataforma calcula el tamaño total de los archivos seleccionados y advierte al participante si excede el máximo permitido, evitando que intente enviar documentos que serían rechazados por el servidor.</w:t>
-            </w:r>
-          </w:p>
-        </w:tc>
-      </w:tr>
-      <w:tr>
-        <w:tc>
-          <w:tcPr>
-            <w:tcW w:w="4392" w:type="dxa"/>
-            <w:shd w:val="clear" w:color="auto" w:fill="F4E8DE"/>
-          </w:tcPr>
-          <w:p>
-            <w:pPr>
-              <w:jc w:val="left"/>
-            </w:pPr>
-            <w:r>
-              <w:rPr>
-                <w:rFonts w:ascii="Arial" w:hAnsi="Arial"/>
-                <w:sz w:val="20"/>
-              </w:rPr>
-              <w:t>Evidencia vinculada a cada criterio</w:t>
-            </w:r>
-          </w:p>
-        </w:tc>
-        <w:tc>
-          <w:tcPr>
-            <w:tcW w:w="4436" w:type="dxa"/>
-          </w:tcPr>
-          <w:p>
-            <w:pPr>
-              <w:jc w:val="left"/>
-            </w:pPr>
-            <w:r>
-              <w:rPr>
-                <w:rFonts w:ascii="Arial" w:hAnsi="Arial"/>
-                <w:sz w:val="20"/>
-              </w:rPr>
-              <w:t>La evaluación permite indicar qué documentos respaldan cada puntuación. Cuando interviene la IA, también se guarda cuáles documentos utilizó como referencia, facilitando la revisión posterior.</w:t>
-            </w:r>
-          </w:p>
-        </w:tc>
-      </w:tr>
-      <w:tr>
-        <w:tc>
-          <w:tcPr>
-            <w:tcW w:type="dxa" w:w="4407"/>
-          </w:tcPr>
-          <w:p>
-            <w:pPr>
-              <w:jc w:val="left"/>
-            </w:pPr>
-            <w:r>
-              <w:rPr>
-                <w:rFonts w:ascii="Arial" w:hAnsi="Arial"/>
-                <w:sz w:val="20"/>
-              </w:rPr>
-              <w:t>Evaluación automática como apoyo, no como decisión final</w:t>
-            </w:r>
-          </w:p>
-        </w:tc>
-        <w:tc>
-          <w:tcPr>
-            <w:tcW w:type="dxa" w:w="4421"/>
-          </w:tcPr>
-          <w:p>
-            <w:pPr>
-              <w:jc w:val="left"/>
-            </w:pPr>
-            <w:r>
-              <w:rPr>
-                <w:rFonts w:ascii="Arial" w:hAnsi="Arial"/>
-                <w:sz w:val="20"/>
-              </w:rPr>
-              <w:t>La integración con Gemini permite sugerir puntuaciones y comentarios a partir del expediente. La herramienta agiliza la lectura documental, pero la decisión y validación final permanecen en manos del equipo humano responsable.</w:t>
-            </w:r>
-          </w:p>
-        </w:tc>
-      </w:tr>
-      <w:tr>
-        <w:tc>
-          <w:tcPr>
-            <w:tcW w:type="dxa" w:w="4407"/>
-          </w:tcPr>
-          <w:p>
-            <w:pPr>
-              <w:jc w:val="left"/>
-            </w:pPr>
-            <w:r>
-              <w:rPr>
-                <w:rFonts w:ascii="Arial" w:hAnsi="Arial"/>
-                <w:sz w:val="20"/>
-              </w:rPr>
-              <w:t>Uso de notas de plantilla para orientar la IA</w:t>
-            </w:r>
-          </w:p>
-        </w:tc>
-        <w:tc>
-          <w:tcPr>
-            <w:tcW w:type="dxa" w:w="4421"/>
-          </w:tcPr>
-          <w:p>
-            <w:pPr>
-              <w:jc w:val="left"/>
-            </w:pPr>
-            <w:r>
-              <w:rPr>
-                <w:rFonts w:ascii="Arial" w:hAnsi="Arial"/>
-                <w:sz w:val="20"/>
-              </w:rPr>
-              <w:t>Las notas o evidencias esperadas definidas en cada criterio sirven como instrucciones para que la IA evalúe con mayor precisión y se ajuste al enfoque definido por el área técnica.</w:t>
-            </w:r>
-          </w:p>
-        </w:tc>
-      </w:tr>
-      <w:tr>
-        <w:tc>
-          <w:tcPr>
-            <w:tcW w:type="dxa" w:w="4407"/>
-          </w:tcPr>
-          <w:p>
-            <w:pPr>
-              <w:jc w:val="left"/>
-            </w:pPr>
-            <w:r>
-              <w:rPr>
-                <w:rFonts w:ascii="Arial" w:hAnsi="Arial"/>
-                <w:sz w:val="20"/>
-              </w:rPr>
-              <w:t>Nota complementaria del evaluador</w:t>
-            </w:r>
-          </w:p>
-        </w:tc>
-        <w:tc>
-          <w:tcPr>
-            <w:tcW w:type="dxa" w:w="4421"/>
-          </w:tcPr>
-          <w:p>
-            <w:pPr>
-              <w:jc w:val="left"/>
-            </w:pPr>
-            <w:r>
-              <w:rPr>
-                <w:rFonts w:ascii="Arial" w:hAnsi="Arial"/>
-                <w:sz w:val="20"/>
-              </w:rPr>
-              <w:t>En los criterios asistidos por IA existe un espacio para que el evaluador humano complete o precise la explicación cuando el comentario automático resulte incompleto o requiera contexto institucional adicional.</w:t>
-            </w:r>
-          </w:p>
-        </w:tc>
-      </w:tr>
-      <w:tr>
-        <w:tc>
-          <w:tcPr>
-            <w:tcW w:type="dxa" w:w="4407"/>
-          </w:tcPr>
-          <w:p>
-            <w:pPr>
-              <w:jc w:val="left"/>
-            </w:pPr>
-            <w:r>
-              <w:rPr>
-                <w:rFonts w:ascii="Arial" w:hAnsi="Arial"/>
-                <w:sz w:val="20"/>
-              </w:rPr>
-              <w:t>Reevaluación puntual de criterios</w:t>
-            </w:r>
-          </w:p>
-        </w:tc>
-        <w:tc>
-          <w:tcPr>
-            <w:tcW w:type="dxa" w:w="4421"/>
-          </w:tcPr>
-          <w:p>
-            <w:pPr>
-              <w:jc w:val="left"/>
-            </w:pPr>
-            <w:r>
-              <w:rPr>
-                <w:rFonts w:ascii="Arial" w:hAnsi="Arial"/>
-                <w:sz w:val="20"/>
-              </w:rPr>
-              <w:t>Si se ajusta un criterio asistido por IA o se necesita revisar un punto específico, puede reevaluarse solo ese criterio sin repetir toda la evaluación del candidato.</w:t>
-            </w:r>
-          </w:p>
-        </w:tc>
-      </w:tr>
-      <w:tr>
-        <w:tc>
-          <w:tcPr>
-            <w:tcW w:type="dxa" w:w="4407"/>
-          </w:tcPr>
-          <w:p>
-            <w:pPr>
-              <w:jc w:val="left"/>
-            </w:pPr>
-            <w:r>
-              <w:rPr>
-                <w:rFonts w:ascii="Arial" w:hAnsi="Arial"/>
-                <w:sz w:val="20"/>
-              </w:rPr>
-              <w:t>Guardado automático de la evaluación</w:t>
-            </w:r>
-          </w:p>
-        </w:tc>
-        <w:tc>
-          <w:tcPr>
-            <w:tcW w:type="dxa" w:w="4421"/>
-          </w:tcPr>
-          <w:p>
-            <w:pPr>
-              <w:jc w:val="left"/>
-            </w:pPr>
-            <w:r>
-              <w:rPr>
-                <w:rFonts w:ascii="Arial" w:hAnsi="Arial"/>
-                <w:sz w:val="20"/>
-              </w:rPr>
-              <w:t>Las puntuaciones, comentarios, notas complementarias y referencias documentales se guardan automáticamente, reduciendo el riesgo de pérdida de información durante el trabajo.</w:t>
-            </w:r>
-          </w:p>
-        </w:tc>
-      </w:tr>
-      <w:tr>
-        <w:tc>
-          <w:tcPr>
-            <w:tcW w:type="dxa" w:w="4407"/>
-          </w:tcPr>
-          <w:p>
-            <w:pPr>
-              <w:jc w:val="left"/>
-            </w:pPr>
-            <w:r>
-              <w:rPr>
-                <w:rFonts w:ascii="Arial" w:hAnsi="Arial"/>
-                <w:sz w:val="20"/>
-              </w:rPr>
-              <w:t>Protección de evaluaciones ya realizadas</w:t>
-            </w:r>
-          </w:p>
-        </w:tc>
-        <w:tc>
-          <w:tcPr>
-            <w:tcW w:type="dxa" w:w="4421"/>
-          </w:tcPr>
-          <w:p>
-            <w:pPr>
-              <w:jc w:val="left"/>
-            </w:pPr>
-            <w:r>
-              <w:rPr>
-                <w:rFonts w:ascii="Arial" w:hAnsi="Arial"/>
-                <w:sz w:val="20"/>
-              </w:rPr>
-              <w:t>Si se modifica una plantilla, el sistema evita borrar todo el trabajo previo. Solo se invalida la evaluación vinculada al criterio que cambió, cuando corresponde.</w:t>
-            </w:r>
-          </w:p>
-        </w:tc>
-      </w:tr>
-      <w:tr>
-        <w:tc>
-          <w:tcPr>
-            <w:tcW w:type="dxa" w:w="4407"/>
-          </w:tcPr>
-          <w:p>
-            <w:pPr>
-              <w:jc w:val="left"/>
-            </w:pPr>
-            <w:r>
-              <w:rPr>
-                <w:rFonts w:ascii="Arial" w:hAnsi="Arial"/>
-                <w:sz w:val="20"/>
-              </w:rPr>
-              <w:t>Bonificación adicional controlada</w:t>
-            </w:r>
-          </w:p>
-        </w:tc>
-        <w:tc>
-          <w:tcPr>
-            <w:tcW w:type="dxa" w:w="4421"/>
-          </w:tcPr>
-          <w:p>
-            <w:pPr>
-              <w:jc w:val="left"/>
-            </w:pPr>
-            <w:r>
-              <w:rPr>
-                <w:rFonts w:ascii="Arial" w:hAnsi="Arial"/>
-                <w:sz w:val="20"/>
-              </w:rPr>
-              <w:t>Luego de la evaluación principal, la IA puede realizar una segunda revisión global para identificar méritos adicionales no contemplados directamente por los criterios. Esta bonificación se justifica por separado y nunca permite superar el 100% del resultado final.</w:t>
-            </w:r>
-          </w:p>
-        </w:tc>
-      </w:tr>
-      <w:tr>
-        <w:tc>
-          <w:tcPr>
-            <w:tcW w:type="dxa" w:w="4407"/>
-          </w:tcPr>
-          <w:p>
-            <w:pPr>
-              <w:jc w:val="left"/>
-            </w:pPr>
-            <w:r>
-              <w:rPr>
-                <w:rFonts w:ascii="Arial" w:hAnsi="Arial"/>
-                <w:sz w:val="20"/>
-              </w:rPr>
-              <w:t>Decisión final del evaluador</w:t>
-            </w:r>
-          </w:p>
-        </w:tc>
-        <w:tc>
-          <w:tcPr>
-            <w:tcW w:type="dxa" w:w="4421"/>
-          </w:tcPr>
-          <w:p>
-            <w:pPr>
-              <w:jc w:val="left"/>
-            </w:pPr>
-            <w:r>
-              <w:rPr>
-                <w:rFonts w:ascii="Arial" w:hAnsi="Arial"/>
-                <w:sz w:val="20"/>
-              </w:rPr>
-              <w:t>Al cierre del análisis, el evaluador puede marcar si el candidato califica o no califica y dejar comentarios u observaciones generales. Esto separa el resultado calculado de la decisión humana documentada.</w:t>
-            </w:r>
-          </w:p>
-        </w:tc>
-      </w:tr>
-      <w:tr>
-        <w:tc>
-          <w:tcPr>
-            <w:tcW w:type="dxa" w:w="4407"/>
-          </w:tcPr>
-          <w:p>
-            <w:pPr>
-              <w:jc w:val="left"/>
-            </w:pPr>
-            <w:r>
-              <w:rPr>
-                <w:rFonts w:ascii="Arial" w:hAnsi="Arial"/>
-                <w:sz w:val="20"/>
-              </w:rPr>
-              <w:t>Resultados comparativos por plantilla</w:t>
-            </w:r>
-          </w:p>
-        </w:tc>
-        <w:tc>
-          <w:tcPr>
-            <w:tcW w:type="dxa" w:w="4421"/>
-          </w:tcPr>
-          <w:p>
-            <w:pPr>
-              <w:jc w:val="left"/>
-            </w:pPr>
-            <w:r>
-              <w:rPr>
-                <w:rFonts w:ascii="Arial" w:hAnsi="Arial"/>
-                <w:sz w:val="20"/>
-              </w:rPr>
-              <w:t>Las gráficas y rankings se muestran de acuerdo con la plantilla seleccionada. Esto permite comparar candidatos de una misma vacante sin mezclar resultados de procesos distintos.</w:t>
-            </w:r>
-          </w:p>
-        </w:tc>
-      </w:tr>
-      <w:tr>
-        <w:tc>
-          <w:tcPr>
-            <w:tcW w:type="dxa" w:w="4407"/>
-          </w:tcPr>
-          <w:p>
-            <w:pPr>
-              <w:jc w:val="left"/>
-            </w:pPr>
-            <w:r>
-              <w:rPr>
-                <w:rFonts w:ascii="Arial" w:hAnsi="Arial"/>
-                <w:sz w:val="20"/>
-              </w:rPr>
-              <w:t>Visualizaciones para apoyar la decisión</w:t>
-            </w:r>
-          </w:p>
-        </w:tc>
-        <w:tc>
-          <w:tcPr>
-            <w:tcW w:type="dxa" w:w="4421"/>
-          </w:tcPr>
-          <w:p>
-            <w:pPr>
-              <w:jc w:val="left"/>
-            </w:pPr>
-            <w:r>
-              <w:rPr>
-                <w:rFonts w:ascii="Arial" w:hAnsi="Arial"/>
-                <w:sz w:val="20"/>
-              </w:rPr>
-              <w:t>La plataforma presenta ranking global, comparación compacta y gráficos por categoría. Estas vistas ayudan a Recursos Humanos y al área técnica a identificar fortalezas, brechas y diferencias entre aspirantes.</w:t>
-            </w:r>
-          </w:p>
-        </w:tc>
-      </w:tr>
-      <w:tr>
-        <w:tc>
-          <w:tcPr>
-            <w:tcW w:type="dxa" w:w="4407"/>
-          </w:tcPr>
-          <w:p>
-            <w:pPr>
-              <w:jc w:val="left"/>
-            </w:pPr>
-            <w:r>
-              <w:rPr>
-                <w:rFonts w:ascii="Arial" w:hAnsi="Arial"/>
-                <w:sz w:val="20"/>
-              </w:rPr>
-              <w:t>Reportes individuales en Word</w:t>
-            </w:r>
-          </w:p>
-        </w:tc>
-        <w:tc>
-          <w:tcPr>
-            <w:tcW w:type="dxa" w:w="4421"/>
-          </w:tcPr>
-          <w:p>
-            <w:pPr>
-              <w:jc w:val="left"/>
-            </w:pPr>
-            <w:r>
-              <w:rPr>
-                <w:rFonts w:ascii="Arial" w:hAnsi="Arial"/>
-                <w:sz w:val="20"/>
-              </w:rPr>
-              <w:t>La plataforma puede generar un reporte profesional por candidato, con logo institucional, perfil evaluado, estructura de ponderaciones, análisis de resultados, documentos revisados y conclusión.</w:t>
-            </w:r>
-          </w:p>
-        </w:tc>
-      </w:tr>
-      <w:tr>
-        <w:tc>
-          <w:tcPr>
-            <w:tcW w:type="dxa" w:w="4407"/>
-          </w:tcPr>
-          <w:p>
-            <w:pPr>
-              <w:jc w:val="left"/>
-            </w:pPr>
-            <w:r>
-              <w:rPr>
-                <w:rFonts w:ascii="Arial" w:hAnsi="Arial"/>
-                <w:sz w:val="20"/>
-              </w:rPr>
-              <w:t>Configuración del modelo de IA</w:t>
-            </w:r>
-          </w:p>
-        </w:tc>
-        <w:tc>
-          <w:tcPr>
-            <w:tcW w:type="dxa" w:w="4421"/>
-          </w:tcPr>
-          <w:p>
-            <w:pPr>
-              <w:jc w:val="left"/>
-            </w:pPr>
-            <w:r>
-              <w:rPr>
-                <w:rFonts w:ascii="Arial" w:hAnsi="Arial"/>
-                <w:sz w:val="20"/>
-              </w:rPr>
-              <w:t>Los administradores pueden registrar la clave de Gemini y seleccionar el modelo disponible para las evaluaciones automáticas. Esto permite ajustar la plataforma según las capacidades y costos del servicio de IA utilizado.</w:t>
-            </w:r>
-          </w:p>
-        </w:tc>
-      </w:tr>
-      <w:tr>
-        <w:tc>
-          <w:tcPr>
-            <w:tcW w:type="dxa" w:w="4407"/>
-          </w:tcPr>
-          <w:p>
-            <w:pPr>
-              <w:jc w:val="left"/>
-            </w:pPr>
-            <w:r>
-              <w:rPr>
-                <w:rFonts w:ascii="Arial" w:hAnsi="Arial"/>
-                <w:sz w:val="20"/>
-              </w:rPr>
-              <w:t>Trazabilidad de uso y costos de IA</w:t>
-            </w:r>
-          </w:p>
-        </w:tc>
-        <w:tc>
-          <w:tcPr>
-            <w:tcW w:type="dxa" w:w="4421"/>
-          </w:tcPr>
-          <w:p>
-            <w:pPr>
-              <w:jc w:val="left"/>
-            </w:pPr>
-            <w:r>
-              <w:rPr>
-                <w:rFonts w:ascii="Arial" w:hAnsi="Arial"/>
-                <w:sz w:val="20"/>
-              </w:rPr>
-              <w:t>El sistema registra las interacciones con el modelo, incluyendo prompts, respuestas, tokens utilizados, costos estimados, uso de caché cuando aplica y consumo por usuario. Esto facilita control presupuestario y auditoría del uso de IA.</w:t>
-            </w:r>
-          </w:p>
-        </w:tc>
-      </w:tr>
-      <w:tr>
-        <w:tc>
-          <w:tcPr>
-            <w:tcW w:type="dxa" w:w="4407"/>
-          </w:tcPr>
-          <w:p>
-            <w:pPr>
-              <w:jc w:val="left"/>
-            </w:pPr>
-            <w:r>
-              <w:rPr>
-                <w:rFonts w:ascii="Arial" w:hAnsi="Arial"/>
-                <w:sz w:val="20"/>
-              </w:rPr>
-              <w:t>Cuotas mensuales de IA por usuario</w:t>
-            </w:r>
-          </w:p>
-        </w:tc>
-        <w:tc>
-          <w:tcPr>
-            <w:tcW w:type="dxa" w:w="4421"/>
-          </w:tcPr>
-          <w:p>
-            <w:pPr>
-              <w:jc w:val="left"/>
-            </w:pPr>
-            <w:r>
-              <w:rPr>
-                <w:rFonts w:ascii="Arial" w:hAnsi="Arial"/>
-                <w:sz w:val="20"/>
-              </w:rPr>
-              <w:t>Los administradores pueden definir un tope mensual de consumo de IA para cada usuario no administrador. Esto ayuda a controlar costos y evitar usos no previstos.</w:t>
-            </w:r>
-          </w:p>
-        </w:tc>
-      </w:tr>
-      <w:tr>
-        <w:tc>
-          <w:tcPr>
-            <w:tcW w:type="dxa" w:w="4407"/>
-          </w:tcPr>
-          <w:p>
-            <w:pPr>
-              <w:jc w:val="left"/>
-            </w:pPr>
-            <w:r>
-              <w:rPr>
-                <w:rFonts w:ascii="Arial" w:hAnsi="Arial"/>
-                <w:sz w:val="20"/>
-              </w:rPr>
-              <w:t>Respaldo de la información</w:t>
-            </w:r>
-          </w:p>
-        </w:tc>
-        <w:tc>
-          <w:tcPr>
-            <w:tcW w:type="dxa" w:w="4421"/>
-          </w:tcPr>
-          <w:p>
-            <w:pPr>
-              <w:jc w:val="left"/>
-            </w:pPr>
-            <w:r>
-              <w:rPr>
-                <w:rFonts w:ascii="Arial" w:hAnsi="Arial"/>
-                <w:sz w:val="20"/>
-              </w:rPr>
-              <w:t>La base de datos puede respaldarse para conservar plantillas, usuarios, candidatos, expedientes y evaluaciones ante cambios importantes o necesidad de recuperación.</w:t>
+              <w:t>La plataforma incorpora mecanismos de seguimiento del uso de IA, control de consumo, preservación de evaluaciones, respaldo de información y conservación del historial del proceso. Estos controles apoyan la continuidad, auditoría y mejora del sistema.</w:t>
             </w:r>
           </w:p>
         </w:tc>

</xml_diff>

<commit_message>
Add platform terms acceptance
</commit_message>
<xml_diff>
--- a/docs/Informe VALCV.docx
+++ b/docs/Informe VALCV.docx
@@ -3549,6 +3549,70 @@
         <w:jc w:val="both"/>
       </w:pPr>
     </w:p>
+    <w:p>
+      <w:pPr>
+        <w:pStyle w:val="Heading1"/>
+      </w:pPr>
+      <w:r>
+        <w:rPr>
+          <w:rFonts w:ascii="Arial" w:hAnsi="Arial"/>
+          <w:b/>
+          <w:sz w:val="28"/>
+        </w:rPr>
+        <w:t>Titularidad, licencia de uso y condiciones de acceso</w:t>
+      </w:r>
+    </w:p>
+    <w:p>
+      <w:pPr/>
+      <w:r>
+        <w:rPr>
+          <w:rFonts w:ascii="Arial" w:hAnsi="Arial"/>
+          <w:sz w:val="22"/>
+        </w:rPr>
+        <w:t>La plataforma VALCV constituye una creación tecnológica conceptualizada, desarrollada, administrada y alojada por Delio Siret, quien conserva la titularidad sobre su diseño, estructura funcional, configuración general, documentación, evolución futura y demás componentes propios de la solución.</w:t>
+      </w:r>
+    </w:p>
+    <w:p>
+      <w:pPr/>
+      <w:r>
+        <w:rPr>
+          <w:rFonts w:ascii="Arial" w:hAnsi="Arial"/>
+          <w:sz w:val="22"/>
+        </w:rPr>
+        <w:t>El acceso concedido a usuarios de la Superintendencia de Electricidad se plantea como una autorización temporal de uso, gratuita, limitada, no exclusiva y no transferible, orientada exclusivamente a apoyar procesos de evaluación curricular autorizados. Esta autorización no implica cesión de propiedad intelectual, transferencia de código fuente, entrega de infraestructura, cesión de dominio, ni derecho a copiar, reproducir, comercializar, modificar o desarrollar una plataforma derivada.</w:t>
+      </w:r>
+    </w:p>
+    <w:p>
+      <w:pPr/>
+      <w:r>
+        <w:rPr>
+          <w:rFonts w:ascii="Arial" w:hAnsi="Arial"/>
+          <w:sz w:val="22"/>
+        </w:rPr>
+        <w:t>La disponibilidad inicial de usuarios institucionales se concibe como una donación de acceso por un período de un año, sostenida con recursos propios del titular de la plataforma. Finalizado ese período, la continuidad del servicio, el número de usuarios, el soporte, las condiciones operativas, la gestión de datos y cualquier contribución económica o institucional deberán ser redefinidos entre las partes.</w:t>
+      </w:r>
+    </w:p>
+    <w:p>
+      <w:pPr/>
+      <w:r>
+        <w:rPr>
+          <w:rFonts w:ascii="Arial" w:hAnsi="Arial"/>
+          <w:sz w:val="22"/>
+        </w:rPr>
+        <w:t>Los usuarios que accedan a la plataforma deberán leer y aceptar las condiciones de uso antes de utilizar sus funcionalidades internas. La aceptación quedará registrada en la cuenta del usuario, incluyendo la versión de las condiciones y la fecha de aceptación, como constancia de lectura y conformidad con el alcance autorizado.</w:t>
+      </w:r>
+    </w:p>
+    <w:p>
+      <w:pPr/>
+      <w:r>
+        <w:rPr>
+          <w:rFonts w:ascii="Arial" w:hAnsi="Arial"/>
+          <w:sz w:val="22"/>
+        </w:rPr>
+        <w:t>Estas condiciones buscan proteger la creación, delimitar el uso institucional autorizado y preservar la trazabilidad del acceso, sin impedir que la herramienta cumpla su finalidad de apoyo al proceso de evaluación curricular.</w:t>
+      </w:r>
+    </w:p>
+    <w:p/>
     <w:p>
       <w:pPr>
         <w:pStyle w:val="Heading1"/>

</xml_diff>